<commit_message>
chore: conservar avance local en laboratorio sin publicacion
</commit_message>
<xml_diff>
--- a/Evidencias CAPSTONE/Fase 1/Evidencias de proyecto/minutas/Minuta_01_Alunza_Semana_1_Sesion_A.docx
+++ b/Evidencias CAPSTONE/Fase 1/Evidencias de proyecto/minutas/Minuta_01_Alunza_Semana_1_Sesion_A.docx
@@ -52,7 +52,7 @@
           <w:sz w:val="18"/>
           <w:lang w:val="es-CL"/>
         </w:rPr>
-        <w:t>ALZ-MIN-001   ·   SEMANA 1   ·   SESIÓN A</w:t>
+        <w:t>ALZ-MIN-001   ·   SEMANA 1   ·   SESIÓN A  ·  S0  ·  v1.1</w:t>
       </w:r>
     </w:p>
     <w:tbl>
@@ -498,10 +498,267 @@
           </w:p>
         </w:tc>
       </w:tr>
+      <w:tr>
+        <w:trPr>
+          <w:cantSplit/>
+        </w:trPr>
+        <w:tc>
+          <w:tcPr>
+            <w:tcW w:type="dxa" w:w="1944"/>
+            <w:vAlign w:val="center"/>
+            <w:tcMar>
+              <w:top w:w="80" w:type="dxa"/>
+              <w:start w:w="95" w:type="dxa"/>
+              <w:bottom w:w="80" w:type="dxa"/>
+              <w:end w:w="95" w:type="dxa"/>
+            </w:tcMar>
+            <w:shd w:fill="F4F6F8" w:val="clear"/>
+          </w:tcPr>
+          <w:p>
+            <w:pPr>
+              <w:keepLines/>
+              <w:widowControl/>
+              <w:spacing w:before="0" w:after="0" w:line="240" w:lineRule="auto"/>
+              <w:jc w:val="left"/>
+            </w:pPr>
+            <w:r>
+              <w:rPr>
+                <w:rFonts w:ascii="Arial" w:hAnsi="Arial"/>
+                <w:b/>
+                <w:color w:val="142B45"/>
+                <w:sz w:val="18"/>
+              </w:rPr>
+              <w:t>Sprint / iteración</w:t>
+            </w:r>
+            <w:r>
+              <w:rPr>
+                <w:rFonts w:ascii="Arial" w:hAnsi="Arial" w:eastAsia="Calibri"/>
+                <w:b/>
+                <w:i w:val="0"/>
+                <w:color w:val="142B45"/>
+                <w:sz w:val="18"/>
+                <w:lang w:val="es-CL"/>
+              </w:rPr>
+            </w:r>
+          </w:p>
+        </w:tc>
+        <w:tc>
+          <w:tcPr>
+            <w:tcW w:type="dxa" w:w="7632"/>
+            <w:vAlign w:val="center"/>
+            <w:tcMar>
+              <w:top w:w="80" w:type="dxa"/>
+              <w:start w:w="95" w:type="dxa"/>
+              <w:bottom w:w="80" w:type="dxa"/>
+              <w:end w:w="95" w:type="dxa"/>
+            </w:tcMar>
+            <w:shd w:fill="FBFCFD" w:val="clear"/>
+          </w:tcPr>
+          <w:p>
+            <w:pPr>
+              <w:keepLines/>
+              <w:widowControl/>
+              <w:spacing w:before="0" w:after="0" w:line="240" w:lineRule="auto"/>
+              <w:jc w:val="left"/>
+            </w:pPr>
+            <w:r>
+              <w:rPr>
+                <w:rFonts w:ascii="Arial" w:hAnsi="Arial"/>
+                <w:b w:val="0"/>
+                <w:color w:val="212529"/>
+                <w:sz w:val="18"/>
+              </w:rPr>
+              <w:t>S0 - Alineación y descubrimiento (semanas 1-2)</w:t>
+            </w:r>
+            <w:r>
+              <w:rPr>
+                <w:rFonts w:ascii="Arial" w:hAnsi="Arial" w:eastAsia="Calibri"/>
+                <w:b w:val="0"/>
+                <w:i w:val="0"/>
+                <w:color w:val="212529"/>
+                <w:sz w:val="18"/>
+                <w:lang w:val="es-CL"/>
+              </w:rPr>
+            </w:r>
+          </w:p>
+        </w:tc>
+      </w:tr>
+      <w:tr>
+        <w:trPr>
+          <w:cantSplit/>
+        </w:trPr>
+        <w:tc>
+          <w:tcPr>
+            <w:tcW w:type="dxa" w:w="1944"/>
+            <w:vAlign w:val="center"/>
+            <w:tcMar>
+              <w:top w:w="80" w:type="dxa"/>
+              <w:start w:w="95" w:type="dxa"/>
+              <w:bottom w:w="80" w:type="dxa"/>
+              <w:end w:w="95" w:type="dxa"/>
+            </w:tcMar>
+            <w:shd w:fill="F4F6F8" w:val="clear"/>
+          </w:tcPr>
+          <w:p>
+            <w:pPr>
+              <w:keepLines/>
+              <w:widowControl/>
+              <w:spacing w:before="0" w:after="0" w:line="240" w:lineRule="auto"/>
+              <w:jc w:val="left"/>
+            </w:pPr>
+            <w:r>
+              <w:rPr>
+                <w:rFonts w:ascii="Arial" w:hAnsi="Arial"/>
+                <w:b/>
+                <w:color w:val="142B45"/>
+                <w:sz w:val="18"/>
+              </w:rPr>
+              <w:t>Versión</w:t>
+            </w:r>
+            <w:r>
+              <w:rPr>
+                <w:rFonts w:ascii="Arial" w:hAnsi="Arial" w:eastAsia="Calibri"/>
+                <w:b/>
+                <w:i w:val="0"/>
+                <w:color w:val="142B45"/>
+                <w:sz w:val="18"/>
+                <w:lang w:val="es-CL"/>
+              </w:rPr>
+            </w:r>
+          </w:p>
+        </w:tc>
+        <w:tc>
+          <w:tcPr>
+            <w:tcW w:type="dxa" w:w="7632"/>
+            <w:vAlign w:val="center"/>
+            <w:tcMar>
+              <w:top w:w="80" w:type="dxa"/>
+              <w:start w:w="95" w:type="dxa"/>
+              <w:bottom w:w="80" w:type="dxa"/>
+              <w:end w:w="95" w:type="dxa"/>
+            </w:tcMar>
+            <w:shd w:fill="FBFCFD" w:val="clear"/>
+          </w:tcPr>
+          <w:p>
+            <w:pPr>
+              <w:keepLines/>
+              <w:widowControl/>
+              <w:spacing w:before="0" w:after="0" w:line="240" w:lineRule="auto"/>
+              <w:jc w:val="left"/>
+            </w:pPr>
+            <w:r>
+              <w:rPr>
+                <w:rFonts w:ascii="Arial" w:hAnsi="Arial"/>
+                <w:b w:val="0"/>
+                <w:color w:val="212529"/>
+                <w:sz w:val="18"/>
+              </w:rPr>
+              <w:t>1.1</w:t>
+            </w:r>
+            <w:r>
+              <w:rPr>
+                <w:rFonts w:ascii="Arial" w:hAnsi="Arial" w:eastAsia="Calibri"/>
+                <w:b w:val="0"/>
+                <w:i w:val="0"/>
+                <w:color w:val="212529"/>
+                <w:sz w:val="18"/>
+                <w:lang w:val="es-CL"/>
+              </w:rPr>
+            </w:r>
+          </w:p>
+        </w:tc>
+      </w:tr>
+      <w:tr>
+        <w:trPr>
+          <w:cantSplit/>
+        </w:trPr>
+        <w:tc>
+          <w:tcPr>
+            <w:tcW w:type="dxa" w:w="1944"/>
+            <w:vAlign w:val="center"/>
+            <w:tcMar>
+              <w:top w:w="80" w:type="dxa"/>
+              <w:start w:w="95" w:type="dxa"/>
+              <w:bottom w:w="80" w:type="dxa"/>
+              <w:end w:w="95" w:type="dxa"/>
+            </w:tcMar>
+            <w:shd w:fill="F4F6F8" w:val="clear"/>
+          </w:tcPr>
+          <w:p>
+            <w:pPr>
+              <w:keepLines/>
+              <w:widowControl/>
+              <w:spacing w:before="0" w:after="0" w:line="240" w:lineRule="auto"/>
+              <w:jc w:val="left"/>
+            </w:pPr>
+            <w:r>
+              <w:rPr>
+                <w:rFonts w:ascii="Arial" w:hAnsi="Arial"/>
+                <w:b/>
+                <w:color w:val="142B45"/>
+                <w:sz w:val="18"/>
+              </w:rPr>
+              <w:t>Seguimiento</w:t>
+            </w:r>
+            <w:r>
+              <w:rPr>
+                <w:rFonts w:ascii="Arial" w:hAnsi="Arial" w:eastAsia="Calibri"/>
+                <w:b/>
+                <w:i w:val="0"/>
+                <w:color w:val="142B45"/>
+                <w:sz w:val="18"/>
+                <w:lang w:val="es-CL"/>
+              </w:rPr>
+            </w:r>
+          </w:p>
+        </w:tc>
+        <w:tc>
+          <w:tcPr>
+            <w:tcW w:type="dxa" w:w="7632"/>
+            <w:vAlign w:val="center"/>
+            <w:tcMar>
+              <w:top w:w="80" w:type="dxa"/>
+              <w:start w:w="95" w:type="dxa"/>
+              <w:bottom w:w="80" w:type="dxa"/>
+              <w:end w:w="95" w:type="dxa"/>
+            </w:tcMar>
+            <w:shd w:fill="FBFCFD" w:val="clear"/>
+          </w:tcPr>
+          <w:p>
+            <w:pPr>
+              <w:keepLines/>
+              <w:widowControl/>
+              <w:spacing w:before="0" w:after="0" w:line="240" w:lineRule="auto"/>
+              <w:jc w:val="left"/>
+            </w:pPr>
+            <w:r>
+              <w:rPr>
+                <w:rFonts w:ascii="Arial" w:hAnsi="Arial"/>
+                <w:b w:val="0"/>
+                <w:color w:val="212529"/>
+                <w:sz w:val="18"/>
+              </w:rPr>
+              <w:t>Apertura del registro; no existen compromisos anteriores.</w:t>
+            </w:r>
+            <w:r>
+              <w:rPr>
+                <w:rFonts w:ascii="Arial" w:hAnsi="Arial" w:eastAsia="Calibri"/>
+                <w:b w:val="0"/>
+                <w:i w:val="0"/>
+                <w:color w:val="212529"/>
+                <w:sz w:val="18"/>
+                <w:lang w:val="es-CL"/>
+              </w:rPr>
+            </w:r>
+          </w:p>
+        </w:tc>
+      </w:tr>
     </w:tbl>
     <w:p>
       <w:pPr>
         <w:pStyle w:val="AlunzaSection"/>
+        <w:keepNext/>
+        <w:spacing w:before="120" w:after="60"/>
       </w:pPr>
       <w:r>
         <w:rPr>
@@ -545,6 +802,8 @@
     <w:p>
       <w:pPr>
         <w:pStyle w:val="AlunzaSection"/>
+        <w:keepNext/>
+        <w:spacing w:before="120" w:after="60"/>
       </w:pPr>
       <w:r>
         <w:rPr>
@@ -1006,6 +1265,8 @@
     <w:p>
       <w:pPr>
         <w:pStyle w:val="AlunzaSection"/>
+        <w:keepNext/>
+        <w:spacing w:before="120" w:after="60"/>
       </w:pPr>
       <w:r>
         <w:rPr>
@@ -1036,22 +1297,19 @@
       </w:pPr>
       <w:r>
         <w:rPr>
-          <w:rFonts w:ascii="Calibri" w:hAnsi="Calibri" w:eastAsia="Calibri"/>
+          <w:rFonts w:ascii="Arial" w:hAnsi="Arial"/>
           <w:b/>
-          <w:color w:val="0D7C78"/>
-          <w:sz w:val="20"/>
-          <w:lang w:val="es-CL"/>
+          <w:color w:val="008A8A"/>
         </w:rPr>
-        <w:t>•</w:t>
+        <w:t xml:space="preserve">•  </w:t>
       </w:r>
       <w:r>
         <w:rPr>
-          <w:rFonts w:ascii="Calibri" w:hAnsi="Calibri" w:eastAsia="Calibri"/>
-          <w:color w:val="222222"/>
-          <w:sz w:val="20"/>
-          <w:lang w:val="es-CL"/>
+          <w:rFonts w:ascii="Arial" w:hAnsi="Arial"/>
+          <w:b w:val="0"/>
+          <w:color w:val="212529"/>
         </w:rPr>
-        <w:t xml:space="preserve">  Fases, hitos y evidencias solicitadas para la asignatura CAPSTONE.</w:t>
+        <w:t>Fases, hitos y evidencias solicitadas para la asignatura CAPSTONE.</w:t>
       </w:r>
     </w:p>
     <w:p>
@@ -1062,22 +1320,19 @@
       </w:pPr>
       <w:r>
         <w:rPr>
-          <w:rFonts w:ascii="Calibri" w:hAnsi="Calibri" w:eastAsia="Calibri"/>
+          <w:rFonts w:ascii="Arial" w:hAnsi="Arial"/>
           <w:b/>
-          <w:color w:val="0D7C78"/>
-          <w:sz w:val="20"/>
-          <w:lang w:val="es-CL"/>
+          <w:color w:val="008A8A"/>
         </w:rPr>
-        <w:t>•</w:t>
+        <w:t xml:space="preserve">•  </w:t>
       </w:r>
       <w:r>
         <w:rPr>
-          <w:rFonts w:ascii="Calibri" w:hAnsi="Calibri" w:eastAsia="Calibri"/>
-          <w:color w:val="222222"/>
-          <w:sz w:val="20"/>
-          <w:lang w:val="es-CL"/>
+          <w:rFonts w:ascii="Arial" w:hAnsi="Arial"/>
+          <w:b w:val="0"/>
+          <w:color w:val="212529"/>
         </w:rPr>
-        <w:t xml:space="preserve">  Problema de seguimiento y retroalimentación en cursos de Programación I.</w:t>
+        <w:t>Problema de seguimiento y retroalimentación en cursos de Programación I.</w:t>
       </w:r>
     </w:p>
     <w:p>
@@ -1088,22 +1343,19 @@
       </w:pPr>
       <w:r>
         <w:rPr>
-          <w:rFonts w:ascii="Calibri" w:hAnsi="Calibri" w:eastAsia="Calibri"/>
+          <w:rFonts w:ascii="Arial" w:hAnsi="Arial"/>
           <w:b/>
-          <w:color w:val="0D7C78"/>
-          <w:sz w:val="20"/>
-          <w:lang w:val="es-CL"/>
+          <w:color w:val="008A8A"/>
         </w:rPr>
-        <w:t>•</w:t>
+        <w:t xml:space="preserve">•  </w:t>
       </w:r>
       <w:r>
         <w:rPr>
-          <w:rFonts w:ascii="Calibri" w:hAnsi="Calibri" w:eastAsia="Calibri"/>
-          <w:color w:val="222222"/>
-          <w:sz w:val="20"/>
-          <w:lang w:val="es-CL"/>
+          <w:rFonts w:ascii="Arial" w:hAnsi="Arial"/>
+          <w:b w:val="0"/>
+          <w:color w:val="212529"/>
         </w:rPr>
-        <w:t xml:space="preserve">  Conformación del equipo, responsabilidades operativas y revisión cruzada.</w:t>
+        <w:t>Conformación del equipo, responsabilidades operativas y revisión cruzada.</w:t>
       </w:r>
     </w:p>
     <w:p>
@@ -1114,27 +1366,26 @@
       </w:pPr>
       <w:r>
         <w:rPr>
-          <w:rFonts w:ascii="Calibri" w:hAnsi="Calibri" w:eastAsia="Calibri"/>
+          <w:rFonts w:ascii="Arial" w:hAnsi="Arial"/>
           <w:b/>
-          <w:color w:val="0D7C78"/>
-          <w:sz w:val="20"/>
-          <w:lang w:val="es-CL"/>
+          <w:color w:val="008A8A"/>
         </w:rPr>
-        <w:t>•</w:t>
+        <w:t xml:space="preserve">•  </w:t>
       </w:r>
       <w:r>
         <w:rPr>
-          <w:rFonts w:ascii="Calibri" w:hAnsi="Calibri" w:eastAsia="Calibri"/>
-          <w:color w:val="222222"/>
-          <w:sz w:val="20"/>
-          <w:lang w:val="es-CL"/>
+          <w:rFonts w:ascii="Arial" w:hAnsi="Arial"/>
+          <w:b w:val="0"/>
+          <w:color w:val="212529"/>
         </w:rPr>
-        <w:t xml:space="preserve">  Uso de Scrum ligero, control de versiones y registro periódico de avances en los artefactos del proyecto.</w:t>
+        <w:t>Uso de Scrum ligero, control de versiones y registro periódico de avances en los artefactos del proyecto.</w:t>
       </w:r>
     </w:p>
     <w:p>
       <w:pPr>
         <w:pStyle w:val="AlunzaSection"/>
+        <w:keepNext/>
+        <w:spacing w:before="120" w:after="60"/>
       </w:pPr>
       <w:r>
         <w:rPr>
@@ -1183,6 +1434,8 @@
     <w:p>
       <w:pPr>
         <w:pStyle w:val="AlunzaSection"/>
+        <w:keepNext/>
+        <w:spacing w:before="120" w:after="60"/>
       </w:pPr>
       <w:r>
         <w:rPr>
@@ -1512,6 +1765,8 @@
     <w:p>
       <w:pPr>
         <w:pStyle w:val="AlunzaSection"/>
+        <w:keepNext/>
+        <w:spacing w:before="120" w:after="60"/>
       </w:pPr>
       <w:r>
         <w:rPr>
@@ -1579,17 +1834,23 @@
               <w:spacing w:before="0" w:after="0" w:line="240" w:lineRule="auto"/>
               <w:jc w:val="left"/>
             </w:pPr>
-            <w:r/>
             <w:r>
               <w:rPr>
-                <w:rFonts w:ascii="Calibri" w:hAnsi="Calibri" w:eastAsia="Calibri"/>
+                <w:rFonts w:ascii="Arial" w:hAnsi="Arial"/>
+                <w:b/>
+                <w:color w:val="FFFFFF"/>
+              </w:rPr>
+              <w:t>ID y actividad comprometida</w:t>
+            </w:r>
+            <w:r>
+              <w:rPr>
+                <w:rFonts w:ascii="Arial" w:hAnsi="Arial" w:eastAsia="Calibri"/>
                 <w:b/>
                 <w:i w:val="0"/>
                 <w:color w:val="FFFFFF"/>
                 <w:sz w:val="18"/>
                 <w:lang w:val="es-CL"/>
               </w:rPr>
-              <w:t>Actividad comprometida</w:t>
             </w:r>
           </w:p>
         </w:tc>
@@ -1683,7 +1944,9 @@
               <w:spacing w:before="0" w:after="0" w:line="240" w:lineRule="auto"/>
               <w:jc w:val="left"/>
             </w:pPr>
-            <w:r/>
+            <w:r>
+              <w:t>C-001 · Redactar una visión inicial del producto y un mapa breve del problema.</w:t>
+            </w:r>
             <w:r>
               <w:rPr>
                 <w:rFonts w:ascii="Calibri" w:hAnsi="Calibri" w:eastAsia="Calibri"/>
@@ -1693,7 +1956,6 @@
                 <w:sz w:val="18"/>
                 <w:lang w:val="es-CL"/>
               </w:rPr>
-              <w:t>Redactar una visión inicial del producto y un mapa breve del problema.</w:t>
             </w:r>
           </w:p>
         </w:tc>
@@ -1786,7 +2048,9 @@
               <w:spacing w:before="0" w:after="0" w:line="240" w:lineRule="auto"/>
               <w:jc w:val="left"/>
             </w:pPr>
-            <w:r/>
+            <w:r>
+              <w:t>C-002 · Construir una matriz de entregables y restricciones de CAPSTONE.</w:t>
+            </w:r>
             <w:r>
               <w:rPr>
                 <w:rFonts w:ascii="Calibri" w:hAnsi="Calibri" w:eastAsia="Calibri"/>
@@ -1796,7 +2060,6 @@
                 <w:sz w:val="18"/>
                 <w:lang w:val="es-CL"/>
               </w:rPr>
-              <w:t>Construir una matriz de entregables y restricciones de CAPSTONE.</w:t>
             </w:r>
           </w:p>
         </w:tc>
@@ -1888,7 +2151,9 @@
               <w:spacing w:before="0" w:after="0" w:line="240" w:lineRule="auto"/>
               <w:jc w:val="left"/>
             </w:pPr>
-            <w:r/>
+            <w:r>
+              <w:t>C-003 · Proponer riesgos de datos e IA/RAG, criterios iniciales de calidad y spikes técnicos.</w:t>
+            </w:r>
             <w:r>
               <w:rPr>
                 <w:rFonts w:ascii="Calibri" w:hAnsi="Calibri" w:eastAsia="Calibri"/>
@@ -1898,7 +2163,6 @@
                 <w:sz w:val="18"/>
                 <w:lang w:val="es-CL"/>
               </w:rPr>
-              <w:t>Proponer riesgos de datos e IA/RAG, criterios iniciales de calidad y spikes técnicos.</w:t>
             </w:r>
           </w:p>
         </w:tc>
@@ -1973,6 +2237,8 @@
     <w:p>
       <w:pPr>
         <w:pStyle w:val="AlunzaSection"/>
+        <w:keepNext/>
+        <w:spacing w:before="120" w:after="60"/>
       </w:pPr>
       <w:r>
         <w:rPr>
@@ -2003,22 +2269,19 @@
       </w:pPr>
       <w:r>
         <w:rPr>
-          <w:rFonts w:ascii="Calibri" w:hAnsi="Calibri" w:eastAsia="Calibri"/>
+          <w:rFonts w:ascii="Arial" w:hAnsi="Arial"/>
           <w:b/>
-          <w:color w:val="0D7C78"/>
-          <w:sz w:val="20"/>
-          <w:lang w:val="es-CL"/>
+          <w:color w:val="008A8A"/>
         </w:rPr>
-        <w:t>•</w:t>
+        <w:t xml:space="preserve">•  </w:t>
       </w:r>
       <w:r>
         <w:rPr>
-          <w:rFonts w:ascii="Calibri" w:hAnsi="Calibri" w:eastAsia="Calibri"/>
-          <w:color w:val="222222"/>
-          <w:sz w:val="20"/>
-          <w:lang w:val="es-CL"/>
+          <w:rFonts w:ascii="Arial" w:hAnsi="Arial"/>
+          <w:b w:val="0"/>
+          <w:color w:val="212529"/>
         </w:rPr>
-        <w:t xml:space="preserve">  Alcance todavía amplio y responsabilidades aún no contrastadas con la carga real de cada integrante.</w:t>
+        <w:t>Alcance todavía amplio y responsabilidades aún no contrastadas con la carga real de cada integrante.</w:t>
       </w:r>
     </w:p>
     <w:p>
@@ -2029,27 +2292,26 @@
       </w:pPr>
       <w:r>
         <w:rPr>
-          <w:rFonts w:ascii="Calibri" w:hAnsi="Calibri" w:eastAsia="Calibri"/>
+          <w:rFonts w:ascii="Arial" w:hAnsi="Arial"/>
           <w:b/>
-          <w:color w:val="0D7C78"/>
-          <w:sz w:val="20"/>
-          <w:lang w:val="es-CL"/>
+          <w:color w:val="008A8A"/>
         </w:rPr>
-        <w:t>•</w:t>
+        <w:t xml:space="preserve">•  </w:t>
       </w:r>
       <w:r>
         <w:rPr>
-          <w:rFonts w:ascii="Calibri" w:hAnsi="Calibri" w:eastAsia="Calibri"/>
-          <w:color w:val="222222"/>
-          <w:sz w:val="20"/>
-          <w:lang w:val="es-CL"/>
+          <w:rFonts w:ascii="Arial" w:hAnsi="Arial"/>
+          <w:b w:val="0"/>
+          <w:color w:val="212529"/>
         </w:rPr>
-        <w:t xml:space="preserve">  Riesgo de describir una solución genérica de IA sin una vertical técnica verificable.</w:t>
+        <w:t>Riesgo de describir una solución genérica de IA sin una vertical técnica verificable.</w:t>
       </w:r>
     </w:p>
     <w:p>
       <w:pPr>
         <w:pStyle w:val="AlunzaSection"/>
+        <w:keepNext/>
+        <w:spacing w:before="120" w:after="60"/>
       </w:pPr>
       <w:r>
         <w:rPr>
@@ -2287,7 +2549,7 @@
                 <w:sz w:val="18"/>
                 <w:lang w:val="es-CL"/>
               </w:rPr>
-              <w:t>Observación: Los acuerdos, responsables y fechas consignados en esta minuta fueron revisados y aprobados por el equipo Alunza.</w:t>
+              <w:t>Observación: los acuerdos y estados fueron revisados internamente por el equipo Alunza. Los cierres corresponden a definición o documentación y no implican software implementado.</w:t>
             </w:r>
             <w:r>
               <w:rPr>
@@ -2296,7 +2558,6 @@
                 <w:sz w:val="18"/>
                 <w:lang w:val="es-CL"/>
               </w:rPr>
-              <w:t/>
             </w:r>
           </w:p>
         </w:tc>
@@ -2736,7 +2997,6 @@
   <w:style w:type="paragraph" w:default="1" w:styleId="Normal">
     <w:name w:val="Normal"/>
     <w:qFormat/>
-    <w:rsid w:val="00FC693F"/>
     <w:pPr>
       <w:widowControl/>
       <w:spacing w:after="80" w:line="259" w:lineRule="auto"/>
@@ -2753,7 +3013,6 @@
     <w:link w:val="HeaderChar"/>
     <w:uiPriority w:val="99"/>
     <w:unhideWhenUsed/>
-    <w:rsid w:val="00E618BF"/>
     <w:pPr>
       <w:tabs>
         <w:tab w:val="center" w:pos="4680"/>
@@ -2767,7 +3026,6 @@
     <w:basedOn w:val="DefaultParagraphFont"/>
     <w:link w:val="Header"/>
     <w:uiPriority w:val="99"/>
-    <w:rsid w:val="00E618BF"/>
   </w:style>
   <w:style w:type="paragraph" w:styleId="Footer">
     <w:name w:val="footer"/>
@@ -2775,7 +3033,6 @@
     <w:link w:val="FooterChar"/>
     <w:uiPriority w:val="99"/>
     <w:unhideWhenUsed/>
-    <w:rsid w:val="00E618BF"/>
     <w:pPr>
       <w:tabs>
         <w:tab w:val="center" w:pos="4680"/>
@@ -2789,7 +3046,6 @@
     <w:basedOn w:val="DefaultParagraphFont"/>
     <w:link w:val="Footer"/>
     <w:uiPriority w:val="99"/>
-    <w:rsid w:val="00E618BF"/>
   </w:style>
   <w:style w:type="paragraph" w:styleId="Heading1">
     <w:name w:val="heading 1"/>
@@ -2798,7 +3054,6 @@
     <w:link w:val="Heading1Char"/>
     <w:uiPriority w:val="9"/>
     <w:qFormat/>
-    <w:rsid w:val="00FC693F"/>
     <w:pPr>
       <w:keepNext/>
       <w:keepLines/>
@@ -2822,7 +3077,6 @@
     <w:uiPriority w:val="9"/>
     <w:unhideWhenUsed/>
     <w:qFormat/>
-    <w:rsid w:val="00FC693F"/>
     <w:pPr>
       <w:keepNext/>
       <w:keepLines/>
@@ -2846,7 +3100,6 @@
     <w:uiPriority w:val="9"/>
     <w:unhideWhenUsed/>
     <w:qFormat/>
-    <w:rsid w:val="00FC693F"/>
     <w:pPr>
       <w:keepNext/>
       <w:keepLines/>
@@ -2869,7 +3122,6 @@
     <w:semiHidden/>
     <w:unhideWhenUsed/>
     <w:qFormat/>
-    <w:rsid w:val="00FC693F"/>
     <w:pPr>
       <w:keepNext/>
       <w:keepLines/>
@@ -2894,7 +3146,6 @@
     <w:semiHidden/>
     <w:unhideWhenUsed/>
     <w:qFormat/>
-    <w:rsid w:val="00FC693F"/>
     <w:pPr>
       <w:keepNext/>
       <w:keepLines/>
@@ -2915,7 +3166,6 @@
     <w:semiHidden/>
     <w:unhideWhenUsed/>
     <w:qFormat/>
-    <w:rsid w:val="00FC693F"/>
     <w:pPr>
       <w:keepNext/>
       <w:keepLines/>
@@ -2938,7 +3188,6 @@
     <w:semiHidden/>
     <w:unhideWhenUsed/>
     <w:qFormat/>
-    <w:rsid w:val="00FC693F"/>
     <w:pPr>
       <w:keepNext/>
       <w:keepLines/>
@@ -2961,7 +3210,6 @@
     <w:semiHidden/>
     <w:unhideWhenUsed/>
     <w:qFormat/>
-    <w:rsid w:val="00FC693F"/>
     <w:pPr>
       <w:keepNext/>
       <w:keepLines/>
@@ -2984,7 +3232,6 @@
     <w:semiHidden/>
     <w:unhideWhenUsed/>
     <w:qFormat/>
-    <w:rsid w:val="00FC693F"/>
     <w:pPr>
       <w:keepNext/>
       <w:keepLines/>
@@ -3031,7 +3278,6 @@
     <w:name w:val="No Spacing"/>
     <w:uiPriority w:val="1"/>
     <w:qFormat/>
-    <w:rsid w:val="00FC693F"/>
     <w:pPr>
       <w:spacing w:after="0" w:line="240" w:lineRule="auto"/>
     </w:pPr>
@@ -3041,7 +3287,6 @@
     <w:basedOn w:val="DefaultParagraphFont"/>
     <w:link w:val="Heading1"/>
     <w:uiPriority w:val="9"/>
-    <w:rsid w:val="00FC693F"/>
     <w:rPr>
       <w:rFonts w:asciiTheme="majorHAnsi" w:eastAsiaTheme="majorEastAsia" w:hAnsiTheme="majorHAnsi" w:cstheme="majorBidi"/>
       <w:b/>
@@ -3056,7 +3301,6 @@
     <w:basedOn w:val="DefaultParagraphFont"/>
     <w:link w:val="Heading2"/>
     <w:uiPriority w:val="9"/>
-    <w:rsid w:val="00FC693F"/>
     <w:rPr>
       <w:rFonts w:asciiTheme="majorHAnsi" w:eastAsiaTheme="majorEastAsia" w:hAnsiTheme="majorHAnsi" w:cstheme="majorBidi"/>
       <w:b/>
@@ -3071,7 +3315,6 @@
     <w:basedOn w:val="DefaultParagraphFont"/>
     <w:link w:val="Heading3"/>
     <w:uiPriority w:val="9"/>
-    <w:rsid w:val="00FC693F"/>
     <w:rPr>
       <w:rFonts w:asciiTheme="majorHAnsi" w:eastAsiaTheme="majorEastAsia" w:hAnsiTheme="majorHAnsi" w:cstheme="majorBidi"/>
       <w:b/>
@@ -3086,7 +3329,6 @@
     <w:link w:val="TitleChar"/>
     <w:uiPriority w:val="10"/>
     <w:qFormat/>
-    <w:rsid w:val="00FC693F"/>
     <w:pPr>
       <w:pBdr>
         <w:bottom w:val="single" w:sz="8" w:space="4" w:color="4F81BD" w:themeColor="accent1"/>
@@ -3108,7 +3350,6 @@
     <w:basedOn w:val="DefaultParagraphFont"/>
     <w:link w:val="Title"/>
     <w:uiPriority w:val="10"/>
-    <w:rsid w:val="00FC693F"/>
     <w:rPr>
       <w:rFonts w:asciiTheme="majorHAnsi" w:eastAsiaTheme="majorEastAsia" w:hAnsiTheme="majorHAnsi" w:cstheme="majorBidi"/>
       <w:color w:val="17365D" w:themeColor="text2" w:themeShade="BF"/>
@@ -3125,7 +3366,6 @@
     <w:link w:val="SubtitleChar"/>
     <w:uiPriority w:val="11"/>
     <w:qFormat/>
-    <w:rsid w:val="00FC693F"/>
     <w:pPr>
       <w:numPr>
         <w:ilvl w:val="1"/>
@@ -3146,7 +3386,6 @@
     <w:basedOn w:val="DefaultParagraphFont"/>
     <w:link w:val="Subtitle"/>
     <w:uiPriority w:val="11"/>
-    <w:rsid w:val="00FC693F"/>
     <w:rPr>
       <w:rFonts w:asciiTheme="majorHAnsi" w:eastAsiaTheme="majorEastAsia" w:hAnsiTheme="majorHAnsi" w:cstheme="majorBidi"/>
       <w:i/>
@@ -3162,7 +3401,6 @@
     <w:basedOn w:val="Normal"/>
     <w:uiPriority w:val="34"/>
     <w:qFormat/>
-    <w:rsid w:val="00FC693F"/>
     <w:pPr>
       <w:ind w:left="720"/>
       <w:contextualSpacing/>
@@ -3174,7 +3412,6 @@
     <w:link w:val="BodyTextChar"/>
     <w:uiPriority w:val="99"/>
     <w:unhideWhenUsed/>
-    <w:rsid w:val="00AA1D8D"/>
     <w:pPr>
       <w:spacing w:after="120"/>
     </w:pPr>
@@ -3184,7 +3421,6 @@
     <w:basedOn w:val="DefaultParagraphFont"/>
     <w:link w:val="BodyText"/>
     <w:uiPriority w:val="99"/>
-    <w:rsid w:val="00AA1D8D"/>
   </w:style>
   <w:style w:type="paragraph" w:styleId="BodyText2">
     <w:name w:val="Body Text 2"/>
@@ -3192,7 +3428,6 @@
     <w:link w:val="BodyText2Char"/>
     <w:uiPriority w:val="99"/>
     <w:unhideWhenUsed/>
-    <w:rsid w:val="00AA1D8D"/>
     <w:pPr>
       <w:spacing w:after="120" w:line="480" w:lineRule="auto"/>
     </w:pPr>
@@ -3202,7 +3437,6 @@
     <w:basedOn w:val="DefaultParagraphFont"/>
     <w:link w:val="BodyText2"/>
     <w:uiPriority w:val="99"/>
-    <w:rsid w:val="00AA1D8D"/>
   </w:style>
   <w:style w:type="paragraph" w:styleId="BodyText3">
     <w:name w:val="Body Text 3"/>
@@ -3210,7 +3444,6 @@
     <w:link w:val="BodyText3Char"/>
     <w:uiPriority w:val="99"/>
     <w:unhideWhenUsed/>
-    <w:rsid w:val="00AA1D8D"/>
     <w:pPr>
       <w:spacing w:after="120"/>
     </w:pPr>
@@ -3224,7 +3457,6 @@
     <w:basedOn w:val="DefaultParagraphFont"/>
     <w:link w:val="BodyText3"/>
     <w:uiPriority w:val="99"/>
-    <w:rsid w:val="00AA1D8D"/>
     <w:rPr>
       <w:sz w:val="16"/>
       <w:szCs w:val="16"/>
@@ -3235,7 +3467,6 @@
     <w:basedOn w:val="Normal"/>
     <w:uiPriority w:val="99"/>
     <w:unhideWhenUsed/>
-    <w:rsid w:val="00AA1D8D"/>
     <w:pPr>
       <w:ind w:left="360" w:hanging="360"/>
       <w:contextualSpacing/>
@@ -3246,7 +3477,6 @@
     <w:basedOn w:val="Normal"/>
     <w:uiPriority w:val="99"/>
     <w:unhideWhenUsed/>
-    <w:rsid w:val="00326F90"/>
     <w:pPr>
       <w:ind w:left="720" w:hanging="360"/>
       <w:contextualSpacing/>
@@ -3257,7 +3487,6 @@
     <w:basedOn w:val="Normal"/>
     <w:uiPriority w:val="99"/>
     <w:unhideWhenUsed/>
-    <w:rsid w:val="00326F90"/>
     <w:pPr>
       <w:ind w:left="1080" w:hanging="360"/>
       <w:contextualSpacing/>
@@ -3268,7 +3497,6 @@
     <w:basedOn w:val="Normal"/>
     <w:uiPriority w:val="99"/>
     <w:unhideWhenUsed/>
-    <w:rsid w:val="00326F90"/>
     <w:pPr>
       <w:numPr>
         <w:numId w:val="1"/>
@@ -3281,7 +3509,6 @@
     <w:basedOn w:val="Normal"/>
     <w:uiPriority w:val="99"/>
     <w:unhideWhenUsed/>
-    <w:rsid w:val="00326F90"/>
     <w:pPr>
       <w:numPr>
         <w:numId w:val="2"/>
@@ -3294,7 +3521,6 @@
     <w:basedOn w:val="Normal"/>
     <w:uiPriority w:val="99"/>
     <w:unhideWhenUsed/>
-    <w:rsid w:val="00326F90"/>
     <w:pPr>
       <w:numPr>
         <w:numId w:val="3"/>
@@ -3307,7 +3533,6 @@
     <w:basedOn w:val="Normal"/>
     <w:uiPriority w:val="99"/>
     <w:unhideWhenUsed/>
-    <w:rsid w:val="00326F90"/>
     <w:pPr>
       <w:numPr>
         <w:numId w:val="5"/>
@@ -3320,7 +3545,6 @@
     <w:basedOn w:val="Normal"/>
     <w:uiPriority w:val="99"/>
     <w:unhideWhenUsed/>
-    <w:rsid w:val="0029639D"/>
     <w:pPr>
       <w:numPr>
         <w:numId w:val="6"/>
@@ -3333,7 +3557,6 @@
     <w:basedOn w:val="Normal"/>
     <w:uiPriority w:val="99"/>
     <w:unhideWhenUsed/>
-    <w:rsid w:val="0029639D"/>
     <w:pPr>
       <w:numPr>
         <w:numId w:val="7"/>
@@ -3346,7 +3569,6 @@
     <w:basedOn w:val="Normal"/>
     <w:uiPriority w:val="99"/>
     <w:unhideWhenUsed/>
-    <w:rsid w:val="0029639D"/>
     <w:pPr>
       <w:spacing w:after="120"/>
       <w:ind w:left="360"/>
@@ -3358,7 +3580,6 @@
     <w:basedOn w:val="Normal"/>
     <w:uiPriority w:val="99"/>
     <w:unhideWhenUsed/>
-    <w:rsid w:val="0029639D"/>
     <w:pPr>
       <w:spacing w:after="120"/>
       <w:ind w:left="720"/>
@@ -3370,7 +3591,6 @@
     <w:basedOn w:val="Normal"/>
     <w:uiPriority w:val="99"/>
     <w:unhideWhenUsed/>
-    <w:rsid w:val="0029639D"/>
     <w:pPr>
       <w:spacing w:after="120"/>
       <w:ind w:left="1080"/>
@@ -3382,7 +3602,6 @@
     <w:link w:val="MacroTextChar"/>
     <w:uiPriority w:val="99"/>
     <w:unhideWhenUsed/>
-    <w:rsid w:val="0029639D"/>
     <w:pPr>
       <w:tabs>
         <w:tab w:val="left" w:pos="576"/>
@@ -3405,7 +3624,6 @@
     <w:basedOn w:val="DefaultParagraphFont"/>
     <w:link w:val="MacroText"/>
     <w:uiPriority w:val="99"/>
-    <w:rsid w:val="0029639D"/>
     <w:rPr>
       <w:rFonts w:ascii="Courier" w:hAnsi="Courier"/>
       <w:sz w:val="20"/>
@@ -3419,7 +3637,6 @@
     <w:link w:val="QuoteChar"/>
     <w:uiPriority w:val="29"/>
     <w:qFormat/>
-    <w:rsid w:val="00FC693F"/>
     <w:rPr>
       <w:i/>
       <w:iCs/>
@@ -3431,7 +3648,6 @@
     <w:basedOn w:val="DefaultParagraphFont"/>
     <w:link w:val="Quote"/>
     <w:uiPriority w:val="29"/>
-    <w:rsid w:val="00FC693F"/>
     <w:rPr>
       <w:i/>
       <w:iCs/>
@@ -3444,7 +3660,6 @@
     <w:link w:val="Heading4"/>
     <w:uiPriority w:val="9"/>
     <w:semiHidden/>
-    <w:rsid w:val="00FC693F"/>
     <w:rPr>
       <w:rFonts w:asciiTheme="majorHAnsi" w:eastAsiaTheme="majorEastAsia" w:hAnsiTheme="majorHAnsi" w:cstheme="majorBidi"/>
       <w:b/>
@@ -3460,7 +3675,6 @@
     <w:link w:val="Heading5"/>
     <w:uiPriority w:val="9"/>
     <w:semiHidden/>
-    <w:rsid w:val="00FC693F"/>
     <w:rPr>
       <w:rFonts w:asciiTheme="majorHAnsi" w:eastAsiaTheme="majorEastAsia" w:hAnsiTheme="majorHAnsi" w:cstheme="majorBidi"/>
       <w:color w:val="243F60" w:themeColor="accent1" w:themeShade="7F"/>
@@ -3472,7 +3686,6 @@
     <w:link w:val="Heading6"/>
     <w:uiPriority w:val="9"/>
     <w:semiHidden/>
-    <w:rsid w:val="00FC693F"/>
     <w:rPr>
       <w:rFonts w:asciiTheme="majorHAnsi" w:eastAsiaTheme="majorEastAsia" w:hAnsiTheme="majorHAnsi" w:cstheme="majorBidi"/>
       <w:i/>
@@ -3486,7 +3699,6 @@
     <w:link w:val="Heading7"/>
     <w:uiPriority w:val="9"/>
     <w:semiHidden/>
-    <w:rsid w:val="00FC693F"/>
     <w:rPr>
       <w:rFonts w:asciiTheme="majorHAnsi" w:eastAsiaTheme="majorEastAsia" w:hAnsiTheme="majorHAnsi" w:cstheme="majorBidi"/>
       <w:i/>
@@ -3500,7 +3712,6 @@
     <w:link w:val="Heading8"/>
     <w:uiPriority w:val="9"/>
     <w:semiHidden/>
-    <w:rsid w:val="00FC693F"/>
     <w:rPr>
       <w:rFonts w:asciiTheme="majorHAnsi" w:eastAsiaTheme="majorEastAsia" w:hAnsiTheme="majorHAnsi" w:cstheme="majorBidi"/>
       <w:color w:val="4F81BD" w:themeColor="accent1"/>
@@ -3514,7 +3725,6 @@
     <w:link w:val="Heading9"/>
     <w:uiPriority w:val="9"/>
     <w:semiHidden/>
-    <w:rsid w:val="00FC693F"/>
     <w:rPr>
       <w:rFonts w:asciiTheme="majorHAnsi" w:eastAsiaTheme="majorEastAsia" w:hAnsiTheme="majorHAnsi" w:cstheme="majorBidi"/>
       <w:i/>
@@ -3532,7 +3742,6 @@
     <w:semiHidden/>
     <w:unhideWhenUsed/>
     <w:qFormat/>
-    <w:rsid w:val="00FC693F"/>
     <w:pPr>
       <w:spacing w:line="240" w:lineRule="auto"/>
     </w:pPr>
@@ -3549,7 +3758,6 @@
     <w:basedOn w:val="DefaultParagraphFont"/>
     <w:uiPriority w:val="22"/>
     <w:qFormat/>
-    <w:rsid w:val="00FC693F"/>
     <w:rPr>
       <w:b/>
       <w:bCs/>
@@ -3560,7 +3768,6 @@
     <w:basedOn w:val="DefaultParagraphFont"/>
     <w:uiPriority w:val="20"/>
     <w:qFormat/>
-    <w:rsid w:val="00FC693F"/>
     <w:rPr>
       <w:i/>
       <w:iCs/>
@@ -3573,7 +3780,6 @@
     <w:link w:val="IntenseQuoteChar"/>
     <w:uiPriority w:val="30"/>
     <w:qFormat/>
-    <w:rsid w:val="00FC693F"/>
     <w:pPr>
       <w:pBdr>
         <w:bottom w:val="single" w:sz="4" w:space="4" w:color="4F81BD" w:themeColor="accent1"/>
@@ -3594,7 +3800,6 @@
     <w:basedOn w:val="DefaultParagraphFont"/>
     <w:link w:val="IntenseQuote"/>
     <w:uiPriority w:val="30"/>
-    <w:rsid w:val="00FC693F"/>
     <w:rPr>
       <w:b/>
       <w:bCs/>
@@ -3608,7 +3813,6 @@
     <w:basedOn w:val="DefaultParagraphFont"/>
     <w:uiPriority w:val="19"/>
     <w:qFormat/>
-    <w:rsid w:val="00FC693F"/>
     <w:rPr>
       <w:i/>
       <w:iCs/>
@@ -3620,7 +3824,6 @@
     <w:basedOn w:val="DefaultParagraphFont"/>
     <w:uiPriority w:val="21"/>
     <w:qFormat/>
-    <w:rsid w:val="00FC693F"/>
     <w:rPr>
       <w:b/>
       <w:bCs/>
@@ -3634,7 +3837,6 @@
     <w:basedOn w:val="DefaultParagraphFont"/>
     <w:uiPriority w:val="31"/>
     <w:qFormat/>
-    <w:rsid w:val="00FC693F"/>
     <w:rPr>
       <w:smallCaps/>
       <w:color w:val="C0504D" w:themeColor="accent2"/>
@@ -3646,7 +3848,6 @@
     <w:basedOn w:val="DefaultParagraphFont"/>
     <w:uiPriority w:val="32"/>
     <w:qFormat/>
-    <w:rsid w:val="00FC693F"/>
     <w:rPr>
       <w:b/>
       <w:bCs/>
@@ -3661,7 +3862,6 @@
     <w:basedOn w:val="DefaultParagraphFont"/>
     <w:uiPriority w:val="33"/>
     <w:qFormat/>
-    <w:rsid w:val="00FC693F"/>
     <w:rPr>
       <w:b/>
       <w:bCs/>
@@ -3677,7 +3877,6 @@
     <w:semiHidden/>
     <w:unhideWhenUsed/>
     <w:qFormat/>
-    <w:rsid w:val="00FC693F"/>
     <w:pPr>
       <w:outlineLvl w:val="9"/>
     </w:pPr>
@@ -3686,7 +3885,6 @@
     <w:name w:val="Table Grid"/>
     <w:basedOn w:val="TableNormal"/>
     <w:uiPriority w:val="59"/>
-    <w:rsid w:val="00FC693F"/>
     <w:pPr>
       <w:spacing w:after="0" w:line="240" w:lineRule="auto"/>
     </w:pPr>
@@ -3712,7 +3910,6 @@
     <w:name w:val="Light Shading"/>
     <w:basedOn w:val="TableNormal"/>
     <w:uiPriority w:val="60"/>
-    <w:rsid w:val="00FC693F"/>
     <w:pPr>
       <w:spacing w:after="0" w:line="240" w:lineRule="auto"/>
     </w:pPr>
@@ -3815,7 +4012,6 @@
     <w:name w:val="Light Shading Accent 1"/>
     <w:basedOn w:val="TableNormal"/>
     <w:uiPriority w:val="60"/>
-    <w:rsid w:val="00FC693F"/>
     <w:pPr>
       <w:spacing w:after="0" w:line="240" w:lineRule="auto"/>
     </w:pPr>
@@ -3918,7 +4114,6 @@
     <w:name w:val="Light Shading Accent 2"/>
     <w:basedOn w:val="TableNormal"/>
     <w:uiPriority w:val="60"/>
-    <w:rsid w:val="00FC693F"/>
     <w:pPr>
       <w:spacing w:after="0" w:line="240" w:lineRule="auto"/>
     </w:pPr>
@@ -4021,7 +4216,6 @@
     <w:name w:val="Light Shading Accent 3"/>
     <w:basedOn w:val="TableNormal"/>
     <w:uiPriority w:val="60"/>
-    <w:rsid w:val="00FC693F"/>
     <w:pPr>
       <w:spacing w:after="0" w:line="240" w:lineRule="auto"/>
     </w:pPr>
@@ -4124,7 +4318,6 @@
     <w:name w:val="Light Shading Accent 4"/>
     <w:basedOn w:val="TableNormal"/>
     <w:uiPriority w:val="60"/>
-    <w:rsid w:val="00FC693F"/>
     <w:pPr>
       <w:spacing w:after="0" w:line="240" w:lineRule="auto"/>
     </w:pPr>
@@ -4227,7 +4420,6 @@
     <w:name w:val="Light Shading Accent 5"/>
     <w:basedOn w:val="TableNormal"/>
     <w:uiPriority w:val="60"/>
-    <w:rsid w:val="00FC693F"/>
     <w:pPr>
       <w:spacing w:after="0" w:line="240" w:lineRule="auto"/>
     </w:pPr>
@@ -4330,7 +4522,6 @@
     <w:name w:val="Light Shading Accent 6"/>
     <w:basedOn w:val="TableNormal"/>
     <w:uiPriority w:val="60"/>
-    <w:rsid w:val="00FC693F"/>
     <w:pPr>
       <w:spacing w:after="0" w:line="240" w:lineRule="auto"/>
     </w:pPr>
@@ -4433,7 +4624,6 @@
     <w:name w:val="Light List"/>
     <w:basedOn w:val="TableNormal"/>
     <w:uiPriority w:val="61"/>
-    <w:rsid w:val="00FC693F"/>
     <w:pPr>
       <w:spacing w:after="0" w:line="240" w:lineRule="auto"/>
     </w:pPr>
@@ -4525,7 +4715,6 @@
     <w:name w:val="Light List Accent 1"/>
     <w:basedOn w:val="TableNormal"/>
     <w:uiPriority w:val="61"/>
-    <w:rsid w:val="00FC693F"/>
     <w:pPr>
       <w:spacing w:after="0" w:line="240" w:lineRule="auto"/>
     </w:pPr>
@@ -4617,7 +4806,6 @@
     <w:name w:val="Light List Accent 2"/>
     <w:basedOn w:val="TableNormal"/>
     <w:uiPriority w:val="61"/>
-    <w:rsid w:val="00CB0664"/>
     <w:pPr>
       <w:spacing w:after="0" w:line="240" w:lineRule="auto"/>
     </w:pPr>
@@ -4709,7 +4897,6 @@
     <w:name w:val="Light List Accent 3"/>
     <w:basedOn w:val="TableNormal"/>
     <w:uiPriority w:val="61"/>
-    <w:rsid w:val="00CB0664"/>
     <w:pPr>
       <w:spacing w:after="0" w:line="240" w:lineRule="auto"/>
     </w:pPr>
@@ -4801,7 +4988,6 @@
     <w:name w:val="Light List Accent 4"/>
     <w:basedOn w:val="TableNormal"/>
     <w:uiPriority w:val="61"/>
-    <w:rsid w:val="00CB0664"/>
     <w:pPr>
       <w:spacing w:after="0" w:line="240" w:lineRule="auto"/>
     </w:pPr>
@@ -4893,7 +5079,6 @@
     <w:name w:val="Light List Accent 5"/>
     <w:basedOn w:val="TableNormal"/>
     <w:uiPriority w:val="61"/>
-    <w:rsid w:val="00CB0664"/>
     <w:pPr>
       <w:spacing w:after="0" w:line="240" w:lineRule="auto"/>
     </w:pPr>
@@ -4985,7 +5170,6 @@
     <w:name w:val="Light List Accent 6"/>
     <w:basedOn w:val="TableNormal"/>
     <w:uiPriority w:val="61"/>
-    <w:rsid w:val="00CB0664"/>
     <w:pPr>
       <w:spacing w:after="0" w:line="240" w:lineRule="auto"/>
     </w:pPr>
@@ -5077,7 +5261,6 @@
     <w:name w:val="Light Grid"/>
     <w:basedOn w:val="TableNormal"/>
     <w:uiPriority w:val="62"/>
-    <w:rsid w:val="00CB0664"/>
     <w:pPr>
       <w:spacing w:after="0" w:line="240" w:lineRule="auto"/>
     </w:pPr>
@@ -5207,7 +5390,6 @@
     <w:name w:val="Light Grid Accent 1"/>
     <w:basedOn w:val="TableNormal"/>
     <w:uiPriority w:val="62"/>
-    <w:rsid w:val="00CB0664"/>
     <w:pPr>
       <w:spacing w:after="0" w:line="240" w:lineRule="auto"/>
     </w:pPr>
@@ -5337,7 +5519,6 @@
     <w:name w:val="Light Grid Accent 2"/>
     <w:basedOn w:val="TableNormal"/>
     <w:uiPriority w:val="62"/>
-    <w:rsid w:val="00CB0664"/>
     <w:pPr>
       <w:spacing w:after="0" w:line="240" w:lineRule="auto"/>
     </w:pPr>
@@ -5467,7 +5648,6 @@
     <w:name w:val="Light Grid Accent 3"/>
     <w:basedOn w:val="TableNormal"/>
     <w:uiPriority w:val="62"/>
-    <w:rsid w:val="00CB0664"/>
     <w:pPr>
       <w:spacing w:after="0" w:line="240" w:lineRule="auto"/>
     </w:pPr>
@@ -5597,7 +5777,6 @@
     <w:name w:val="Light Grid Accent 4"/>
     <w:basedOn w:val="TableNormal"/>
     <w:uiPriority w:val="62"/>
-    <w:rsid w:val="00CB0664"/>
     <w:pPr>
       <w:spacing w:after="0" w:line="240" w:lineRule="auto"/>
     </w:pPr>
@@ -5727,7 +5906,6 @@
     <w:name w:val="Light Grid Accent 5"/>
     <w:basedOn w:val="TableNormal"/>
     <w:uiPriority w:val="62"/>
-    <w:rsid w:val="00CB0664"/>
     <w:pPr>
       <w:spacing w:after="0" w:line="240" w:lineRule="auto"/>
     </w:pPr>
@@ -5857,7 +6035,6 @@
     <w:name w:val="Light Grid Accent 6"/>
     <w:basedOn w:val="TableNormal"/>
     <w:uiPriority w:val="62"/>
-    <w:rsid w:val="00CB0664"/>
     <w:pPr>
       <w:spacing w:after="0" w:line="240" w:lineRule="auto"/>
     </w:pPr>
@@ -5987,7 +6164,6 @@
     <w:name w:val="Medium Shading 1"/>
     <w:basedOn w:val="TableNormal"/>
     <w:uiPriority w:val="63"/>
-    <w:rsid w:val="00CB0664"/>
     <w:pPr>
       <w:spacing w:after="0" w:line="240" w:lineRule="auto"/>
     </w:pPr>
@@ -6093,7 +6269,6 @@
     <w:name w:val="Medium Shading 1 Accent 1"/>
     <w:basedOn w:val="TableNormal"/>
     <w:uiPriority w:val="63"/>
-    <w:rsid w:val="00CB0664"/>
     <w:pPr>
       <w:spacing w:after="0" w:line="240" w:lineRule="auto"/>
     </w:pPr>
@@ -6199,7 +6374,6 @@
     <w:name w:val="Medium Shading 1 Accent 2"/>
     <w:basedOn w:val="TableNormal"/>
     <w:uiPriority w:val="63"/>
-    <w:rsid w:val="00CB0664"/>
     <w:pPr>
       <w:spacing w:after="0" w:line="240" w:lineRule="auto"/>
     </w:pPr>
@@ -6305,7 +6479,6 @@
     <w:name w:val="Medium Shading 1 Accent 3"/>
     <w:basedOn w:val="TableNormal"/>
     <w:uiPriority w:val="63"/>
-    <w:rsid w:val="00CB0664"/>
     <w:pPr>
       <w:spacing w:after="0" w:line="240" w:lineRule="auto"/>
     </w:pPr>
@@ -6411,7 +6584,6 @@
     <w:name w:val="Medium Shading 1 Accent 4"/>
     <w:basedOn w:val="TableNormal"/>
     <w:uiPriority w:val="63"/>
-    <w:rsid w:val="00CB0664"/>
     <w:pPr>
       <w:spacing w:after="0" w:line="240" w:lineRule="auto"/>
     </w:pPr>
@@ -6517,7 +6689,6 @@
     <w:name w:val="Medium Shading 1 Accent 5"/>
     <w:basedOn w:val="TableNormal"/>
     <w:uiPriority w:val="63"/>
-    <w:rsid w:val="00CB0664"/>
     <w:pPr>
       <w:spacing w:after="0" w:line="240" w:lineRule="auto"/>
     </w:pPr>
@@ -6623,7 +6794,6 @@
     <w:name w:val="Medium Shading 1 Accent 6"/>
     <w:basedOn w:val="TableNormal"/>
     <w:uiPriority w:val="63"/>
-    <w:rsid w:val="00CB0664"/>
     <w:pPr>
       <w:spacing w:after="0" w:line="240" w:lineRule="auto"/>
     </w:pPr>
@@ -6729,7 +6899,6 @@
     <w:name w:val="Medium Shading 2"/>
     <w:basedOn w:val="TableNormal"/>
     <w:uiPriority w:val="64"/>
-    <w:rsid w:val="00CB0664"/>
     <w:pPr>
       <w:spacing w:after="0" w:line="240" w:lineRule="auto"/>
     </w:pPr>
@@ -6878,7 +7047,6 @@
     <w:name w:val="Medium Shading 2 Accent 1"/>
     <w:basedOn w:val="TableNormal"/>
     <w:uiPriority w:val="64"/>
-    <w:rsid w:val="00CB0664"/>
     <w:pPr>
       <w:spacing w:after="0" w:line="240" w:lineRule="auto"/>
     </w:pPr>
@@ -7027,7 +7195,6 @@
     <w:name w:val="Medium Shading 2 Accent 2"/>
     <w:basedOn w:val="TableNormal"/>
     <w:uiPriority w:val="64"/>
-    <w:rsid w:val="00CB0664"/>
     <w:pPr>
       <w:spacing w:after="0" w:line="240" w:lineRule="auto"/>
     </w:pPr>
@@ -7176,7 +7343,6 @@
     <w:name w:val="Medium Shading 2 Accent 3"/>
     <w:basedOn w:val="TableNormal"/>
     <w:uiPriority w:val="64"/>
-    <w:rsid w:val="00CB0664"/>
     <w:pPr>
       <w:spacing w:after="0" w:line="240" w:lineRule="auto"/>
     </w:pPr>
@@ -7325,7 +7491,6 @@
     <w:name w:val="Medium Shading 2 Accent 4"/>
     <w:basedOn w:val="TableNormal"/>
     <w:uiPriority w:val="64"/>
-    <w:rsid w:val="00CB0664"/>
     <w:pPr>
       <w:spacing w:after="0" w:line="240" w:lineRule="auto"/>
     </w:pPr>
@@ -7474,7 +7639,6 @@
     <w:name w:val="Medium Shading 2 Accent 5"/>
     <w:basedOn w:val="TableNormal"/>
     <w:uiPriority w:val="64"/>
-    <w:rsid w:val="00CB0664"/>
     <w:pPr>
       <w:spacing w:after="0" w:line="240" w:lineRule="auto"/>
     </w:pPr>
@@ -7623,7 +7787,6 @@
     <w:name w:val="Medium Shading 2 Accent 6"/>
     <w:basedOn w:val="TableNormal"/>
     <w:uiPriority w:val="64"/>
-    <w:rsid w:val="00CB0664"/>
     <w:pPr>
       <w:spacing w:after="0" w:line="240" w:lineRule="auto"/>
     </w:pPr>
@@ -7772,7 +7935,6 @@
     <w:name w:val="Medium List 1"/>
     <w:basedOn w:val="TableNormal"/>
     <w:uiPriority w:val="65"/>
-    <w:rsid w:val="00CB0664"/>
     <w:pPr>
       <w:spacing w:after="0" w:line="240" w:lineRule="auto"/>
     </w:pPr>
@@ -7856,7 +8018,6 @@
     <w:name w:val="Medium List 1 Accent 1"/>
     <w:basedOn w:val="TableNormal"/>
     <w:uiPriority w:val="65"/>
-    <w:rsid w:val="00CB0664"/>
     <w:pPr>
       <w:spacing w:after="0" w:line="240" w:lineRule="auto"/>
     </w:pPr>
@@ -7940,7 +8101,6 @@
     <w:name w:val="Medium List 1 Accent 2"/>
     <w:basedOn w:val="TableNormal"/>
     <w:uiPriority w:val="65"/>
-    <w:rsid w:val="00CB0664"/>
     <w:pPr>
       <w:spacing w:after="0" w:line="240" w:lineRule="auto"/>
     </w:pPr>
@@ -8024,7 +8184,6 @@
     <w:name w:val="Medium List 1 Accent 3"/>
     <w:basedOn w:val="TableNormal"/>
     <w:uiPriority w:val="65"/>
-    <w:rsid w:val="00CB0664"/>
     <w:pPr>
       <w:spacing w:after="0" w:line="240" w:lineRule="auto"/>
     </w:pPr>
@@ -8108,7 +8267,6 @@
     <w:name w:val="Medium List 1 Accent 4"/>
     <w:basedOn w:val="TableNormal"/>
     <w:uiPriority w:val="65"/>
-    <w:rsid w:val="00CB0664"/>
     <w:pPr>
       <w:spacing w:after="0" w:line="240" w:lineRule="auto"/>
     </w:pPr>
@@ -8192,7 +8350,6 @@
     <w:name w:val="Medium List 1 Accent 5"/>
     <w:basedOn w:val="TableNormal"/>
     <w:uiPriority w:val="65"/>
-    <w:rsid w:val="00CB0664"/>
     <w:pPr>
       <w:spacing w:after="0" w:line="240" w:lineRule="auto"/>
     </w:pPr>
@@ -8276,7 +8433,6 @@
     <w:name w:val="Medium List 1 Accent 6"/>
     <w:basedOn w:val="TableNormal"/>
     <w:uiPriority w:val="65"/>
-    <w:rsid w:val="00CB0664"/>
     <w:pPr>
       <w:spacing w:after="0" w:line="240" w:lineRule="auto"/>
     </w:pPr>
@@ -8360,7 +8516,6 @@
     <w:name w:val="Medium List 2"/>
     <w:basedOn w:val="TableNormal"/>
     <w:uiPriority w:val="66"/>
-    <w:rsid w:val="00CB0664"/>
     <w:pPr>
       <w:spacing w:after="0" w:line="240" w:lineRule="auto"/>
     </w:pPr>
@@ -8488,7 +8643,6 @@
     <w:name w:val="Medium List 2 Accent 1"/>
     <w:basedOn w:val="TableNormal"/>
     <w:uiPriority w:val="66"/>
-    <w:rsid w:val="00CB0664"/>
     <w:pPr>
       <w:spacing w:after="0" w:line="240" w:lineRule="auto"/>
     </w:pPr>
@@ -8616,7 +8770,6 @@
     <w:name w:val="Medium List 2 Accent 2"/>
     <w:basedOn w:val="TableNormal"/>
     <w:uiPriority w:val="66"/>
-    <w:rsid w:val="00CB0664"/>
     <w:pPr>
       <w:spacing w:after="0" w:line="240" w:lineRule="auto"/>
     </w:pPr>
@@ -8744,7 +8897,6 @@
     <w:name w:val="Medium List 2 Accent 3"/>
     <w:basedOn w:val="TableNormal"/>
     <w:uiPriority w:val="66"/>
-    <w:rsid w:val="00CB0664"/>
     <w:pPr>
       <w:spacing w:after="0" w:line="240" w:lineRule="auto"/>
     </w:pPr>
@@ -8872,7 +9024,6 @@
     <w:name w:val="Medium List 2 Accent 4"/>
     <w:basedOn w:val="TableNormal"/>
     <w:uiPriority w:val="66"/>
-    <w:rsid w:val="00CB0664"/>
     <w:pPr>
       <w:spacing w:after="0" w:line="240" w:lineRule="auto"/>
     </w:pPr>
@@ -9000,7 +9151,6 @@
     <w:name w:val="Medium List 2 Accent 5"/>
     <w:basedOn w:val="TableNormal"/>
     <w:uiPriority w:val="66"/>
-    <w:rsid w:val="00CB0664"/>
     <w:pPr>
       <w:spacing w:after="0" w:line="240" w:lineRule="auto"/>
     </w:pPr>
@@ -9128,7 +9278,6 @@
     <w:name w:val="Medium List 2 Accent 6"/>
     <w:basedOn w:val="TableNormal"/>
     <w:uiPriority w:val="66"/>
-    <w:rsid w:val="00CB0664"/>
     <w:pPr>
       <w:spacing w:after="0" w:line="240" w:lineRule="auto"/>
     </w:pPr>
@@ -9256,7 +9405,6 @@
     <w:name w:val="Medium Grid 1"/>
     <w:basedOn w:val="TableNormal"/>
     <w:uiPriority w:val="67"/>
-    <w:rsid w:val="00CB0664"/>
     <w:pPr>
       <w:spacing w:after="0" w:line="240" w:lineRule="auto"/>
     </w:pPr>
@@ -9329,7 +9477,6 @@
     <w:name w:val="Medium Grid 1 Accent 1"/>
     <w:basedOn w:val="TableNormal"/>
     <w:uiPriority w:val="67"/>
-    <w:rsid w:val="00CB0664"/>
     <w:pPr>
       <w:spacing w:after="0" w:line="240" w:lineRule="auto"/>
     </w:pPr>
@@ -9402,7 +9549,6 @@
     <w:name w:val="Medium Grid 1 Accent 2"/>
     <w:basedOn w:val="TableNormal"/>
     <w:uiPriority w:val="67"/>
-    <w:rsid w:val="00CB0664"/>
     <w:pPr>
       <w:spacing w:after="0" w:line="240" w:lineRule="auto"/>
     </w:pPr>
@@ -9475,7 +9621,6 @@
     <w:name w:val="Medium Grid 1 Accent 3"/>
     <w:basedOn w:val="TableNormal"/>
     <w:uiPriority w:val="67"/>
-    <w:rsid w:val="00CB0664"/>
     <w:pPr>
       <w:spacing w:after="0" w:line="240" w:lineRule="auto"/>
     </w:pPr>
@@ -9548,7 +9693,6 @@
     <w:name w:val="Medium Grid 1 Accent 4"/>
     <w:basedOn w:val="TableNormal"/>
     <w:uiPriority w:val="67"/>
-    <w:rsid w:val="00CB0664"/>
     <w:pPr>
       <w:spacing w:after="0" w:line="240" w:lineRule="auto"/>
     </w:pPr>
@@ -9621,7 +9765,6 @@
     <w:name w:val="Medium Grid 1 Accent 5"/>
     <w:basedOn w:val="TableNormal"/>
     <w:uiPriority w:val="67"/>
-    <w:rsid w:val="00CB0664"/>
     <w:pPr>
       <w:spacing w:after="0" w:line="240" w:lineRule="auto"/>
     </w:pPr>
@@ -9694,7 +9837,6 @@
     <w:name w:val="Medium Grid 1 Accent 6"/>
     <w:basedOn w:val="TableNormal"/>
     <w:uiPriority w:val="67"/>
-    <w:rsid w:val="00CB0664"/>
     <w:pPr>
       <w:spacing w:after="0" w:line="240" w:lineRule="auto"/>
     </w:pPr>
@@ -9767,7 +9909,6 @@
     <w:name w:val="Medium Grid 2"/>
     <w:basedOn w:val="TableNormal"/>
     <w:uiPriority w:val="68"/>
-    <w:rsid w:val="00CB0664"/>
     <w:pPr>
       <w:spacing w:after="0" w:line="240" w:lineRule="auto"/>
     </w:pPr>
@@ -9892,7 +10033,6 @@
     <w:name w:val="Medium Grid 2 Accent 1"/>
     <w:basedOn w:val="TableNormal"/>
     <w:uiPriority w:val="68"/>
-    <w:rsid w:val="00CB0664"/>
     <w:pPr>
       <w:spacing w:after="0" w:line="240" w:lineRule="auto"/>
     </w:pPr>
@@ -10017,7 +10157,6 @@
     <w:name w:val="Medium Grid 2 Accent 2"/>
     <w:basedOn w:val="TableNormal"/>
     <w:uiPriority w:val="68"/>
-    <w:rsid w:val="00CB0664"/>
     <w:pPr>
       <w:spacing w:after="0" w:line="240" w:lineRule="auto"/>
     </w:pPr>
@@ -10142,7 +10281,6 @@
     <w:name w:val="Medium Grid 2 Accent 3"/>
     <w:basedOn w:val="TableNormal"/>
     <w:uiPriority w:val="68"/>
-    <w:rsid w:val="00CB0664"/>
     <w:pPr>
       <w:spacing w:after="0" w:line="240" w:lineRule="auto"/>
     </w:pPr>
@@ -10267,7 +10405,6 @@
     <w:name w:val="Medium Grid 2 Accent 4"/>
     <w:basedOn w:val="TableNormal"/>
     <w:uiPriority w:val="68"/>
-    <w:rsid w:val="00CB0664"/>
     <w:pPr>
       <w:spacing w:after="0" w:line="240" w:lineRule="auto"/>
     </w:pPr>
@@ -10392,7 +10529,6 @@
     <w:name w:val="Medium Grid 2 Accent 5"/>
     <w:basedOn w:val="TableNormal"/>
     <w:uiPriority w:val="68"/>
-    <w:rsid w:val="00CB0664"/>
     <w:pPr>
       <w:spacing w:after="0" w:line="240" w:lineRule="auto"/>
     </w:pPr>
@@ -10517,7 +10653,6 @@
     <w:name w:val="Medium Grid 2 Accent 6"/>
     <w:basedOn w:val="TableNormal"/>
     <w:uiPriority w:val="68"/>
-    <w:rsid w:val="00CB0664"/>
     <w:pPr>
       <w:spacing w:after="0" w:line="240" w:lineRule="auto"/>
     </w:pPr>
@@ -10642,7 +10777,6 @@
     <w:name w:val="Medium Grid 3"/>
     <w:basedOn w:val="TableNormal"/>
     <w:uiPriority w:val="69"/>
-    <w:rsid w:val="00CB0664"/>
     <w:pPr>
       <w:spacing w:after="0" w:line="240" w:lineRule="auto"/>
     </w:pPr>
@@ -10783,7 +10917,6 @@
     <w:name w:val="Medium Grid 3 Accent 1"/>
     <w:basedOn w:val="TableNormal"/>
     <w:uiPriority w:val="69"/>
-    <w:rsid w:val="00CB0664"/>
     <w:pPr>
       <w:spacing w:after="0" w:line="240" w:lineRule="auto"/>
     </w:pPr>
@@ -10924,7 +11057,6 @@
     <w:name w:val="Medium Grid 3 Accent 2"/>
     <w:basedOn w:val="TableNormal"/>
     <w:uiPriority w:val="69"/>
-    <w:rsid w:val="00CB0664"/>
     <w:pPr>
       <w:spacing w:after="0" w:line="240" w:lineRule="auto"/>
     </w:pPr>
@@ -11065,7 +11197,6 @@
     <w:name w:val="Medium Grid 3 Accent 3"/>
     <w:basedOn w:val="TableNormal"/>
     <w:uiPriority w:val="69"/>
-    <w:rsid w:val="00CB0664"/>
     <w:pPr>
       <w:spacing w:after="0" w:line="240" w:lineRule="auto"/>
     </w:pPr>
@@ -11206,7 +11337,6 @@
     <w:name w:val="Medium Grid 3 Accent 4"/>
     <w:basedOn w:val="TableNormal"/>
     <w:uiPriority w:val="69"/>
-    <w:rsid w:val="00CB0664"/>
     <w:pPr>
       <w:spacing w:after="0" w:line="240" w:lineRule="auto"/>
     </w:pPr>
@@ -11347,7 +11477,6 @@
     <w:name w:val="Medium Grid 3 Accent 5"/>
     <w:basedOn w:val="TableNormal"/>
     <w:uiPriority w:val="69"/>
-    <w:rsid w:val="00CB0664"/>
     <w:pPr>
       <w:spacing w:after="0" w:line="240" w:lineRule="auto"/>
     </w:pPr>
@@ -11488,7 +11617,6 @@
     <w:name w:val="Medium Grid 3 Accent 6"/>
     <w:basedOn w:val="TableNormal"/>
     <w:uiPriority w:val="69"/>
-    <w:rsid w:val="00CB0664"/>
     <w:pPr>
       <w:spacing w:after="0" w:line="240" w:lineRule="auto"/>
     </w:pPr>
@@ -11629,7 +11757,6 @@
     <w:name w:val="Dark List"/>
     <w:basedOn w:val="TableNormal"/>
     <w:uiPriority w:val="70"/>
-    <w:rsid w:val="00CB0664"/>
     <w:pPr>
       <w:spacing w:after="0" w:line="240" w:lineRule="auto"/>
     </w:pPr>
@@ -11743,7 +11870,6 @@
     <w:name w:val="Dark List Accent 1"/>
     <w:basedOn w:val="TableNormal"/>
     <w:uiPriority w:val="70"/>
-    <w:rsid w:val="00CB0664"/>
     <w:pPr>
       <w:spacing w:after="0" w:line="240" w:lineRule="auto"/>
     </w:pPr>
@@ -11857,7 +11983,6 @@
     <w:name w:val="Dark List Accent 2"/>
     <w:basedOn w:val="TableNormal"/>
     <w:uiPriority w:val="70"/>
-    <w:rsid w:val="00CB0664"/>
     <w:pPr>
       <w:spacing w:after="0" w:line="240" w:lineRule="auto"/>
     </w:pPr>
@@ -11971,7 +12096,6 @@
     <w:name w:val="Dark List Accent 3"/>
     <w:basedOn w:val="TableNormal"/>
     <w:uiPriority w:val="70"/>
-    <w:rsid w:val="00CB0664"/>
     <w:pPr>
       <w:spacing w:after="0" w:line="240" w:lineRule="auto"/>
     </w:pPr>
@@ -12085,7 +12209,6 @@
     <w:name w:val="Dark List Accent 4"/>
     <w:basedOn w:val="TableNormal"/>
     <w:uiPriority w:val="70"/>
-    <w:rsid w:val="00CB0664"/>
     <w:pPr>
       <w:spacing w:after="0" w:line="240" w:lineRule="auto"/>
     </w:pPr>
@@ -12199,7 +12322,6 @@
     <w:name w:val="Dark List Accent 5"/>
     <w:basedOn w:val="TableNormal"/>
     <w:uiPriority w:val="70"/>
-    <w:rsid w:val="00CB0664"/>
     <w:pPr>
       <w:spacing w:after="0" w:line="240" w:lineRule="auto"/>
     </w:pPr>
@@ -12313,7 +12435,6 @@
     <w:name w:val="Dark List Accent 6"/>
     <w:basedOn w:val="TableNormal"/>
     <w:uiPriority w:val="70"/>
-    <w:rsid w:val="00CB0664"/>
     <w:pPr>
       <w:spacing w:after="0" w:line="240" w:lineRule="auto"/>
     </w:pPr>
@@ -12427,7 +12548,6 @@
     <w:name w:val="Colorful Shading"/>
     <w:basedOn w:val="TableNormal"/>
     <w:uiPriority w:val="71"/>
-    <w:rsid w:val="00CB0664"/>
     <w:pPr>
       <w:spacing w:after="0" w:line="240" w:lineRule="auto"/>
     </w:pPr>
@@ -12549,7 +12669,6 @@
     <w:name w:val="Colorful Shading Accent 1"/>
     <w:basedOn w:val="TableNormal"/>
     <w:uiPriority w:val="71"/>
-    <w:rsid w:val="00CB0664"/>
     <w:pPr>
       <w:spacing w:after="0" w:line="240" w:lineRule="auto"/>
     </w:pPr>
@@ -12671,7 +12790,6 @@
     <w:name w:val="Colorful Shading Accent 2"/>
     <w:basedOn w:val="TableNormal"/>
     <w:uiPriority w:val="71"/>
-    <w:rsid w:val="00CB0664"/>
     <w:pPr>
       <w:spacing w:after="0" w:line="240" w:lineRule="auto"/>
     </w:pPr>
@@ -12793,7 +12911,6 @@
     <w:name w:val="Colorful Shading Accent 3"/>
     <w:basedOn w:val="TableNormal"/>
     <w:uiPriority w:val="71"/>
-    <w:rsid w:val="00CB0664"/>
     <w:pPr>
       <w:spacing w:after="0" w:line="240" w:lineRule="auto"/>
     </w:pPr>
@@ -12905,7 +13022,6 @@
     <w:name w:val="Colorful Shading Accent 4"/>
     <w:basedOn w:val="TableNormal"/>
     <w:uiPriority w:val="71"/>
-    <w:rsid w:val="00CB0664"/>
     <w:pPr>
       <w:spacing w:after="0" w:line="240" w:lineRule="auto"/>
     </w:pPr>
@@ -13027,7 +13143,6 @@
     <w:name w:val="Colorful Shading Accent 5"/>
     <w:basedOn w:val="TableNormal"/>
     <w:uiPriority w:val="71"/>
-    <w:rsid w:val="00CB0664"/>
     <w:pPr>
       <w:spacing w:after="0" w:line="240" w:lineRule="auto"/>
     </w:pPr>
@@ -13149,7 +13264,6 @@
     <w:name w:val="Colorful Shading Accent 6"/>
     <w:basedOn w:val="TableNormal"/>
     <w:uiPriority w:val="71"/>
-    <w:rsid w:val="00CB0664"/>
     <w:pPr>
       <w:spacing w:after="0" w:line="240" w:lineRule="auto"/>
     </w:pPr>
@@ -13271,7 +13385,6 @@
     <w:name w:val="Colorful List"/>
     <w:basedOn w:val="TableNormal"/>
     <w:uiPriority w:val="72"/>
-    <w:rsid w:val="00CB0664"/>
     <w:pPr>
       <w:spacing w:after="0" w:line="240" w:lineRule="auto"/>
     </w:pPr>
@@ -13357,7 +13470,6 @@
     <w:name w:val="Colorful List Accent 1"/>
     <w:basedOn w:val="TableNormal"/>
     <w:uiPriority w:val="72"/>
-    <w:rsid w:val="00CB0664"/>
     <w:pPr>
       <w:spacing w:after="0" w:line="240" w:lineRule="auto"/>
     </w:pPr>
@@ -13443,7 +13555,6 @@
     <w:name w:val="Colorful List Accent 2"/>
     <w:basedOn w:val="TableNormal"/>
     <w:uiPriority w:val="72"/>
-    <w:rsid w:val="00CB0664"/>
     <w:pPr>
       <w:spacing w:after="0" w:line="240" w:lineRule="auto"/>
     </w:pPr>
@@ -13529,7 +13640,6 @@
     <w:name w:val="Colorful List Accent 3"/>
     <w:basedOn w:val="TableNormal"/>
     <w:uiPriority w:val="72"/>
-    <w:rsid w:val="00CB0664"/>
     <w:pPr>
       <w:spacing w:after="0" w:line="240" w:lineRule="auto"/>
     </w:pPr>
@@ -13615,7 +13725,6 @@
     <w:name w:val="Colorful List Accent 4"/>
     <w:basedOn w:val="TableNormal"/>
     <w:uiPriority w:val="72"/>
-    <w:rsid w:val="00CB0664"/>
     <w:pPr>
       <w:spacing w:after="0" w:line="240" w:lineRule="auto"/>
     </w:pPr>
@@ -13701,7 +13810,6 @@
     <w:name w:val="Colorful List Accent 5"/>
     <w:basedOn w:val="TableNormal"/>
     <w:uiPriority w:val="72"/>
-    <w:rsid w:val="00CB0664"/>
     <w:pPr>
       <w:spacing w:after="0" w:line="240" w:lineRule="auto"/>
     </w:pPr>
@@ -13787,7 +13895,6 @@
     <w:name w:val="Colorful List Accent 6"/>
     <w:basedOn w:val="TableNormal"/>
     <w:uiPriority w:val="72"/>
-    <w:rsid w:val="00CB0664"/>
     <w:pPr>
       <w:spacing w:after="0" w:line="240" w:lineRule="auto"/>
     </w:pPr>
@@ -13873,7 +13980,6 @@
     <w:name w:val="Colorful Grid"/>
     <w:basedOn w:val="TableNormal"/>
     <w:uiPriority w:val="73"/>
-    <w:rsid w:val="00CB0664"/>
     <w:pPr>
       <w:spacing w:after="0" w:line="240" w:lineRule="auto"/>
     </w:pPr>
@@ -13953,7 +14059,6 @@
     <w:name w:val="Colorful Grid Accent 1"/>
     <w:basedOn w:val="TableNormal"/>
     <w:uiPriority w:val="73"/>
-    <w:rsid w:val="00CB0664"/>
     <w:pPr>
       <w:spacing w:after="0" w:line="240" w:lineRule="auto"/>
     </w:pPr>
@@ -14033,7 +14138,6 @@
     <w:name w:val="Colorful Grid Accent 2"/>
     <w:basedOn w:val="TableNormal"/>
     <w:uiPriority w:val="73"/>
-    <w:rsid w:val="00CB0664"/>
     <w:pPr>
       <w:spacing w:after="0" w:line="240" w:lineRule="auto"/>
     </w:pPr>
@@ -14113,7 +14217,6 @@
     <w:name w:val="Colorful Grid Accent 3"/>
     <w:basedOn w:val="TableNormal"/>
     <w:uiPriority w:val="73"/>
-    <w:rsid w:val="00CB0664"/>
     <w:pPr>
       <w:spacing w:after="0" w:line="240" w:lineRule="auto"/>
     </w:pPr>
@@ -14193,7 +14296,6 @@
     <w:name w:val="Colorful Grid Accent 4"/>
     <w:basedOn w:val="TableNormal"/>
     <w:uiPriority w:val="73"/>
-    <w:rsid w:val="00CB0664"/>
     <w:pPr>
       <w:spacing w:after="0" w:line="240" w:lineRule="auto"/>
     </w:pPr>
@@ -14273,7 +14375,6 @@
     <w:name w:val="Colorful Grid Accent 5"/>
     <w:basedOn w:val="TableNormal"/>
     <w:uiPriority w:val="73"/>
-    <w:rsid w:val="00CB0664"/>
     <w:pPr>
       <w:spacing w:after="0" w:line="240" w:lineRule="auto"/>
     </w:pPr>
@@ -14353,7 +14454,6 @@
     <w:name w:val="Colorful Grid Accent 6"/>
     <w:basedOn w:val="TableNormal"/>
     <w:uiPriority w:val="73"/>
-    <w:rsid w:val="00CB0664"/>
     <w:pPr>
       <w:spacing w:after="0" w:line="240" w:lineRule="auto"/>
     </w:pPr>
@@ -14646,7 +14746,6 @@
   <w:style w:type="paragraph" w:default="1" w:styleId="Normal">
     <w:name w:val="Normal"/>
     <w:qFormat/>
-    <w:rsid w:val="00FC693F"/>
   </w:style>
   <w:style w:type="paragraph" w:styleId="Heading1">
     <w:name w:val="heading 1"/>
@@ -14655,7 +14754,6 @@
     <w:link w:val="Heading1Char"/>
     <w:uiPriority w:val="9"/>
     <w:qFormat/>
-    <w:rsid w:val="00FC693F"/>
     <w:pPr>
       <w:keepNext/>
       <w:keepLines/>
@@ -14679,7 +14777,6 @@
     <w:uiPriority w:val="9"/>
     <w:unhideWhenUsed/>
     <w:qFormat/>
-    <w:rsid w:val="00FC693F"/>
     <w:pPr>
       <w:keepNext/>
       <w:keepLines/>
@@ -14703,7 +14800,6 @@
     <w:uiPriority w:val="9"/>
     <w:unhideWhenUsed/>
     <w:qFormat/>
-    <w:rsid w:val="00FC693F"/>
     <w:pPr>
       <w:keepNext/>
       <w:keepLines/>
@@ -14726,7 +14822,6 @@
     <w:semiHidden/>
     <w:unhideWhenUsed/>
     <w:qFormat/>
-    <w:rsid w:val="00FC693F"/>
     <w:pPr>
       <w:keepNext/>
       <w:keepLines/>
@@ -14751,7 +14846,6 @@
     <w:semiHidden/>
     <w:unhideWhenUsed/>
     <w:qFormat/>
-    <w:rsid w:val="00FC693F"/>
     <w:pPr>
       <w:keepNext/>
       <w:keepLines/>
@@ -14772,7 +14866,6 @@
     <w:semiHidden/>
     <w:unhideWhenUsed/>
     <w:qFormat/>
-    <w:rsid w:val="00FC693F"/>
     <w:pPr>
       <w:keepNext/>
       <w:keepLines/>
@@ -14795,7 +14888,6 @@
     <w:semiHidden/>
     <w:unhideWhenUsed/>
     <w:qFormat/>
-    <w:rsid w:val="00FC693F"/>
     <w:pPr>
       <w:keepNext/>
       <w:keepLines/>
@@ -14818,7 +14910,6 @@
     <w:semiHidden/>
     <w:unhideWhenUsed/>
     <w:qFormat/>
-    <w:rsid w:val="00FC693F"/>
     <w:pPr>
       <w:keepNext/>
       <w:keepLines/>
@@ -14841,7 +14932,6 @@
     <w:semiHidden/>
     <w:unhideWhenUsed/>
     <w:qFormat/>
-    <w:rsid w:val="00FC693F"/>
     <w:pPr>
       <w:keepNext/>
       <w:keepLines/>
@@ -14888,7 +14978,6 @@
     <w:name w:val="No Spacing"/>
     <w:uiPriority w:val="1"/>
     <w:qFormat/>
-    <w:rsid w:val="00FC693F"/>
     <w:pPr>
       <w:spacing w:after="0" w:line="240" w:lineRule="auto"/>
     </w:pPr>
@@ -14898,7 +14987,6 @@
     <w:basedOn w:val="DefaultParagraphFont"/>
     <w:link w:val="Heading1"/>
     <w:uiPriority w:val="9"/>
-    <w:rsid w:val="00FC693F"/>
     <w:rPr>
       <w:rFonts w:asciiTheme="majorHAnsi" w:eastAsiaTheme="majorEastAsia" w:hAnsiTheme="majorHAnsi" w:cstheme="majorBidi"/>
       <w:b/>
@@ -14913,7 +15001,6 @@
     <w:basedOn w:val="DefaultParagraphFont"/>
     <w:link w:val="Heading2"/>
     <w:uiPriority w:val="9"/>
-    <w:rsid w:val="00FC693F"/>
     <w:rPr>
       <w:rFonts w:asciiTheme="majorHAnsi" w:eastAsiaTheme="majorEastAsia" w:hAnsiTheme="majorHAnsi" w:cstheme="majorBidi"/>
       <w:b/>
@@ -14928,7 +15015,6 @@
     <w:basedOn w:val="DefaultParagraphFont"/>
     <w:link w:val="Heading3"/>
     <w:uiPriority w:val="9"/>
-    <w:rsid w:val="00FC693F"/>
     <w:rPr>
       <w:rFonts w:asciiTheme="majorHAnsi" w:eastAsiaTheme="majorEastAsia" w:hAnsiTheme="majorHAnsi" w:cstheme="majorBidi"/>
       <w:b/>
@@ -14943,7 +15029,6 @@
     <w:link w:val="TitleChar"/>
     <w:uiPriority w:val="10"/>
     <w:qFormat/>
-    <w:rsid w:val="00FC693F"/>
     <w:pPr>
       <w:pBdr>
         <w:bottom w:val="single" w:sz="8" w:space="4" w:color="4F81BD" w:themeColor="accent1"/>
@@ -14965,7 +15050,6 @@
     <w:basedOn w:val="DefaultParagraphFont"/>
     <w:link w:val="Title"/>
     <w:uiPriority w:val="10"/>
-    <w:rsid w:val="00FC693F"/>
     <w:rPr>
       <w:rFonts w:asciiTheme="majorHAnsi" w:eastAsiaTheme="majorEastAsia" w:hAnsiTheme="majorHAnsi" w:cstheme="majorBidi"/>
       <w:color w:val="17365D" w:themeColor="text2" w:themeShade="BF"/>
@@ -14982,7 +15066,6 @@
     <w:link w:val="SubtitleChar"/>
     <w:uiPriority w:val="11"/>
     <w:qFormat/>
-    <w:rsid w:val="00FC693F"/>
     <w:pPr>
       <w:numPr>
         <w:ilvl w:val="1"/>
@@ -15003,7 +15086,6 @@
     <w:basedOn w:val="DefaultParagraphFont"/>
     <w:link w:val="Subtitle"/>
     <w:uiPriority w:val="11"/>
-    <w:rsid w:val="00FC693F"/>
     <w:rPr>
       <w:rFonts w:asciiTheme="majorHAnsi" w:eastAsiaTheme="majorEastAsia" w:hAnsiTheme="majorHAnsi" w:cstheme="majorBidi"/>
       <w:i/>
@@ -15019,7 +15101,6 @@
     <w:basedOn w:val="Normal"/>
     <w:uiPriority w:val="34"/>
     <w:qFormat/>
-    <w:rsid w:val="00FC693F"/>
     <w:pPr>
       <w:ind w:left="720"/>
       <w:contextualSpacing/>
@@ -15031,7 +15112,6 @@
     <w:link w:val="BodyTextChar"/>
     <w:uiPriority w:val="99"/>
     <w:unhideWhenUsed/>
-    <w:rsid w:val="00AA1D8D"/>
     <w:pPr>
       <w:spacing w:after="120"/>
     </w:pPr>
@@ -15041,7 +15121,6 @@
     <w:basedOn w:val="DefaultParagraphFont"/>
     <w:link w:val="BodyText"/>
     <w:uiPriority w:val="99"/>
-    <w:rsid w:val="00AA1D8D"/>
   </w:style>
   <w:style w:type="paragraph" w:styleId="BodyText2">
     <w:name w:val="Body Text 2"/>
@@ -15049,7 +15128,6 @@
     <w:link w:val="BodyText2Char"/>
     <w:uiPriority w:val="99"/>
     <w:unhideWhenUsed/>
-    <w:rsid w:val="00AA1D8D"/>
     <w:pPr>
       <w:spacing w:after="120" w:line="480" w:lineRule="auto"/>
     </w:pPr>
@@ -15059,7 +15137,6 @@
     <w:basedOn w:val="DefaultParagraphFont"/>
     <w:link w:val="BodyText2"/>
     <w:uiPriority w:val="99"/>
-    <w:rsid w:val="00AA1D8D"/>
   </w:style>
   <w:style w:type="paragraph" w:styleId="BodyText3">
     <w:name w:val="Body Text 3"/>
@@ -15067,7 +15144,6 @@
     <w:link w:val="BodyText3Char"/>
     <w:uiPriority w:val="99"/>
     <w:unhideWhenUsed/>
-    <w:rsid w:val="00AA1D8D"/>
     <w:pPr>
       <w:spacing w:after="120"/>
     </w:pPr>
@@ -15081,7 +15157,6 @@
     <w:basedOn w:val="DefaultParagraphFont"/>
     <w:link w:val="BodyText3"/>
     <w:uiPriority w:val="99"/>
-    <w:rsid w:val="00AA1D8D"/>
     <w:rPr>
       <w:sz w:val="16"/>
       <w:szCs w:val="16"/>
@@ -15092,7 +15167,6 @@
     <w:basedOn w:val="Normal"/>
     <w:uiPriority w:val="99"/>
     <w:unhideWhenUsed/>
-    <w:rsid w:val="00AA1D8D"/>
     <w:pPr>
       <w:ind w:left="360" w:hanging="360"/>
       <w:contextualSpacing/>
@@ -15103,7 +15177,6 @@
     <w:basedOn w:val="Normal"/>
     <w:uiPriority w:val="99"/>
     <w:unhideWhenUsed/>
-    <w:rsid w:val="00326F90"/>
     <w:pPr>
       <w:ind w:left="720" w:hanging="360"/>
       <w:contextualSpacing/>
@@ -15114,7 +15187,6 @@
     <w:basedOn w:val="Normal"/>
     <w:uiPriority w:val="99"/>
     <w:unhideWhenUsed/>
-    <w:rsid w:val="00326F90"/>
     <w:pPr>
       <w:ind w:left="1080" w:hanging="360"/>
       <w:contextualSpacing/>
@@ -15125,7 +15197,6 @@
     <w:basedOn w:val="Normal"/>
     <w:uiPriority w:val="99"/>
     <w:unhideWhenUsed/>
-    <w:rsid w:val="00326F90"/>
     <w:pPr>
       <w:numPr>
         <w:numId w:val="1"/>
@@ -15138,7 +15209,6 @@
     <w:basedOn w:val="Normal"/>
     <w:uiPriority w:val="99"/>
     <w:unhideWhenUsed/>
-    <w:rsid w:val="00326F90"/>
     <w:pPr>
       <w:numPr>
         <w:numId w:val="2"/>
@@ -15151,7 +15221,6 @@
     <w:basedOn w:val="Normal"/>
     <w:uiPriority w:val="99"/>
     <w:unhideWhenUsed/>
-    <w:rsid w:val="00326F90"/>
     <w:pPr>
       <w:numPr>
         <w:numId w:val="3"/>
@@ -15164,7 +15233,6 @@
     <w:basedOn w:val="Normal"/>
     <w:uiPriority w:val="99"/>
     <w:unhideWhenUsed/>
-    <w:rsid w:val="00326F90"/>
     <w:pPr>
       <w:numPr>
         <w:numId w:val="5"/>
@@ -15177,7 +15245,6 @@
     <w:basedOn w:val="Normal"/>
     <w:uiPriority w:val="99"/>
     <w:unhideWhenUsed/>
-    <w:rsid w:val="0029639D"/>
     <w:pPr>
       <w:numPr>
         <w:numId w:val="6"/>
@@ -15190,7 +15257,6 @@
     <w:basedOn w:val="Normal"/>
     <w:uiPriority w:val="99"/>
     <w:unhideWhenUsed/>
-    <w:rsid w:val="0029639D"/>
     <w:pPr>
       <w:numPr>
         <w:numId w:val="7"/>
@@ -15203,7 +15269,6 @@
     <w:basedOn w:val="Normal"/>
     <w:uiPriority w:val="99"/>
     <w:unhideWhenUsed/>
-    <w:rsid w:val="0029639D"/>
     <w:pPr>
       <w:spacing w:after="120"/>
       <w:ind w:left="360"/>
@@ -15215,7 +15280,6 @@
     <w:basedOn w:val="Normal"/>
     <w:uiPriority w:val="99"/>
     <w:unhideWhenUsed/>
-    <w:rsid w:val="0029639D"/>
     <w:pPr>
       <w:spacing w:after="120"/>
       <w:ind w:left="720"/>
@@ -15227,7 +15291,6 @@
     <w:basedOn w:val="Normal"/>
     <w:uiPriority w:val="99"/>
     <w:unhideWhenUsed/>
-    <w:rsid w:val="0029639D"/>
     <w:pPr>
       <w:spacing w:after="120"/>
       <w:ind w:left="1080"/>
@@ -15239,7 +15302,6 @@
     <w:link w:val="MacroTextChar"/>
     <w:uiPriority w:val="99"/>
     <w:unhideWhenUsed/>
-    <w:rsid w:val="0029639D"/>
     <w:pPr>
       <w:tabs>
         <w:tab w:val="left" w:pos="576"/>
@@ -15262,7 +15324,6 @@
     <w:basedOn w:val="DefaultParagraphFont"/>
     <w:link w:val="MacroText"/>
     <w:uiPriority w:val="99"/>
-    <w:rsid w:val="0029639D"/>
     <w:rPr>
       <w:rFonts w:ascii="Courier" w:hAnsi="Courier"/>
       <w:sz w:val="20"/>
@@ -15276,7 +15337,6 @@
     <w:link w:val="QuoteChar"/>
     <w:uiPriority w:val="29"/>
     <w:qFormat/>
-    <w:rsid w:val="00FC693F"/>
     <w:rPr>
       <w:i/>
       <w:iCs/>
@@ -15288,7 +15348,6 @@
     <w:basedOn w:val="DefaultParagraphFont"/>
     <w:link w:val="Quote"/>
     <w:uiPriority w:val="29"/>
-    <w:rsid w:val="00FC693F"/>
     <w:rPr>
       <w:i/>
       <w:iCs/>
@@ -15301,7 +15360,6 @@
     <w:link w:val="Heading4"/>
     <w:uiPriority w:val="9"/>
     <w:semiHidden/>
-    <w:rsid w:val="00FC693F"/>
     <w:rPr>
       <w:rFonts w:asciiTheme="majorHAnsi" w:eastAsiaTheme="majorEastAsia" w:hAnsiTheme="majorHAnsi" w:cstheme="majorBidi"/>
       <w:b/>
@@ -15317,7 +15375,6 @@
     <w:link w:val="Heading5"/>
     <w:uiPriority w:val="9"/>
     <w:semiHidden/>
-    <w:rsid w:val="00FC693F"/>
     <w:rPr>
       <w:rFonts w:asciiTheme="majorHAnsi" w:eastAsiaTheme="majorEastAsia" w:hAnsiTheme="majorHAnsi" w:cstheme="majorBidi"/>
       <w:color w:val="243F60" w:themeColor="accent1" w:themeShade="7F"/>
@@ -15329,7 +15386,6 @@
     <w:link w:val="Heading6"/>
     <w:uiPriority w:val="9"/>
     <w:semiHidden/>
-    <w:rsid w:val="00FC693F"/>
     <w:rPr>
       <w:rFonts w:asciiTheme="majorHAnsi" w:eastAsiaTheme="majorEastAsia" w:hAnsiTheme="majorHAnsi" w:cstheme="majorBidi"/>
       <w:i/>
@@ -15343,7 +15399,6 @@
     <w:link w:val="Heading7"/>
     <w:uiPriority w:val="9"/>
     <w:semiHidden/>
-    <w:rsid w:val="00FC693F"/>
     <w:rPr>
       <w:rFonts w:asciiTheme="majorHAnsi" w:eastAsiaTheme="majorEastAsia" w:hAnsiTheme="majorHAnsi" w:cstheme="majorBidi"/>
       <w:i/>
@@ -15357,7 +15412,6 @@
     <w:link w:val="Heading8"/>
     <w:uiPriority w:val="9"/>
     <w:semiHidden/>
-    <w:rsid w:val="00FC693F"/>
     <w:rPr>
       <w:rFonts w:asciiTheme="majorHAnsi" w:eastAsiaTheme="majorEastAsia" w:hAnsiTheme="majorHAnsi" w:cstheme="majorBidi"/>
       <w:color w:val="4F81BD" w:themeColor="accent1"/>
@@ -15371,7 +15425,6 @@
     <w:link w:val="Heading9"/>
     <w:uiPriority w:val="9"/>
     <w:semiHidden/>
-    <w:rsid w:val="00FC693F"/>
     <w:rPr>
       <w:rFonts w:asciiTheme="majorHAnsi" w:eastAsiaTheme="majorEastAsia" w:hAnsiTheme="majorHAnsi" w:cstheme="majorBidi"/>
       <w:i/>
@@ -15389,7 +15442,6 @@
     <w:semiHidden/>
     <w:unhideWhenUsed/>
     <w:qFormat/>
-    <w:rsid w:val="00FC693F"/>
     <w:pPr>
       <w:spacing w:line="240" w:lineRule="auto"/>
     </w:pPr>
@@ -15406,7 +15458,6 @@
     <w:basedOn w:val="DefaultParagraphFont"/>
     <w:uiPriority w:val="22"/>
     <w:qFormat/>
-    <w:rsid w:val="00FC693F"/>
     <w:rPr>
       <w:b/>
       <w:bCs/>
@@ -15417,7 +15468,6 @@
     <w:basedOn w:val="DefaultParagraphFont"/>
     <w:uiPriority w:val="20"/>
     <w:qFormat/>
-    <w:rsid w:val="00FC693F"/>
     <w:rPr>
       <w:i/>
       <w:iCs/>
@@ -15430,7 +15480,6 @@
     <w:link w:val="IntenseQuoteChar"/>
     <w:uiPriority w:val="30"/>
     <w:qFormat/>
-    <w:rsid w:val="00FC693F"/>
     <w:pPr>
       <w:pBdr>
         <w:bottom w:val="single" w:sz="4" w:space="4" w:color="4F81BD" w:themeColor="accent1"/>
@@ -15451,7 +15500,6 @@
     <w:basedOn w:val="DefaultParagraphFont"/>
     <w:link w:val="IntenseQuote"/>
     <w:uiPriority w:val="30"/>
-    <w:rsid w:val="00FC693F"/>
     <w:rPr>
       <w:b/>
       <w:bCs/>
@@ -15465,7 +15513,6 @@
     <w:basedOn w:val="DefaultParagraphFont"/>
     <w:uiPriority w:val="19"/>
     <w:qFormat/>
-    <w:rsid w:val="00FC693F"/>
     <w:rPr>
       <w:i/>
       <w:iCs/>
@@ -15477,7 +15524,6 @@
     <w:basedOn w:val="DefaultParagraphFont"/>
     <w:uiPriority w:val="21"/>
     <w:qFormat/>
-    <w:rsid w:val="00FC693F"/>
     <w:rPr>
       <w:b/>
       <w:bCs/>
@@ -15491,7 +15537,6 @@
     <w:basedOn w:val="DefaultParagraphFont"/>
     <w:uiPriority w:val="31"/>
     <w:qFormat/>
-    <w:rsid w:val="00FC693F"/>
     <w:rPr>
       <w:smallCaps/>
       <w:color w:val="C0504D" w:themeColor="accent2"/>
@@ -15503,7 +15548,6 @@
     <w:basedOn w:val="DefaultParagraphFont"/>
     <w:uiPriority w:val="32"/>
     <w:qFormat/>
-    <w:rsid w:val="00FC693F"/>
     <w:rPr>
       <w:b/>
       <w:bCs/>
@@ -15518,7 +15562,6 @@
     <w:basedOn w:val="DefaultParagraphFont"/>
     <w:uiPriority w:val="33"/>
     <w:qFormat/>
-    <w:rsid w:val="00FC693F"/>
     <w:rPr>
       <w:b/>
       <w:bCs/>
@@ -15534,7 +15577,6 @@
     <w:semiHidden/>
     <w:unhideWhenUsed/>
     <w:qFormat/>
-    <w:rsid w:val="00FC693F"/>
     <w:pPr>
       <w:outlineLvl w:val="9"/>
     </w:pPr>
@@ -15543,7 +15585,6 @@
     <w:name w:val="Table Grid"/>
     <w:basedOn w:val="TableNormal"/>
     <w:uiPriority w:val="59"/>
-    <w:rsid w:val="00FC693F"/>
     <w:pPr>
       <w:spacing w:after="0" w:line="240" w:lineRule="auto"/>
     </w:pPr>
@@ -15569,7 +15610,6 @@
     <w:name w:val="Light Shading"/>
     <w:basedOn w:val="TableNormal"/>
     <w:uiPriority w:val="60"/>
-    <w:rsid w:val="00FC693F"/>
     <w:pPr>
       <w:spacing w:after="0" w:line="240" w:lineRule="auto"/>
     </w:pPr>
@@ -15672,7 +15712,6 @@
     <w:name w:val="Light Shading Accent 1"/>
     <w:basedOn w:val="TableNormal"/>
     <w:uiPriority w:val="60"/>
-    <w:rsid w:val="00FC693F"/>
     <w:pPr>
       <w:spacing w:after="0" w:line="240" w:lineRule="auto"/>
     </w:pPr>
@@ -15775,7 +15814,6 @@
     <w:name w:val="Light Shading Accent 2"/>
     <w:basedOn w:val="TableNormal"/>
     <w:uiPriority w:val="60"/>
-    <w:rsid w:val="00FC693F"/>
     <w:pPr>
       <w:spacing w:after="0" w:line="240" w:lineRule="auto"/>
     </w:pPr>
@@ -15878,7 +15916,6 @@
     <w:name w:val="Light Shading Accent 3"/>
     <w:basedOn w:val="TableNormal"/>
     <w:uiPriority w:val="60"/>
-    <w:rsid w:val="00FC693F"/>
     <w:pPr>
       <w:spacing w:after="0" w:line="240" w:lineRule="auto"/>
     </w:pPr>
@@ -15981,7 +16018,6 @@
     <w:name w:val="Light Shading Accent 4"/>
     <w:basedOn w:val="TableNormal"/>
     <w:uiPriority w:val="60"/>
-    <w:rsid w:val="00FC693F"/>
     <w:pPr>
       <w:spacing w:after="0" w:line="240" w:lineRule="auto"/>
     </w:pPr>
@@ -16084,7 +16120,6 @@
     <w:name w:val="Light Shading Accent 5"/>
     <w:basedOn w:val="TableNormal"/>
     <w:uiPriority w:val="60"/>
-    <w:rsid w:val="00FC693F"/>
     <w:pPr>
       <w:spacing w:after="0" w:line="240" w:lineRule="auto"/>
     </w:pPr>
@@ -16187,7 +16222,6 @@
     <w:name w:val="Light Shading Accent 6"/>
     <w:basedOn w:val="TableNormal"/>
     <w:uiPriority w:val="60"/>
-    <w:rsid w:val="00FC693F"/>
     <w:pPr>
       <w:spacing w:after="0" w:line="240" w:lineRule="auto"/>
     </w:pPr>
@@ -16290,7 +16324,6 @@
     <w:name w:val="Light List"/>
     <w:basedOn w:val="TableNormal"/>
     <w:uiPriority w:val="61"/>
-    <w:rsid w:val="00FC693F"/>
     <w:pPr>
       <w:spacing w:after="0" w:line="240" w:lineRule="auto"/>
     </w:pPr>
@@ -16382,7 +16415,6 @@
     <w:name w:val="Light List Accent 1"/>
     <w:basedOn w:val="TableNormal"/>
     <w:uiPriority w:val="61"/>
-    <w:rsid w:val="00FC693F"/>
     <w:pPr>
       <w:spacing w:after="0" w:line="240" w:lineRule="auto"/>
     </w:pPr>
@@ -16474,7 +16506,6 @@
     <w:name w:val="Light List Accent 2"/>
     <w:basedOn w:val="TableNormal"/>
     <w:uiPriority w:val="61"/>
-    <w:rsid w:val="00CB0664"/>
     <w:pPr>
       <w:spacing w:after="0" w:line="240" w:lineRule="auto"/>
     </w:pPr>
@@ -16566,7 +16597,6 @@
     <w:name w:val="Light List Accent 3"/>
     <w:basedOn w:val="TableNormal"/>
     <w:uiPriority w:val="61"/>
-    <w:rsid w:val="00CB0664"/>
     <w:pPr>
       <w:spacing w:after="0" w:line="240" w:lineRule="auto"/>
     </w:pPr>
@@ -16658,7 +16688,6 @@
     <w:name w:val="Light List Accent 4"/>
     <w:basedOn w:val="TableNormal"/>
     <w:uiPriority w:val="61"/>
-    <w:rsid w:val="00CB0664"/>
     <w:pPr>
       <w:spacing w:after="0" w:line="240" w:lineRule="auto"/>
     </w:pPr>
@@ -16750,7 +16779,6 @@
     <w:name w:val="Light List Accent 5"/>
     <w:basedOn w:val="TableNormal"/>
     <w:uiPriority w:val="61"/>
-    <w:rsid w:val="00CB0664"/>
     <w:pPr>
       <w:spacing w:after="0" w:line="240" w:lineRule="auto"/>
     </w:pPr>
@@ -16842,7 +16870,6 @@
     <w:name w:val="Light List Accent 6"/>
     <w:basedOn w:val="TableNormal"/>
     <w:uiPriority w:val="61"/>
-    <w:rsid w:val="00CB0664"/>
     <w:pPr>
       <w:spacing w:after="0" w:line="240" w:lineRule="auto"/>
     </w:pPr>
@@ -16934,7 +16961,6 @@
     <w:name w:val="Light Grid"/>
     <w:basedOn w:val="TableNormal"/>
     <w:uiPriority w:val="62"/>
-    <w:rsid w:val="00CB0664"/>
     <w:pPr>
       <w:spacing w:after="0" w:line="240" w:lineRule="auto"/>
     </w:pPr>
@@ -17064,7 +17090,6 @@
     <w:name w:val="Light Grid Accent 1"/>
     <w:basedOn w:val="TableNormal"/>
     <w:uiPriority w:val="62"/>
-    <w:rsid w:val="00CB0664"/>
     <w:pPr>
       <w:spacing w:after="0" w:line="240" w:lineRule="auto"/>
     </w:pPr>
@@ -17194,7 +17219,6 @@
     <w:name w:val="Light Grid Accent 2"/>
     <w:basedOn w:val="TableNormal"/>
     <w:uiPriority w:val="62"/>
-    <w:rsid w:val="00CB0664"/>
     <w:pPr>
       <w:spacing w:after="0" w:line="240" w:lineRule="auto"/>
     </w:pPr>
@@ -17324,7 +17348,6 @@
     <w:name w:val="Light Grid Accent 3"/>
     <w:basedOn w:val="TableNormal"/>
     <w:uiPriority w:val="62"/>
-    <w:rsid w:val="00CB0664"/>
     <w:pPr>
       <w:spacing w:after="0" w:line="240" w:lineRule="auto"/>
     </w:pPr>
@@ -17454,7 +17477,6 @@
     <w:name w:val="Light Grid Accent 4"/>
     <w:basedOn w:val="TableNormal"/>
     <w:uiPriority w:val="62"/>
-    <w:rsid w:val="00CB0664"/>
     <w:pPr>
       <w:spacing w:after="0" w:line="240" w:lineRule="auto"/>
     </w:pPr>
@@ -17584,7 +17606,6 @@
     <w:name w:val="Light Grid Accent 5"/>
     <w:basedOn w:val="TableNormal"/>
     <w:uiPriority w:val="62"/>
-    <w:rsid w:val="00CB0664"/>
     <w:pPr>
       <w:spacing w:after="0" w:line="240" w:lineRule="auto"/>
     </w:pPr>
@@ -17714,7 +17735,6 @@
     <w:name w:val="Light Grid Accent 6"/>
     <w:basedOn w:val="TableNormal"/>
     <w:uiPriority w:val="62"/>
-    <w:rsid w:val="00CB0664"/>
     <w:pPr>
       <w:spacing w:after="0" w:line="240" w:lineRule="auto"/>
     </w:pPr>
@@ -17844,7 +17864,6 @@
     <w:name w:val="Medium Shading 1"/>
     <w:basedOn w:val="TableNormal"/>
     <w:uiPriority w:val="63"/>
-    <w:rsid w:val="00CB0664"/>
     <w:pPr>
       <w:spacing w:after="0" w:line="240" w:lineRule="auto"/>
     </w:pPr>
@@ -17950,7 +17969,6 @@
     <w:name w:val="Medium Shading 1 Accent 1"/>
     <w:basedOn w:val="TableNormal"/>
     <w:uiPriority w:val="63"/>
-    <w:rsid w:val="00CB0664"/>
     <w:pPr>
       <w:spacing w:after="0" w:line="240" w:lineRule="auto"/>
     </w:pPr>
@@ -18056,7 +18074,6 @@
     <w:name w:val="Medium Shading 1 Accent 2"/>
     <w:basedOn w:val="TableNormal"/>
     <w:uiPriority w:val="63"/>
-    <w:rsid w:val="00CB0664"/>
     <w:pPr>
       <w:spacing w:after="0" w:line="240" w:lineRule="auto"/>
     </w:pPr>
@@ -18162,7 +18179,6 @@
     <w:name w:val="Medium Shading 1 Accent 3"/>
     <w:basedOn w:val="TableNormal"/>
     <w:uiPriority w:val="63"/>
-    <w:rsid w:val="00CB0664"/>
     <w:pPr>
       <w:spacing w:after="0" w:line="240" w:lineRule="auto"/>
     </w:pPr>
@@ -18268,7 +18284,6 @@
     <w:name w:val="Medium Shading 1 Accent 4"/>
     <w:basedOn w:val="TableNormal"/>
     <w:uiPriority w:val="63"/>
-    <w:rsid w:val="00CB0664"/>
     <w:pPr>
       <w:spacing w:after="0" w:line="240" w:lineRule="auto"/>
     </w:pPr>
@@ -18374,7 +18389,6 @@
     <w:name w:val="Medium Shading 1 Accent 5"/>
     <w:basedOn w:val="TableNormal"/>
     <w:uiPriority w:val="63"/>
-    <w:rsid w:val="00CB0664"/>
     <w:pPr>
       <w:spacing w:after="0" w:line="240" w:lineRule="auto"/>
     </w:pPr>
@@ -18480,7 +18494,6 @@
     <w:name w:val="Medium Shading 1 Accent 6"/>
     <w:basedOn w:val="TableNormal"/>
     <w:uiPriority w:val="63"/>
-    <w:rsid w:val="00CB0664"/>
     <w:pPr>
       <w:spacing w:after="0" w:line="240" w:lineRule="auto"/>
     </w:pPr>
@@ -18586,7 +18599,6 @@
     <w:name w:val="Medium Shading 2"/>
     <w:basedOn w:val="TableNormal"/>
     <w:uiPriority w:val="64"/>
-    <w:rsid w:val="00CB0664"/>
     <w:pPr>
       <w:spacing w:after="0" w:line="240" w:lineRule="auto"/>
     </w:pPr>
@@ -18735,7 +18747,6 @@
     <w:name w:val="Medium Shading 2 Accent 1"/>
     <w:basedOn w:val="TableNormal"/>
     <w:uiPriority w:val="64"/>
-    <w:rsid w:val="00CB0664"/>
     <w:pPr>
       <w:spacing w:after="0" w:line="240" w:lineRule="auto"/>
     </w:pPr>
@@ -18884,7 +18895,6 @@
     <w:name w:val="Medium Shading 2 Accent 2"/>
     <w:basedOn w:val="TableNormal"/>
     <w:uiPriority w:val="64"/>
-    <w:rsid w:val="00CB0664"/>
     <w:pPr>
       <w:spacing w:after="0" w:line="240" w:lineRule="auto"/>
     </w:pPr>
@@ -19033,7 +19043,6 @@
     <w:name w:val="Medium Shading 2 Accent 3"/>
     <w:basedOn w:val="TableNormal"/>
     <w:uiPriority w:val="64"/>
-    <w:rsid w:val="00CB0664"/>
     <w:pPr>
       <w:spacing w:after="0" w:line="240" w:lineRule="auto"/>
     </w:pPr>
@@ -19182,7 +19191,6 @@
     <w:name w:val="Medium Shading 2 Accent 4"/>
     <w:basedOn w:val="TableNormal"/>
     <w:uiPriority w:val="64"/>
-    <w:rsid w:val="00CB0664"/>
     <w:pPr>
       <w:spacing w:after="0" w:line="240" w:lineRule="auto"/>
     </w:pPr>
@@ -19331,7 +19339,6 @@
     <w:name w:val="Medium Shading 2 Accent 5"/>
     <w:basedOn w:val="TableNormal"/>
     <w:uiPriority w:val="64"/>
-    <w:rsid w:val="00CB0664"/>
     <w:pPr>
       <w:spacing w:after="0" w:line="240" w:lineRule="auto"/>
     </w:pPr>
@@ -19480,7 +19487,6 @@
     <w:name w:val="Medium Shading 2 Accent 6"/>
     <w:basedOn w:val="TableNormal"/>
     <w:uiPriority w:val="64"/>
-    <w:rsid w:val="00CB0664"/>
     <w:pPr>
       <w:spacing w:after="0" w:line="240" w:lineRule="auto"/>
     </w:pPr>
@@ -19629,7 +19635,6 @@
     <w:name w:val="Medium List 1"/>
     <w:basedOn w:val="TableNormal"/>
     <w:uiPriority w:val="65"/>
-    <w:rsid w:val="00CB0664"/>
     <w:pPr>
       <w:spacing w:after="0" w:line="240" w:lineRule="auto"/>
     </w:pPr>
@@ -19713,7 +19718,6 @@
     <w:name w:val="Medium List 1 Accent 1"/>
     <w:basedOn w:val="TableNormal"/>
     <w:uiPriority w:val="65"/>
-    <w:rsid w:val="00CB0664"/>
     <w:pPr>
       <w:spacing w:after="0" w:line="240" w:lineRule="auto"/>
     </w:pPr>
@@ -19797,7 +19801,6 @@
     <w:name w:val="Medium List 1 Accent 2"/>
     <w:basedOn w:val="TableNormal"/>
     <w:uiPriority w:val="65"/>
-    <w:rsid w:val="00CB0664"/>
     <w:pPr>
       <w:spacing w:after="0" w:line="240" w:lineRule="auto"/>
     </w:pPr>
@@ -19881,7 +19884,6 @@
     <w:name w:val="Medium List 1 Accent 3"/>
     <w:basedOn w:val="TableNormal"/>
     <w:uiPriority w:val="65"/>
-    <w:rsid w:val="00CB0664"/>
     <w:pPr>
       <w:spacing w:after="0" w:line="240" w:lineRule="auto"/>
     </w:pPr>
@@ -19965,7 +19967,6 @@
     <w:name w:val="Medium List 1 Accent 4"/>
     <w:basedOn w:val="TableNormal"/>
     <w:uiPriority w:val="65"/>
-    <w:rsid w:val="00CB0664"/>
     <w:pPr>
       <w:spacing w:after="0" w:line="240" w:lineRule="auto"/>
     </w:pPr>
@@ -20049,7 +20050,6 @@
     <w:name w:val="Medium List 1 Accent 5"/>
     <w:basedOn w:val="TableNormal"/>
     <w:uiPriority w:val="65"/>
-    <w:rsid w:val="00CB0664"/>
     <w:pPr>
       <w:spacing w:after="0" w:line="240" w:lineRule="auto"/>
     </w:pPr>
@@ -20133,7 +20133,6 @@
     <w:name w:val="Medium List 1 Accent 6"/>
     <w:basedOn w:val="TableNormal"/>
     <w:uiPriority w:val="65"/>
-    <w:rsid w:val="00CB0664"/>
     <w:pPr>
       <w:spacing w:after="0" w:line="240" w:lineRule="auto"/>
     </w:pPr>
@@ -20217,7 +20216,6 @@
     <w:name w:val="Medium List 2"/>
     <w:basedOn w:val="TableNormal"/>
     <w:uiPriority w:val="66"/>
-    <w:rsid w:val="00CB0664"/>
     <w:pPr>
       <w:spacing w:after="0" w:line="240" w:lineRule="auto"/>
     </w:pPr>
@@ -20345,7 +20343,6 @@
     <w:name w:val="Medium List 2 Accent 1"/>
     <w:basedOn w:val="TableNormal"/>
     <w:uiPriority w:val="66"/>
-    <w:rsid w:val="00CB0664"/>
     <w:pPr>
       <w:spacing w:after="0" w:line="240" w:lineRule="auto"/>
     </w:pPr>
@@ -20473,7 +20470,6 @@
     <w:name w:val="Medium List 2 Accent 2"/>
     <w:basedOn w:val="TableNormal"/>
     <w:uiPriority w:val="66"/>
-    <w:rsid w:val="00CB0664"/>
     <w:pPr>
       <w:spacing w:after="0" w:line="240" w:lineRule="auto"/>
     </w:pPr>
@@ -20601,7 +20597,6 @@
     <w:name w:val="Medium List 2 Accent 3"/>
     <w:basedOn w:val="TableNormal"/>
     <w:uiPriority w:val="66"/>
-    <w:rsid w:val="00CB0664"/>
     <w:pPr>
       <w:spacing w:after="0" w:line="240" w:lineRule="auto"/>
     </w:pPr>
@@ -20729,7 +20724,6 @@
     <w:name w:val="Medium List 2 Accent 4"/>
     <w:basedOn w:val="TableNormal"/>
     <w:uiPriority w:val="66"/>
-    <w:rsid w:val="00CB0664"/>
     <w:pPr>
       <w:spacing w:after="0" w:line="240" w:lineRule="auto"/>
     </w:pPr>
@@ -20857,7 +20851,6 @@
     <w:name w:val="Medium List 2 Accent 5"/>
     <w:basedOn w:val="TableNormal"/>
     <w:uiPriority w:val="66"/>
-    <w:rsid w:val="00CB0664"/>
     <w:pPr>
       <w:spacing w:after="0" w:line="240" w:lineRule="auto"/>
     </w:pPr>
@@ -20985,7 +20978,6 @@
     <w:name w:val="Medium List 2 Accent 6"/>
     <w:basedOn w:val="TableNormal"/>
     <w:uiPriority w:val="66"/>
-    <w:rsid w:val="00CB0664"/>
     <w:pPr>
       <w:spacing w:after="0" w:line="240" w:lineRule="auto"/>
     </w:pPr>
@@ -21113,7 +21105,6 @@
     <w:name w:val="Medium Grid 1"/>
     <w:basedOn w:val="TableNormal"/>
     <w:uiPriority w:val="67"/>
-    <w:rsid w:val="00CB0664"/>
     <w:pPr>
       <w:spacing w:after="0" w:line="240" w:lineRule="auto"/>
     </w:pPr>
@@ -21186,7 +21177,6 @@
     <w:name w:val="Medium Grid 1 Accent 1"/>
     <w:basedOn w:val="TableNormal"/>
     <w:uiPriority w:val="67"/>
-    <w:rsid w:val="00CB0664"/>
     <w:pPr>
       <w:spacing w:after="0" w:line="240" w:lineRule="auto"/>
     </w:pPr>
@@ -21259,7 +21249,6 @@
     <w:name w:val="Medium Grid 1 Accent 2"/>
     <w:basedOn w:val="TableNormal"/>
     <w:uiPriority w:val="67"/>
-    <w:rsid w:val="00CB0664"/>
     <w:pPr>
       <w:spacing w:after="0" w:line="240" w:lineRule="auto"/>
     </w:pPr>
@@ -21332,7 +21321,6 @@
     <w:name w:val="Medium Grid 1 Accent 3"/>
     <w:basedOn w:val="TableNormal"/>
     <w:uiPriority w:val="67"/>
-    <w:rsid w:val="00CB0664"/>
     <w:pPr>
       <w:spacing w:after="0" w:line="240" w:lineRule="auto"/>
     </w:pPr>
@@ -21405,7 +21393,6 @@
     <w:name w:val="Medium Grid 1 Accent 4"/>
     <w:basedOn w:val="TableNormal"/>
     <w:uiPriority w:val="67"/>
-    <w:rsid w:val="00CB0664"/>
     <w:pPr>
       <w:spacing w:after="0" w:line="240" w:lineRule="auto"/>
     </w:pPr>
@@ -21478,7 +21465,6 @@
     <w:name w:val="Medium Grid 1 Accent 5"/>
     <w:basedOn w:val="TableNormal"/>
     <w:uiPriority w:val="67"/>
-    <w:rsid w:val="00CB0664"/>
     <w:pPr>
       <w:spacing w:after="0" w:line="240" w:lineRule="auto"/>
     </w:pPr>
@@ -21551,7 +21537,6 @@
     <w:name w:val="Medium Grid 1 Accent 6"/>
     <w:basedOn w:val="TableNormal"/>
     <w:uiPriority w:val="67"/>
-    <w:rsid w:val="00CB0664"/>
     <w:pPr>
       <w:spacing w:after="0" w:line="240" w:lineRule="auto"/>
     </w:pPr>
@@ -21624,7 +21609,6 @@
     <w:name w:val="Medium Grid 2"/>
     <w:basedOn w:val="TableNormal"/>
     <w:uiPriority w:val="68"/>
-    <w:rsid w:val="00CB0664"/>
     <w:pPr>
       <w:spacing w:after="0" w:line="240" w:lineRule="auto"/>
     </w:pPr>
@@ -21749,7 +21733,6 @@
     <w:name w:val="Medium Grid 2 Accent 1"/>
     <w:basedOn w:val="TableNormal"/>
     <w:uiPriority w:val="68"/>
-    <w:rsid w:val="00CB0664"/>
     <w:pPr>
       <w:spacing w:after="0" w:line="240" w:lineRule="auto"/>
     </w:pPr>
@@ -21874,7 +21857,6 @@
     <w:name w:val="Medium Grid 2 Accent 2"/>
     <w:basedOn w:val="TableNormal"/>
     <w:uiPriority w:val="68"/>
-    <w:rsid w:val="00CB0664"/>
     <w:pPr>
       <w:spacing w:after="0" w:line="240" w:lineRule="auto"/>
     </w:pPr>
@@ -21999,7 +21981,6 @@
     <w:name w:val="Medium Grid 2 Accent 3"/>
     <w:basedOn w:val="TableNormal"/>
     <w:uiPriority w:val="68"/>
-    <w:rsid w:val="00CB0664"/>
     <w:pPr>
       <w:spacing w:after="0" w:line="240" w:lineRule="auto"/>
     </w:pPr>
@@ -22124,7 +22105,6 @@
     <w:name w:val="Medium Grid 2 Accent 4"/>
     <w:basedOn w:val="TableNormal"/>
     <w:uiPriority w:val="68"/>
-    <w:rsid w:val="00CB0664"/>
     <w:pPr>
       <w:spacing w:after="0" w:line="240" w:lineRule="auto"/>
     </w:pPr>
@@ -22249,7 +22229,6 @@
     <w:name w:val="Medium Grid 2 Accent 5"/>
     <w:basedOn w:val="TableNormal"/>
     <w:uiPriority w:val="68"/>
-    <w:rsid w:val="00CB0664"/>
     <w:pPr>
       <w:spacing w:after="0" w:line="240" w:lineRule="auto"/>
     </w:pPr>
@@ -22374,7 +22353,6 @@
     <w:name w:val="Medium Grid 2 Accent 6"/>
     <w:basedOn w:val="TableNormal"/>
     <w:uiPriority w:val="68"/>
-    <w:rsid w:val="00CB0664"/>
     <w:pPr>
       <w:spacing w:after="0" w:line="240" w:lineRule="auto"/>
     </w:pPr>
@@ -22499,7 +22477,6 @@
     <w:name w:val="Medium Grid 3"/>
     <w:basedOn w:val="TableNormal"/>
     <w:uiPriority w:val="69"/>
-    <w:rsid w:val="00CB0664"/>
     <w:pPr>
       <w:spacing w:after="0" w:line="240" w:lineRule="auto"/>
     </w:pPr>
@@ -22640,7 +22617,6 @@
     <w:name w:val="Medium Grid 3 Accent 1"/>
     <w:basedOn w:val="TableNormal"/>
     <w:uiPriority w:val="69"/>
-    <w:rsid w:val="00CB0664"/>
     <w:pPr>
       <w:spacing w:after="0" w:line="240" w:lineRule="auto"/>
     </w:pPr>
@@ -22781,7 +22757,6 @@
     <w:name w:val="Medium Grid 3 Accent 2"/>
     <w:basedOn w:val="TableNormal"/>
     <w:uiPriority w:val="69"/>
-    <w:rsid w:val="00CB0664"/>
     <w:pPr>
       <w:spacing w:after="0" w:line="240" w:lineRule="auto"/>
     </w:pPr>
@@ -22922,7 +22897,6 @@
     <w:name w:val="Medium Grid 3 Accent 3"/>
     <w:basedOn w:val="TableNormal"/>
     <w:uiPriority w:val="69"/>
-    <w:rsid w:val="00CB0664"/>
     <w:pPr>
       <w:spacing w:after="0" w:line="240" w:lineRule="auto"/>
     </w:pPr>
@@ -23063,7 +23037,6 @@
     <w:name w:val="Medium Grid 3 Accent 4"/>
     <w:basedOn w:val="TableNormal"/>
     <w:uiPriority w:val="69"/>
-    <w:rsid w:val="00CB0664"/>
     <w:pPr>
       <w:spacing w:after="0" w:line="240" w:lineRule="auto"/>
     </w:pPr>
@@ -23204,7 +23177,6 @@
     <w:name w:val="Medium Grid 3 Accent 5"/>
     <w:basedOn w:val="TableNormal"/>
     <w:uiPriority w:val="69"/>
-    <w:rsid w:val="00CB0664"/>
     <w:pPr>
       <w:spacing w:after="0" w:line="240" w:lineRule="auto"/>
     </w:pPr>
@@ -23345,7 +23317,6 @@
     <w:name w:val="Medium Grid 3 Accent 6"/>
     <w:basedOn w:val="TableNormal"/>
     <w:uiPriority w:val="69"/>
-    <w:rsid w:val="00CB0664"/>
     <w:pPr>
       <w:spacing w:after="0" w:line="240" w:lineRule="auto"/>
     </w:pPr>
@@ -23486,7 +23457,6 @@
     <w:name w:val="Dark List"/>
     <w:basedOn w:val="TableNormal"/>
     <w:uiPriority w:val="70"/>
-    <w:rsid w:val="00CB0664"/>
     <w:pPr>
       <w:spacing w:after="0" w:line="240" w:lineRule="auto"/>
     </w:pPr>
@@ -23600,7 +23570,6 @@
     <w:name w:val="Dark List Accent 1"/>
     <w:basedOn w:val="TableNormal"/>
     <w:uiPriority w:val="70"/>
-    <w:rsid w:val="00CB0664"/>
     <w:pPr>
       <w:spacing w:after="0" w:line="240" w:lineRule="auto"/>
     </w:pPr>
@@ -23714,7 +23683,6 @@
     <w:name w:val="Dark List Accent 2"/>
     <w:basedOn w:val="TableNormal"/>
     <w:uiPriority w:val="70"/>
-    <w:rsid w:val="00CB0664"/>
     <w:pPr>
       <w:spacing w:after="0" w:line="240" w:lineRule="auto"/>
     </w:pPr>
@@ -23828,7 +23796,6 @@
     <w:name w:val="Dark List Accent 3"/>
     <w:basedOn w:val="TableNormal"/>
     <w:uiPriority w:val="70"/>
-    <w:rsid w:val="00CB0664"/>
     <w:pPr>
       <w:spacing w:after="0" w:line="240" w:lineRule="auto"/>
     </w:pPr>
@@ -23942,7 +23909,6 @@
     <w:name w:val="Dark List Accent 4"/>
     <w:basedOn w:val="TableNormal"/>
     <w:uiPriority w:val="70"/>
-    <w:rsid w:val="00CB0664"/>
     <w:pPr>
       <w:spacing w:after="0" w:line="240" w:lineRule="auto"/>
     </w:pPr>
@@ -24056,7 +24022,6 @@
     <w:name w:val="Dark List Accent 5"/>
     <w:basedOn w:val="TableNormal"/>
     <w:uiPriority w:val="70"/>
-    <w:rsid w:val="00CB0664"/>
     <w:pPr>
       <w:spacing w:after="0" w:line="240" w:lineRule="auto"/>
     </w:pPr>
@@ -24170,7 +24135,6 @@
     <w:name w:val="Dark List Accent 6"/>
     <w:basedOn w:val="TableNormal"/>
     <w:uiPriority w:val="70"/>
-    <w:rsid w:val="00CB0664"/>
     <w:pPr>
       <w:spacing w:after="0" w:line="240" w:lineRule="auto"/>
     </w:pPr>
@@ -24284,7 +24248,6 @@
     <w:name w:val="Colorful Shading"/>
     <w:basedOn w:val="TableNormal"/>
     <w:uiPriority w:val="71"/>
-    <w:rsid w:val="00CB0664"/>
     <w:pPr>
       <w:spacing w:after="0" w:line="240" w:lineRule="auto"/>
     </w:pPr>
@@ -24406,7 +24369,6 @@
     <w:name w:val="Colorful Shading Accent 1"/>
     <w:basedOn w:val="TableNormal"/>
     <w:uiPriority w:val="71"/>
-    <w:rsid w:val="00CB0664"/>
     <w:pPr>
       <w:spacing w:after="0" w:line="240" w:lineRule="auto"/>
     </w:pPr>
@@ -24528,7 +24490,6 @@
     <w:name w:val="Colorful Shading Accent 2"/>
     <w:basedOn w:val="TableNormal"/>
     <w:uiPriority w:val="71"/>
-    <w:rsid w:val="00CB0664"/>
     <w:pPr>
       <w:spacing w:after="0" w:line="240" w:lineRule="auto"/>
     </w:pPr>
@@ -24650,7 +24611,6 @@
     <w:name w:val="Colorful Shading Accent 3"/>
     <w:basedOn w:val="TableNormal"/>
     <w:uiPriority w:val="71"/>
-    <w:rsid w:val="00CB0664"/>
     <w:pPr>
       <w:spacing w:after="0" w:line="240" w:lineRule="auto"/>
     </w:pPr>
@@ -24762,7 +24722,6 @@
     <w:name w:val="Colorful Shading Accent 4"/>
     <w:basedOn w:val="TableNormal"/>
     <w:uiPriority w:val="71"/>
-    <w:rsid w:val="00CB0664"/>
     <w:pPr>
       <w:spacing w:after="0" w:line="240" w:lineRule="auto"/>
     </w:pPr>
@@ -24884,7 +24843,6 @@
     <w:name w:val="Colorful Shading Accent 5"/>
     <w:basedOn w:val="TableNormal"/>
     <w:uiPriority w:val="71"/>
-    <w:rsid w:val="00CB0664"/>
     <w:pPr>
       <w:spacing w:after="0" w:line="240" w:lineRule="auto"/>
     </w:pPr>
@@ -25006,7 +24964,6 @@
     <w:name w:val="Colorful Shading Accent 6"/>
     <w:basedOn w:val="TableNormal"/>
     <w:uiPriority w:val="71"/>
-    <w:rsid w:val="00CB0664"/>
     <w:pPr>
       <w:spacing w:after="0" w:line="240" w:lineRule="auto"/>
     </w:pPr>
@@ -25128,7 +25085,6 @@
     <w:name w:val="Colorful List"/>
     <w:basedOn w:val="TableNormal"/>
     <w:uiPriority w:val="72"/>
-    <w:rsid w:val="00CB0664"/>
     <w:pPr>
       <w:spacing w:after="0" w:line="240" w:lineRule="auto"/>
     </w:pPr>
@@ -25214,7 +25170,6 @@
     <w:name w:val="Colorful List Accent 1"/>
     <w:basedOn w:val="TableNormal"/>
     <w:uiPriority w:val="72"/>
-    <w:rsid w:val="00CB0664"/>
     <w:pPr>
       <w:spacing w:after="0" w:line="240" w:lineRule="auto"/>
     </w:pPr>
@@ -25300,7 +25255,6 @@
     <w:name w:val="Colorful List Accent 2"/>
     <w:basedOn w:val="TableNormal"/>
     <w:uiPriority w:val="72"/>
-    <w:rsid w:val="00CB0664"/>
     <w:pPr>
       <w:spacing w:after="0" w:line="240" w:lineRule="auto"/>
     </w:pPr>
@@ -25386,7 +25340,6 @@
     <w:name w:val="Colorful List Accent 3"/>
     <w:basedOn w:val="TableNormal"/>
     <w:uiPriority w:val="72"/>
-    <w:rsid w:val="00CB0664"/>
     <w:pPr>
       <w:spacing w:after="0" w:line="240" w:lineRule="auto"/>
     </w:pPr>
@@ -25472,7 +25425,6 @@
     <w:name w:val="Colorful List Accent 4"/>
     <w:basedOn w:val="TableNormal"/>
     <w:uiPriority w:val="72"/>
-    <w:rsid w:val="00CB0664"/>
     <w:pPr>
       <w:spacing w:after="0" w:line="240" w:lineRule="auto"/>
     </w:pPr>
@@ -25558,7 +25510,6 @@
     <w:name w:val="Colorful List Accent 5"/>
     <w:basedOn w:val="TableNormal"/>
     <w:uiPriority w:val="72"/>
-    <w:rsid w:val="00CB0664"/>
     <w:pPr>
       <w:spacing w:after="0" w:line="240" w:lineRule="auto"/>
     </w:pPr>
@@ -25644,7 +25595,6 @@
     <w:name w:val="Colorful List Accent 6"/>
     <w:basedOn w:val="TableNormal"/>
     <w:uiPriority w:val="72"/>
-    <w:rsid w:val="00CB0664"/>
     <w:pPr>
       <w:spacing w:after="0" w:line="240" w:lineRule="auto"/>
     </w:pPr>
@@ -25730,7 +25680,6 @@
     <w:name w:val="Colorful Grid"/>
     <w:basedOn w:val="TableNormal"/>
     <w:uiPriority w:val="73"/>
-    <w:rsid w:val="00CB0664"/>
     <w:pPr>
       <w:spacing w:after="0" w:line="240" w:lineRule="auto"/>
     </w:pPr>
@@ -25810,7 +25759,6 @@
     <w:name w:val="Colorful Grid Accent 1"/>
     <w:basedOn w:val="TableNormal"/>
     <w:uiPriority w:val="73"/>
-    <w:rsid w:val="00CB0664"/>
     <w:pPr>
       <w:spacing w:after="0" w:line="240" w:lineRule="auto"/>
     </w:pPr>
@@ -25890,7 +25838,6 @@
     <w:name w:val="Colorful Grid Accent 2"/>
     <w:basedOn w:val="TableNormal"/>
     <w:uiPriority w:val="73"/>
-    <w:rsid w:val="00CB0664"/>
     <w:pPr>
       <w:spacing w:after="0" w:line="240" w:lineRule="auto"/>
     </w:pPr>
@@ -25970,7 +25917,6 @@
     <w:name w:val="Colorful Grid Accent 3"/>
     <w:basedOn w:val="TableNormal"/>
     <w:uiPriority w:val="73"/>
-    <w:rsid w:val="00CB0664"/>
     <w:pPr>
       <w:spacing w:after="0" w:line="240" w:lineRule="auto"/>
     </w:pPr>
@@ -26050,7 +25996,6 @@
     <w:name w:val="Colorful Grid Accent 4"/>
     <w:basedOn w:val="TableNormal"/>
     <w:uiPriority w:val="73"/>
-    <w:rsid w:val="00CB0664"/>
     <w:pPr>
       <w:spacing w:after="0" w:line="240" w:lineRule="auto"/>
     </w:pPr>
@@ -26130,7 +26075,6 @@
     <w:name w:val="Colorful Grid Accent 5"/>
     <w:basedOn w:val="TableNormal"/>
     <w:uiPriority w:val="73"/>
-    <w:rsid w:val="00CB0664"/>
     <w:pPr>
       <w:spacing w:after="0" w:line="240" w:lineRule="auto"/>
     </w:pPr>
@@ -26210,7 +26154,6 @@
     <w:name w:val="Colorful Grid Accent 6"/>
     <w:basedOn w:val="TableNormal"/>
     <w:uiPriority w:val="73"/>
-    <w:rsid w:val="00CB0664"/>
     <w:pPr>
       <w:spacing w:after="0" w:line="240" w:lineRule="auto"/>
     </w:pPr>

</xml_diff>

<commit_message>
feat: incorporar implementacion de Alunza y actualizar evidencias
Agregar aplicacion web, API, contratos, migraciones, pruebas y configuracion de desarrollo y CI. Actualizar minutas y mockups CAPSTONE. Excluir docs y specs del seguimiento y ajustar las comprobaciones que dependian de docs/work.
</commit_message>
<xml_diff>
--- a/Evidencias CAPSTONE/Fase 1/Evidencias de proyecto/minutas/Minuta_01_Alunza_Semana_1_Sesion_A.docx
+++ b/Evidencias CAPSTONE/Fase 1/Evidencias de proyecto/minutas/Minuta_01_Alunza_Semana_1_Sesion_A.docx
@@ -52,7 +52,7 @@
           <w:sz w:val="18"/>
           <w:lang w:val="es-CL"/>
         </w:rPr>
-        <w:t>ALZ-MIN-001   ·   SEMANA 1   ·   SESIÓN A</w:t>
+        <w:t>ALZ-MIN-001   ·   SEMANA 1   ·   SESIÓN A  ·  S0  ·  v1.1</w:t>
       </w:r>
     </w:p>
     <w:tbl>
@@ -498,10 +498,267 @@
           </w:p>
         </w:tc>
       </w:tr>
+      <w:tr>
+        <w:trPr>
+          <w:cantSplit/>
+        </w:trPr>
+        <w:tc>
+          <w:tcPr>
+            <w:tcW w:type="dxa" w:w="1944"/>
+            <w:vAlign w:val="center"/>
+            <w:tcMar>
+              <w:top w:w="80" w:type="dxa"/>
+              <w:start w:w="95" w:type="dxa"/>
+              <w:bottom w:w="80" w:type="dxa"/>
+              <w:end w:w="95" w:type="dxa"/>
+            </w:tcMar>
+            <w:shd w:fill="F4F6F8" w:val="clear"/>
+          </w:tcPr>
+          <w:p>
+            <w:pPr>
+              <w:keepLines/>
+              <w:widowControl/>
+              <w:spacing w:before="0" w:after="0" w:line="240" w:lineRule="auto"/>
+              <w:jc w:val="left"/>
+            </w:pPr>
+            <w:r>
+              <w:rPr>
+                <w:rFonts w:ascii="Arial" w:hAnsi="Arial"/>
+                <w:b/>
+                <w:color w:val="142B45"/>
+                <w:sz w:val="18"/>
+              </w:rPr>
+              <w:t>Sprint / iteración</w:t>
+            </w:r>
+            <w:r>
+              <w:rPr>
+                <w:rFonts w:ascii="Arial" w:hAnsi="Arial" w:eastAsia="Calibri"/>
+                <w:b/>
+                <w:i w:val="0"/>
+                <w:color w:val="142B45"/>
+                <w:sz w:val="18"/>
+                <w:lang w:val="es-CL"/>
+              </w:rPr>
+            </w:r>
+          </w:p>
+        </w:tc>
+        <w:tc>
+          <w:tcPr>
+            <w:tcW w:type="dxa" w:w="7632"/>
+            <w:vAlign w:val="center"/>
+            <w:tcMar>
+              <w:top w:w="80" w:type="dxa"/>
+              <w:start w:w="95" w:type="dxa"/>
+              <w:bottom w:w="80" w:type="dxa"/>
+              <w:end w:w="95" w:type="dxa"/>
+            </w:tcMar>
+            <w:shd w:fill="FBFCFD" w:val="clear"/>
+          </w:tcPr>
+          <w:p>
+            <w:pPr>
+              <w:keepLines/>
+              <w:widowControl/>
+              <w:spacing w:before="0" w:after="0" w:line="240" w:lineRule="auto"/>
+              <w:jc w:val="left"/>
+            </w:pPr>
+            <w:r>
+              <w:rPr>
+                <w:rFonts w:ascii="Arial" w:hAnsi="Arial"/>
+                <w:b w:val="0"/>
+                <w:color w:val="212529"/>
+                <w:sz w:val="18"/>
+              </w:rPr>
+              <w:t>S0 - Alineación y descubrimiento (semanas 1-2)</w:t>
+            </w:r>
+            <w:r>
+              <w:rPr>
+                <w:rFonts w:ascii="Arial" w:hAnsi="Arial" w:eastAsia="Calibri"/>
+                <w:b w:val="0"/>
+                <w:i w:val="0"/>
+                <w:color w:val="212529"/>
+                <w:sz w:val="18"/>
+                <w:lang w:val="es-CL"/>
+              </w:rPr>
+            </w:r>
+          </w:p>
+        </w:tc>
+      </w:tr>
+      <w:tr>
+        <w:trPr>
+          <w:cantSplit/>
+        </w:trPr>
+        <w:tc>
+          <w:tcPr>
+            <w:tcW w:type="dxa" w:w="1944"/>
+            <w:vAlign w:val="center"/>
+            <w:tcMar>
+              <w:top w:w="80" w:type="dxa"/>
+              <w:start w:w="95" w:type="dxa"/>
+              <w:bottom w:w="80" w:type="dxa"/>
+              <w:end w:w="95" w:type="dxa"/>
+            </w:tcMar>
+            <w:shd w:fill="F4F6F8" w:val="clear"/>
+          </w:tcPr>
+          <w:p>
+            <w:pPr>
+              <w:keepLines/>
+              <w:widowControl/>
+              <w:spacing w:before="0" w:after="0" w:line="240" w:lineRule="auto"/>
+              <w:jc w:val="left"/>
+            </w:pPr>
+            <w:r>
+              <w:rPr>
+                <w:rFonts w:ascii="Arial" w:hAnsi="Arial"/>
+                <w:b/>
+                <w:color w:val="142B45"/>
+                <w:sz w:val="18"/>
+              </w:rPr>
+              <w:t>Versión</w:t>
+            </w:r>
+            <w:r>
+              <w:rPr>
+                <w:rFonts w:ascii="Arial" w:hAnsi="Arial" w:eastAsia="Calibri"/>
+                <w:b/>
+                <w:i w:val="0"/>
+                <w:color w:val="142B45"/>
+                <w:sz w:val="18"/>
+                <w:lang w:val="es-CL"/>
+              </w:rPr>
+            </w:r>
+          </w:p>
+        </w:tc>
+        <w:tc>
+          <w:tcPr>
+            <w:tcW w:type="dxa" w:w="7632"/>
+            <w:vAlign w:val="center"/>
+            <w:tcMar>
+              <w:top w:w="80" w:type="dxa"/>
+              <w:start w:w="95" w:type="dxa"/>
+              <w:bottom w:w="80" w:type="dxa"/>
+              <w:end w:w="95" w:type="dxa"/>
+            </w:tcMar>
+            <w:shd w:fill="FBFCFD" w:val="clear"/>
+          </w:tcPr>
+          <w:p>
+            <w:pPr>
+              <w:keepLines/>
+              <w:widowControl/>
+              <w:spacing w:before="0" w:after="0" w:line="240" w:lineRule="auto"/>
+              <w:jc w:val="left"/>
+            </w:pPr>
+            <w:r>
+              <w:rPr>
+                <w:rFonts w:ascii="Arial" w:hAnsi="Arial"/>
+                <w:b w:val="0"/>
+                <w:color w:val="212529"/>
+                <w:sz w:val="18"/>
+              </w:rPr>
+              <w:t>1.1</w:t>
+            </w:r>
+            <w:r>
+              <w:rPr>
+                <w:rFonts w:ascii="Arial" w:hAnsi="Arial" w:eastAsia="Calibri"/>
+                <w:b w:val="0"/>
+                <w:i w:val="0"/>
+                <w:color w:val="212529"/>
+                <w:sz w:val="18"/>
+                <w:lang w:val="es-CL"/>
+              </w:rPr>
+            </w:r>
+          </w:p>
+        </w:tc>
+      </w:tr>
+      <w:tr>
+        <w:trPr>
+          <w:cantSplit/>
+        </w:trPr>
+        <w:tc>
+          <w:tcPr>
+            <w:tcW w:type="dxa" w:w="1944"/>
+            <w:vAlign w:val="center"/>
+            <w:tcMar>
+              <w:top w:w="80" w:type="dxa"/>
+              <w:start w:w="95" w:type="dxa"/>
+              <w:bottom w:w="80" w:type="dxa"/>
+              <w:end w:w="95" w:type="dxa"/>
+            </w:tcMar>
+            <w:shd w:fill="F4F6F8" w:val="clear"/>
+          </w:tcPr>
+          <w:p>
+            <w:pPr>
+              <w:keepLines/>
+              <w:widowControl/>
+              <w:spacing w:before="0" w:after="0" w:line="240" w:lineRule="auto"/>
+              <w:jc w:val="left"/>
+            </w:pPr>
+            <w:r>
+              <w:rPr>
+                <w:rFonts w:ascii="Arial" w:hAnsi="Arial"/>
+                <w:b/>
+                <w:color w:val="142B45"/>
+                <w:sz w:val="18"/>
+              </w:rPr>
+              <w:t>Seguimiento</w:t>
+            </w:r>
+            <w:r>
+              <w:rPr>
+                <w:rFonts w:ascii="Arial" w:hAnsi="Arial" w:eastAsia="Calibri"/>
+                <w:b/>
+                <w:i w:val="0"/>
+                <w:color w:val="142B45"/>
+                <w:sz w:val="18"/>
+                <w:lang w:val="es-CL"/>
+              </w:rPr>
+            </w:r>
+          </w:p>
+        </w:tc>
+        <w:tc>
+          <w:tcPr>
+            <w:tcW w:type="dxa" w:w="7632"/>
+            <w:vAlign w:val="center"/>
+            <w:tcMar>
+              <w:top w:w="80" w:type="dxa"/>
+              <w:start w:w="95" w:type="dxa"/>
+              <w:bottom w:w="80" w:type="dxa"/>
+              <w:end w:w="95" w:type="dxa"/>
+            </w:tcMar>
+            <w:shd w:fill="FBFCFD" w:val="clear"/>
+          </w:tcPr>
+          <w:p>
+            <w:pPr>
+              <w:keepLines/>
+              <w:widowControl/>
+              <w:spacing w:before="0" w:after="0" w:line="240" w:lineRule="auto"/>
+              <w:jc w:val="left"/>
+            </w:pPr>
+            <w:r>
+              <w:rPr>
+                <w:rFonts w:ascii="Arial" w:hAnsi="Arial"/>
+                <w:b w:val="0"/>
+                <w:color w:val="212529"/>
+                <w:sz w:val="18"/>
+              </w:rPr>
+              <w:t>Apertura del registro; no existen compromisos anteriores.</w:t>
+            </w:r>
+            <w:r>
+              <w:rPr>
+                <w:rFonts w:ascii="Arial" w:hAnsi="Arial" w:eastAsia="Calibri"/>
+                <w:b w:val="0"/>
+                <w:i w:val="0"/>
+                <w:color w:val="212529"/>
+                <w:sz w:val="18"/>
+                <w:lang w:val="es-CL"/>
+              </w:rPr>
+            </w:r>
+          </w:p>
+        </w:tc>
+      </w:tr>
     </w:tbl>
     <w:p>
       <w:pPr>
         <w:pStyle w:val="AlunzaSection"/>
+        <w:keepNext/>
+        <w:spacing w:before="120" w:after="60"/>
       </w:pPr>
       <w:r>
         <w:rPr>
@@ -545,6 +802,8 @@
     <w:p>
       <w:pPr>
         <w:pStyle w:val="AlunzaSection"/>
+        <w:keepNext/>
+        <w:spacing w:before="120" w:after="60"/>
       </w:pPr>
       <w:r>
         <w:rPr>
@@ -1006,6 +1265,8 @@
     <w:p>
       <w:pPr>
         <w:pStyle w:val="AlunzaSection"/>
+        <w:keepNext/>
+        <w:spacing w:before="120" w:after="60"/>
       </w:pPr>
       <w:r>
         <w:rPr>
@@ -1036,22 +1297,19 @@
       </w:pPr>
       <w:r>
         <w:rPr>
-          <w:rFonts w:ascii="Calibri" w:hAnsi="Calibri" w:eastAsia="Calibri"/>
+          <w:rFonts w:ascii="Arial" w:hAnsi="Arial"/>
           <w:b/>
-          <w:color w:val="0D7C78"/>
-          <w:sz w:val="20"/>
-          <w:lang w:val="es-CL"/>
+          <w:color w:val="008A8A"/>
         </w:rPr>
-        <w:t>•</w:t>
+        <w:t xml:space="preserve">•  </w:t>
       </w:r>
       <w:r>
         <w:rPr>
-          <w:rFonts w:ascii="Calibri" w:hAnsi="Calibri" w:eastAsia="Calibri"/>
-          <w:color w:val="222222"/>
-          <w:sz w:val="20"/>
-          <w:lang w:val="es-CL"/>
+          <w:rFonts w:ascii="Arial" w:hAnsi="Arial"/>
+          <w:b w:val="0"/>
+          <w:color w:val="212529"/>
         </w:rPr>
-        <w:t xml:space="preserve">  Fases, hitos y evidencias solicitadas para la asignatura CAPSTONE.</w:t>
+        <w:t>Fases, hitos y evidencias solicitadas para la asignatura CAPSTONE.</w:t>
       </w:r>
     </w:p>
     <w:p>
@@ -1062,22 +1320,19 @@
       </w:pPr>
       <w:r>
         <w:rPr>
-          <w:rFonts w:ascii="Calibri" w:hAnsi="Calibri" w:eastAsia="Calibri"/>
+          <w:rFonts w:ascii="Arial" w:hAnsi="Arial"/>
           <w:b/>
-          <w:color w:val="0D7C78"/>
-          <w:sz w:val="20"/>
-          <w:lang w:val="es-CL"/>
+          <w:color w:val="008A8A"/>
         </w:rPr>
-        <w:t>•</w:t>
+        <w:t xml:space="preserve">•  </w:t>
       </w:r>
       <w:r>
         <w:rPr>
-          <w:rFonts w:ascii="Calibri" w:hAnsi="Calibri" w:eastAsia="Calibri"/>
-          <w:color w:val="222222"/>
-          <w:sz w:val="20"/>
-          <w:lang w:val="es-CL"/>
+          <w:rFonts w:ascii="Arial" w:hAnsi="Arial"/>
+          <w:b w:val="0"/>
+          <w:color w:val="212529"/>
         </w:rPr>
-        <w:t xml:space="preserve">  Problema de seguimiento y retroalimentación en cursos de Programación I.</w:t>
+        <w:t>Problema de seguimiento y retroalimentación en cursos de Programación I.</w:t>
       </w:r>
     </w:p>
     <w:p>
@@ -1088,22 +1343,19 @@
       </w:pPr>
       <w:r>
         <w:rPr>
-          <w:rFonts w:ascii="Calibri" w:hAnsi="Calibri" w:eastAsia="Calibri"/>
+          <w:rFonts w:ascii="Arial" w:hAnsi="Arial"/>
           <w:b/>
-          <w:color w:val="0D7C78"/>
-          <w:sz w:val="20"/>
-          <w:lang w:val="es-CL"/>
+          <w:color w:val="008A8A"/>
         </w:rPr>
-        <w:t>•</w:t>
+        <w:t xml:space="preserve">•  </w:t>
       </w:r>
       <w:r>
         <w:rPr>
-          <w:rFonts w:ascii="Calibri" w:hAnsi="Calibri" w:eastAsia="Calibri"/>
-          <w:color w:val="222222"/>
-          <w:sz w:val="20"/>
-          <w:lang w:val="es-CL"/>
+          <w:rFonts w:ascii="Arial" w:hAnsi="Arial"/>
+          <w:b w:val="0"/>
+          <w:color w:val="212529"/>
         </w:rPr>
-        <w:t xml:space="preserve">  Conformación del equipo, responsabilidades operativas y revisión cruzada.</w:t>
+        <w:t>Conformación del equipo, responsabilidades operativas y revisión cruzada.</w:t>
       </w:r>
     </w:p>
     <w:p>
@@ -1114,27 +1366,26 @@
       </w:pPr>
       <w:r>
         <w:rPr>
-          <w:rFonts w:ascii="Calibri" w:hAnsi="Calibri" w:eastAsia="Calibri"/>
+          <w:rFonts w:ascii="Arial" w:hAnsi="Arial"/>
           <w:b/>
-          <w:color w:val="0D7C78"/>
-          <w:sz w:val="20"/>
-          <w:lang w:val="es-CL"/>
+          <w:color w:val="008A8A"/>
         </w:rPr>
-        <w:t>•</w:t>
+        <w:t xml:space="preserve">•  </w:t>
       </w:r>
       <w:r>
         <w:rPr>
-          <w:rFonts w:ascii="Calibri" w:hAnsi="Calibri" w:eastAsia="Calibri"/>
-          <w:color w:val="222222"/>
-          <w:sz w:val="20"/>
-          <w:lang w:val="es-CL"/>
+          <w:rFonts w:ascii="Arial" w:hAnsi="Arial"/>
+          <w:b w:val="0"/>
+          <w:color w:val="212529"/>
         </w:rPr>
-        <w:t xml:space="preserve">  Uso de Scrum ligero, control de versiones y registro periódico de avances en los artefactos del proyecto.</w:t>
+        <w:t>Uso de Scrum ligero, control de versiones y registro periódico de avances en los artefactos del proyecto.</w:t>
       </w:r>
     </w:p>
     <w:p>
       <w:pPr>
         <w:pStyle w:val="AlunzaSection"/>
+        <w:keepNext/>
+        <w:spacing w:before="120" w:after="60"/>
       </w:pPr>
       <w:r>
         <w:rPr>
@@ -1183,6 +1434,8 @@
     <w:p>
       <w:pPr>
         <w:pStyle w:val="AlunzaSection"/>
+        <w:keepNext/>
+        <w:spacing w:before="120" w:after="60"/>
       </w:pPr>
       <w:r>
         <w:rPr>
@@ -1512,6 +1765,8 @@
     <w:p>
       <w:pPr>
         <w:pStyle w:val="AlunzaSection"/>
+        <w:keepNext/>
+        <w:spacing w:before="120" w:after="60"/>
       </w:pPr>
       <w:r>
         <w:rPr>
@@ -1579,17 +1834,23 @@
               <w:spacing w:before="0" w:after="0" w:line="240" w:lineRule="auto"/>
               <w:jc w:val="left"/>
             </w:pPr>
-            <w:r/>
             <w:r>
               <w:rPr>
-                <w:rFonts w:ascii="Calibri" w:hAnsi="Calibri" w:eastAsia="Calibri"/>
+                <w:rFonts w:ascii="Arial" w:hAnsi="Arial"/>
+                <w:b/>
+                <w:color w:val="FFFFFF"/>
+              </w:rPr>
+              <w:t>ID y actividad comprometida</w:t>
+            </w:r>
+            <w:r>
+              <w:rPr>
+                <w:rFonts w:ascii="Arial" w:hAnsi="Arial" w:eastAsia="Calibri"/>
                 <w:b/>
                 <w:i w:val="0"/>
                 <w:color w:val="FFFFFF"/>
                 <w:sz w:val="18"/>
                 <w:lang w:val="es-CL"/>
               </w:rPr>
-              <w:t>Actividad comprometida</w:t>
             </w:r>
           </w:p>
         </w:tc>
@@ -1683,7 +1944,9 @@
               <w:spacing w:before="0" w:after="0" w:line="240" w:lineRule="auto"/>
               <w:jc w:val="left"/>
             </w:pPr>
-            <w:r/>
+            <w:r>
+              <w:t>C-001 · Redactar una visión inicial del producto y un mapa breve del problema.</w:t>
+            </w:r>
             <w:r>
               <w:rPr>
                 <w:rFonts w:ascii="Calibri" w:hAnsi="Calibri" w:eastAsia="Calibri"/>
@@ -1693,7 +1956,6 @@
                 <w:sz w:val="18"/>
                 <w:lang w:val="es-CL"/>
               </w:rPr>
-              <w:t>Redactar una visión inicial del producto y un mapa breve del problema.</w:t>
             </w:r>
           </w:p>
         </w:tc>
@@ -1786,7 +2048,9 @@
               <w:spacing w:before="0" w:after="0" w:line="240" w:lineRule="auto"/>
               <w:jc w:val="left"/>
             </w:pPr>
-            <w:r/>
+            <w:r>
+              <w:t>C-002 · Construir una matriz de entregables y restricciones de CAPSTONE.</w:t>
+            </w:r>
             <w:r>
               <w:rPr>
                 <w:rFonts w:ascii="Calibri" w:hAnsi="Calibri" w:eastAsia="Calibri"/>
@@ -1796,7 +2060,6 @@
                 <w:sz w:val="18"/>
                 <w:lang w:val="es-CL"/>
               </w:rPr>
-              <w:t>Construir una matriz de entregables y restricciones de CAPSTONE.</w:t>
             </w:r>
           </w:p>
         </w:tc>
@@ -1888,7 +2151,9 @@
               <w:spacing w:before="0" w:after="0" w:line="240" w:lineRule="auto"/>
               <w:jc w:val="left"/>
             </w:pPr>
-            <w:r/>
+            <w:r>
+              <w:t>C-003 · Proponer riesgos de datos e IA/RAG, criterios iniciales de calidad y spikes técnicos.</w:t>
+            </w:r>
             <w:r>
               <w:rPr>
                 <w:rFonts w:ascii="Calibri" w:hAnsi="Calibri" w:eastAsia="Calibri"/>
@@ -1898,7 +2163,6 @@
                 <w:sz w:val="18"/>
                 <w:lang w:val="es-CL"/>
               </w:rPr>
-              <w:t>Proponer riesgos de datos e IA/RAG, criterios iniciales de calidad y spikes técnicos.</w:t>
             </w:r>
           </w:p>
         </w:tc>
@@ -1973,6 +2237,8 @@
     <w:p>
       <w:pPr>
         <w:pStyle w:val="AlunzaSection"/>
+        <w:keepNext/>
+        <w:spacing w:before="120" w:after="60"/>
       </w:pPr>
       <w:r>
         <w:rPr>
@@ -2003,22 +2269,19 @@
       </w:pPr>
       <w:r>
         <w:rPr>
-          <w:rFonts w:ascii="Calibri" w:hAnsi="Calibri" w:eastAsia="Calibri"/>
+          <w:rFonts w:ascii="Arial" w:hAnsi="Arial"/>
           <w:b/>
-          <w:color w:val="0D7C78"/>
-          <w:sz w:val="20"/>
-          <w:lang w:val="es-CL"/>
+          <w:color w:val="008A8A"/>
         </w:rPr>
-        <w:t>•</w:t>
+        <w:t xml:space="preserve">•  </w:t>
       </w:r>
       <w:r>
         <w:rPr>
-          <w:rFonts w:ascii="Calibri" w:hAnsi="Calibri" w:eastAsia="Calibri"/>
-          <w:color w:val="222222"/>
-          <w:sz w:val="20"/>
-          <w:lang w:val="es-CL"/>
+          <w:rFonts w:ascii="Arial" w:hAnsi="Arial"/>
+          <w:b w:val="0"/>
+          <w:color w:val="212529"/>
         </w:rPr>
-        <w:t xml:space="preserve">  Alcance todavía amplio y responsabilidades aún no contrastadas con la carga real de cada integrante.</w:t>
+        <w:t>Alcance todavía amplio y responsabilidades aún no contrastadas con la carga real de cada integrante.</w:t>
       </w:r>
     </w:p>
     <w:p>
@@ -2029,27 +2292,26 @@
       </w:pPr>
       <w:r>
         <w:rPr>
-          <w:rFonts w:ascii="Calibri" w:hAnsi="Calibri" w:eastAsia="Calibri"/>
+          <w:rFonts w:ascii="Arial" w:hAnsi="Arial"/>
           <w:b/>
-          <w:color w:val="0D7C78"/>
-          <w:sz w:val="20"/>
-          <w:lang w:val="es-CL"/>
+          <w:color w:val="008A8A"/>
         </w:rPr>
-        <w:t>•</w:t>
+        <w:t xml:space="preserve">•  </w:t>
       </w:r>
       <w:r>
         <w:rPr>
-          <w:rFonts w:ascii="Calibri" w:hAnsi="Calibri" w:eastAsia="Calibri"/>
-          <w:color w:val="222222"/>
-          <w:sz w:val="20"/>
-          <w:lang w:val="es-CL"/>
+          <w:rFonts w:ascii="Arial" w:hAnsi="Arial"/>
+          <w:b w:val="0"/>
+          <w:color w:val="212529"/>
         </w:rPr>
-        <w:t xml:space="preserve">  Riesgo de describir una solución genérica de IA sin una vertical técnica verificable.</w:t>
+        <w:t>Riesgo de describir una solución genérica de IA sin una vertical técnica verificable.</w:t>
       </w:r>
     </w:p>
     <w:p>
       <w:pPr>
         <w:pStyle w:val="AlunzaSection"/>
+        <w:keepNext/>
+        <w:spacing w:before="120" w:after="60"/>
       </w:pPr>
       <w:r>
         <w:rPr>
@@ -2287,7 +2549,7 @@
                 <w:sz w:val="18"/>
                 <w:lang w:val="es-CL"/>
               </w:rPr>
-              <w:t>Observación: Los acuerdos, responsables y fechas consignados en esta minuta fueron revisados y aprobados por el equipo Alunza.</w:t>
+              <w:t>Observación: los acuerdos y estados fueron revisados internamente por el equipo Alunza. Los cierres corresponden a definición o documentación y no implican software implementado.</w:t>
             </w:r>
             <w:r>
               <w:rPr>
@@ -2296,7 +2558,6 @@
                 <w:sz w:val="18"/>
                 <w:lang w:val="es-CL"/>
               </w:rPr>
-              <w:t/>
             </w:r>
           </w:p>
         </w:tc>
@@ -2736,7 +2997,6 @@
   <w:style w:type="paragraph" w:default="1" w:styleId="Normal">
     <w:name w:val="Normal"/>
     <w:qFormat/>
-    <w:rsid w:val="00FC693F"/>
     <w:pPr>
       <w:widowControl/>
       <w:spacing w:after="80" w:line="259" w:lineRule="auto"/>
@@ -2753,7 +3013,6 @@
     <w:link w:val="HeaderChar"/>
     <w:uiPriority w:val="99"/>
     <w:unhideWhenUsed/>
-    <w:rsid w:val="00E618BF"/>
     <w:pPr>
       <w:tabs>
         <w:tab w:val="center" w:pos="4680"/>
@@ -2767,7 +3026,6 @@
     <w:basedOn w:val="DefaultParagraphFont"/>
     <w:link w:val="Header"/>
     <w:uiPriority w:val="99"/>
-    <w:rsid w:val="00E618BF"/>
   </w:style>
   <w:style w:type="paragraph" w:styleId="Footer">
     <w:name w:val="footer"/>
@@ -2775,7 +3033,6 @@
     <w:link w:val="FooterChar"/>
     <w:uiPriority w:val="99"/>
     <w:unhideWhenUsed/>
-    <w:rsid w:val="00E618BF"/>
     <w:pPr>
       <w:tabs>
         <w:tab w:val="center" w:pos="4680"/>
@@ -2789,7 +3046,6 @@
     <w:basedOn w:val="DefaultParagraphFont"/>
     <w:link w:val="Footer"/>
     <w:uiPriority w:val="99"/>
-    <w:rsid w:val="00E618BF"/>
   </w:style>
   <w:style w:type="paragraph" w:styleId="Heading1">
     <w:name w:val="heading 1"/>
@@ -2798,7 +3054,6 @@
     <w:link w:val="Heading1Char"/>
     <w:uiPriority w:val="9"/>
     <w:qFormat/>
-    <w:rsid w:val="00FC693F"/>
     <w:pPr>
       <w:keepNext/>
       <w:keepLines/>
@@ -2822,7 +3077,6 @@
     <w:uiPriority w:val="9"/>
     <w:unhideWhenUsed/>
     <w:qFormat/>
-    <w:rsid w:val="00FC693F"/>
     <w:pPr>
       <w:keepNext/>
       <w:keepLines/>
@@ -2846,7 +3100,6 @@
     <w:uiPriority w:val="9"/>
     <w:unhideWhenUsed/>
     <w:qFormat/>
-    <w:rsid w:val="00FC693F"/>
     <w:pPr>
       <w:keepNext/>
       <w:keepLines/>
@@ -2869,7 +3122,6 @@
     <w:semiHidden/>
     <w:unhideWhenUsed/>
     <w:qFormat/>
-    <w:rsid w:val="00FC693F"/>
     <w:pPr>
       <w:keepNext/>
       <w:keepLines/>
@@ -2894,7 +3146,6 @@
     <w:semiHidden/>
     <w:unhideWhenUsed/>
     <w:qFormat/>
-    <w:rsid w:val="00FC693F"/>
     <w:pPr>
       <w:keepNext/>
       <w:keepLines/>
@@ -2915,7 +3166,6 @@
     <w:semiHidden/>
     <w:unhideWhenUsed/>
     <w:qFormat/>
-    <w:rsid w:val="00FC693F"/>
     <w:pPr>
       <w:keepNext/>
       <w:keepLines/>
@@ -2938,7 +3188,6 @@
     <w:semiHidden/>
     <w:unhideWhenUsed/>
     <w:qFormat/>
-    <w:rsid w:val="00FC693F"/>
     <w:pPr>
       <w:keepNext/>
       <w:keepLines/>
@@ -2961,7 +3210,6 @@
     <w:semiHidden/>
     <w:unhideWhenUsed/>
     <w:qFormat/>
-    <w:rsid w:val="00FC693F"/>
     <w:pPr>
       <w:keepNext/>
       <w:keepLines/>
@@ -2984,7 +3232,6 @@
     <w:semiHidden/>
     <w:unhideWhenUsed/>
     <w:qFormat/>
-    <w:rsid w:val="00FC693F"/>
     <w:pPr>
       <w:keepNext/>
       <w:keepLines/>
@@ -3031,7 +3278,6 @@
     <w:name w:val="No Spacing"/>
     <w:uiPriority w:val="1"/>
     <w:qFormat/>
-    <w:rsid w:val="00FC693F"/>
     <w:pPr>
       <w:spacing w:after="0" w:line="240" w:lineRule="auto"/>
     </w:pPr>
@@ -3041,7 +3287,6 @@
     <w:basedOn w:val="DefaultParagraphFont"/>
     <w:link w:val="Heading1"/>
     <w:uiPriority w:val="9"/>
-    <w:rsid w:val="00FC693F"/>
     <w:rPr>
       <w:rFonts w:asciiTheme="majorHAnsi" w:eastAsiaTheme="majorEastAsia" w:hAnsiTheme="majorHAnsi" w:cstheme="majorBidi"/>
       <w:b/>
@@ -3056,7 +3301,6 @@
     <w:basedOn w:val="DefaultParagraphFont"/>
     <w:link w:val="Heading2"/>
     <w:uiPriority w:val="9"/>
-    <w:rsid w:val="00FC693F"/>
     <w:rPr>
       <w:rFonts w:asciiTheme="majorHAnsi" w:eastAsiaTheme="majorEastAsia" w:hAnsiTheme="majorHAnsi" w:cstheme="majorBidi"/>
       <w:b/>
@@ -3071,7 +3315,6 @@
     <w:basedOn w:val="DefaultParagraphFont"/>
     <w:link w:val="Heading3"/>
     <w:uiPriority w:val="9"/>
-    <w:rsid w:val="00FC693F"/>
     <w:rPr>
       <w:rFonts w:asciiTheme="majorHAnsi" w:eastAsiaTheme="majorEastAsia" w:hAnsiTheme="majorHAnsi" w:cstheme="majorBidi"/>
       <w:b/>
@@ -3086,7 +3329,6 @@
     <w:link w:val="TitleChar"/>
     <w:uiPriority w:val="10"/>
     <w:qFormat/>
-    <w:rsid w:val="00FC693F"/>
     <w:pPr>
       <w:pBdr>
         <w:bottom w:val="single" w:sz="8" w:space="4" w:color="4F81BD" w:themeColor="accent1"/>
@@ -3108,7 +3350,6 @@
     <w:basedOn w:val="DefaultParagraphFont"/>
     <w:link w:val="Title"/>
     <w:uiPriority w:val="10"/>
-    <w:rsid w:val="00FC693F"/>
     <w:rPr>
       <w:rFonts w:asciiTheme="majorHAnsi" w:eastAsiaTheme="majorEastAsia" w:hAnsiTheme="majorHAnsi" w:cstheme="majorBidi"/>
       <w:color w:val="17365D" w:themeColor="text2" w:themeShade="BF"/>
@@ -3125,7 +3366,6 @@
     <w:link w:val="SubtitleChar"/>
     <w:uiPriority w:val="11"/>
     <w:qFormat/>
-    <w:rsid w:val="00FC693F"/>
     <w:pPr>
       <w:numPr>
         <w:ilvl w:val="1"/>
@@ -3146,7 +3386,6 @@
     <w:basedOn w:val="DefaultParagraphFont"/>
     <w:link w:val="Subtitle"/>
     <w:uiPriority w:val="11"/>
-    <w:rsid w:val="00FC693F"/>
     <w:rPr>
       <w:rFonts w:asciiTheme="majorHAnsi" w:eastAsiaTheme="majorEastAsia" w:hAnsiTheme="majorHAnsi" w:cstheme="majorBidi"/>
       <w:i/>
@@ -3162,7 +3401,6 @@
     <w:basedOn w:val="Normal"/>
     <w:uiPriority w:val="34"/>
     <w:qFormat/>
-    <w:rsid w:val="00FC693F"/>
     <w:pPr>
       <w:ind w:left="720"/>
       <w:contextualSpacing/>
@@ -3174,7 +3412,6 @@
     <w:link w:val="BodyTextChar"/>
     <w:uiPriority w:val="99"/>
     <w:unhideWhenUsed/>
-    <w:rsid w:val="00AA1D8D"/>
     <w:pPr>
       <w:spacing w:after="120"/>
     </w:pPr>
@@ -3184,7 +3421,6 @@
     <w:basedOn w:val="DefaultParagraphFont"/>
     <w:link w:val="BodyText"/>
     <w:uiPriority w:val="99"/>
-    <w:rsid w:val="00AA1D8D"/>
   </w:style>
   <w:style w:type="paragraph" w:styleId="BodyText2">
     <w:name w:val="Body Text 2"/>
@@ -3192,7 +3428,6 @@
     <w:link w:val="BodyText2Char"/>
     <w:uiPriority w:val="99"/>
     <w:unhideWhenUsed/>
-    <w:rsid w:val="00AA1D8D"/>
     <w:pPr>
       <w:spacing w:after="120" w:line="480" w:lineRule="auto"/>
     </w:pPr>
@@ -3202,7 +3437,6 @@
     <w:basedOn w:val="DefaultParagraphFont"/>
     <w:link w:val="BodyText2"/>
     <w:uiPriority w:val="99"/>
-    <w:rsid w:val="00AA1D8D"/>
   </w:style>
   <w:style w:type="paragraph" w:styleId="BodyText3">
     <w:name w:val="Body Text 3"/>
@@ -3210,7 +3444,6 @@
     <w:link w:val="BodyText3Char"/>
     <w:uiPriority w:val="99"/>
     <w:unhideWhenUsed/>
-    <w:rsid w:val="00AA1D8D"/>
     <w:pPr>
       <w:spacing w:after="120"/>
     </w:pPr>
@@ -3224,7 +3457,6 @@
     <w:basedOn w:val="DefaultParagraphFont"/>
     <w:link w:val="BodyText3"/>
     <w:uiPriority w:val="99"/>
-    <w:rsid w:val="00AA1D8D"/>
     <w:rPr>
       <w:sz w:val="16"/>
       <w:szCs w:val="16"/>
@@ -3235,7 +3467,6 @@
     <w:basedOn w:val="Normal"/>
     <w:uiPriority w:val="99"/>
     <w:unhideWhenUsed/>
-    <w:rsid w:val="00AA1D8D"/>
     <w:pPr>
       <w:ind w:left="360" w:hanging="360"/>
       <w:contextualSpacing/>
@@ -3246,7 +3477,6 @@
     <w:basedOn w:val="Normal"/>
     <w:uiPriority w:val="99"/>
     <w:unhideWhenUsed/>
-    <w:rsid w:val="00326F90"/>
     <w:pPr>
       <w:ind w:left="720" w:hanging="360"/>
       <w:contextualSpacing/>
@@ -3257,7 +3487,6 @@
     <w:basedOn w:val="Normal"/>
     <w:uiPriority w:val="99"/>
     <w:unhideWhenUsed/>
-    <w:rsid w:val="00326F90"/>
     <w:pPr>
       <w:ind w:left="1080" w:hanging="360"/>
       <w:contextualSpacing/>
@@ -3268,7 +3497,6 @@
     <w:basedOn w:val="Normal"/>
     <w:uiPriority w:val="99"/>
     <w:unhideWhenUsed/>
-    <w:rsid w:val="00326F90"/>
     <w:pPr>
       <w:numPr>
         <w:numId w:val="1"/>
@@ -3281,7 +3509,6 @@
     <w:basedOn w:val="Normal"/>
     <w:uiPriority w:val="99"/>
     <w:unhideWhenUsed/>
-    <w:rsid w:val="00326F90"/>
     <w:pPr>
       <w:numPr>
         <w:numId w:val="2"/>
@@ -3294,7 +3521,6 @@
     <w:basedOn w:val="Normal"/>
     <w:uiPriority w:val="99"/>
     <w:unhideWhenUsed/>
-    <w:rsid w:val="00326F90"/>
     <w:pPr>
       <w:numPr>
         <w:numId w:val="3"/>
@@ -3307,7 +3533,6 @@
     <w:basedOn w:val="Normal"/>
     <w:uiPriority w:val="99"/>
     <w:unhideWhenUsed/>
-    <w:rsid w:val="00326F90"/>
     <w:pPr>
       <w:numPr>
         <w:numId w:val="5"/>
@@ -3320,7 +3545,6 @@
     <w:basedOn w:val="Normal"/>
     <w:uiPriority w:val="99"/>
     <w:unhideWhenUsed/>
-    <w:rsid w:val="0029639D"/>
     <w:pPr>
       <w:numPr>
         <w:numId w:val="6"/>
@@ -3333,7 +3557,6 @@
     <w:basedOn w:val="Normal"/>
     <w:uiPriority w:val="99"/>
     <w:unhideWhenUsed/>
-    <w:rsid w:val="0029639D"/>
     <w:pPr>
       <w:numPr>
         <w:numId w:val="7"/>
@@ -3346,7 +3569,6 @@
     <w:basedOn w:val="Normal"/>
     <w:uiPriority w:val="99"/>
     <w:unhideWhenUsed/>
-    <w:rsid w:val="0029639D"/>
     <w:pPr>
       <w:spacing w:after="120"/>
       <w:ind w:left="360"/>
@@ -3358,7 +3580,6 @@
     <w:basedOn w:val="Normal"/>
     <w:uiPriority w:val="99"/>
     <w:unhideWhenUsed/>
-    <w:rsid w:val="0029639D"/>
     <w:pPr>
       <w:spacing w:after="120"/>
       <w:ind w:left="720"/>
@@ -3370,7 +3591,6 @@
     <w:basedOn w:val="Normal"/>
     <w:uiPriority w:val="99"/>
     <w:unhideWhenUsed/>
-    <w:rsid w:val="0029639D"/>
     <w:pPr>
       <w:spacing w:after="120"/>
       <w:ind w:left="1080"/>
@@ -3382,7 +3602,6 @@
     <w:link w:val="MacroTextChar"/>
     <w:uiPriority w:val="99"/>
     <w:unhideWhenUsed/>
-    <w:rsid w:val="0029639D"/>
     <w:pPr>
       <w:tabs>
         <w:tab w:val="left" w:pos="576"/>
@@ -3405,7 +3624,6 @@
     <w:basedOn w:val="DefaultParagraphFont"/>
     <w:link w:val="MacroText"/>
     <w:uiPriority w:val="99"/>
-    <w:rsid w:val="0029639D"/>
     <w:rPr>
       <w:rFonts w:ascii="Courier" w:hAnsi="Courier"/>
       <w:sz w:val="20"/>
@@ -3419,7 +3637,6 @@
     <w:link w:val="QuoteChar"/>
     <w:uiPriority w:val="29"/>
     <w:qFormat/>
-    <w:rsid w:val="00FC693F"/>
     <w:rPr>
       <w:i/>
       <w:iCs/>
@@ -3431,7 +3648,6 @@
     <w:basedOn w:val="DefaultParagraphFont"/>
     <w:link w:val="Quote"/>
     <w:uiPriority w:val="29"/>
-    <w:rsid w:val="00FC693F"/>
     <w:rPr>
       <w:i/>
       <w:iCs/>
@@ -3444,7 +3660,6 @@
     <w:link w:val="Heading4"/>
     <w:uiPriority w:val="9"/>
     <w:semiHidden/>
-    <w:rsid w:val="00FC693F"/>
     <w:rPr>
       <w:rFonts w:asciiTheme="majorHAnsi" w:eastAsiaTheme="majorEastAsia" w:hAnsiTheme="majorHAnsi" w:cstheme="majorBidi"/>
       <w:b/>
@@ -3460,7 +3675,6 @@
     <w:link w:val="Heading5"/>
     <w:uiPriority w:val="9"/>
     <w:semiHidden/>
-    <w:rsid w:val="00FC693F"/>
     <w:rPr>
       <w:rFonts w:asciiTheme="majorHAnsi" w:eastAsiaTheme="majorEastAsia" w:hAnsiTheme="majorHAnsi" w:cstheme="majorBidi"/>
       <w:color w:val="243F60" w:themeColor="accent1" w:themeShade="7F"/>
@@ -3472,7 +3686,6 @@
     <w:link w:val="Heading6"/>
     <w:uiPriority w:val="9"/>
     <w:semiHidden/>
-    <w:rsid w:val="00FC693F"/>
     <w:rPr>
       <w:rFonts w:asciiTheme="majorHAnsi" w:eastAsiaTheme="majorEastAsia" w:hAnsiTheme="majorHAnsi" w:cstheme="majorBidi"/>
       <w:i/>
@@ -3486,7 +3699,6 @@
     <w:link w:val="Heading7"/>
     <w:uiPriority w:val="9"/>
     <w:semiHidden/>
-    <w:rsid w:val="00FC693F"/>
     <w:rPr>
       <w:rFonts w:asciiTheme="majorHAnsi" w:eastAsiaTheme="majorEastAsia" w:hAnsiTheme="majorHAnsi" w:cstheme="majorBidi"/>
       <w:i/>
@@ -3500,7 +3712,6 @@
     <w:link w:val="Heading8"/>
     <w:uiPriority w:val="9"/>
     <w:semiHidden/>
-    <w:rsid w:val="00FC693F"/>
     <w:rPr>
       <w:rFonts w:asciiTheme="majorHAnsi" w:eastAsiaTheme="majorEastAsia" w:hAnsiTheme="majorHAnsi" w:cstheme="majorBidi"/>
       <w:color w:val="4F81BD" w:themeColor="accent1"/>
@@ -3514,7 +3725,6 @@
     <w:link w:val="Heading9"/>
     <w:uiPriority w:val="9"/>
     <w:semiHidden/>
-    <w:rsid w:val="00FC693F"/>
     <w:rPr>
       <w:rFonts w:asciiTheme="majorHAnsi" w:eastAsiaTheme="majorEastAsia" w:hAnsiTheme="majorHAnsi" w:cstheme="majorBidi"/>
       <w:i/>
@@ -3532,7 +3742,6 @@
     <w:semiHidden/>
     <w:unhideWhenUsed/>
     <w:qFormat/>
-    <w:rsid w:val="00FC693F"/>
     <w:pPr>
       <w:spacing w:line="240" w:lineRule="auto"/>
     </w:pPr>
@@ -3549,7 +3758,6 @@
     <w:basedOn w:val="DefaultParagraphFont"/>
     <w:uiPriority w:val="22"/>
     <w:qFormat/>
-    <w:rsid w:val="00FC693F"/>
     <w:rPr>
       <w:b/>
       <w:bCs/>
@@ -3560,7 +3768,6 @@
     <w:basedOn w:val="DefaultParagraphFont"/>
     <w:uiPriority w:val="20"/>
     <w:qFormat/>
-    <w:rsid w:val="00FC693F"/>
     <w:rPr>
       <w:i/>
       <w:iCs/>
@@ -3573,7 +3780,6 @@
     <w:link w:val="IntenseQuoteChar"/>
     <w:uiPriority w:val="30"/>
     <w:qFormat/>
-    <w:rsid w:val="00FC693F"/>
     <w:pPr>
       <w:pBdr>
         <w:bottom w:val="single" w:sz="4" w:space="4" w:color="4F81BD" w:themeColor="accent1"/>
@@ -3594,7 +3800,6 @@
     <w:basedOn w:val="DefaultParagraphFont"/>
     <w:link w:val="IntenseQuote"/>
     <w:uiPriority w:val="30"/>
-    <w:rsid w:val="00FC693F"/>
     <w:rPr>
       <w:b/>
       <w:bCs/>
@@ -3608,7 +3813,6 @@
     <w:basedOn w:val="DefaultParagraphFont"/>
     <w:uiPriority w:val="19"/>
     <w:qFormat/>
-    <w:rsid w:val="00FC693F"/>
     <w:rPr>
       <w:i/>
       <w:iCs/>
@@ -3620,7 +3824,6 @@
     <w:basedOn w:val="DefaultParagraphFont"/>
     <w:uiPriority w:val="21"/>
     <w:qFormat/>
-    <w:rsid w:val="00FC693F"/>
     <w:rPr>
       <w:b/>
       <w:bCs/>
@@ -3634,7 +3837,6 @@
     <w:basedOn w:val="DefaultParagraphFont"/>
     <w:uiPriority w:val="31"/>
     <w:qFormat/>
-    <w:rsid w:val="00FC693F"/>
     <w:rPr>
       <w:smallCaps/>
       <w:color w:val="C0504D" w:themeColor="accent2"/>
@@ -3646,7 +3848,6 @@
     <w:basedOn w:val="DefaultParagraphFont"/>
     <w:uiPriority w:val="32"/>
     <w:qFormat/>
-    <w:rsid w:val="00FC693F"/>
     <w:rPr>
       <w:b/>
       <w:bCs/>
@@ -3661,7 +3862,6 @@
     <w:basedOn w:val="DefaultParagraphFont"/>
     <w:uiPriority w:val="33"/>
     <w:qFormat/>
-    <w:rsid w:val="00FC693F"/>
     <w:rPr>
       <w:b/>
       <w:bCs/>
@@ -3677,7 +3877,6 @@
     <w:semiHidden/>
     <w:unhideWhenUsed/>
     <w:qFormat/>
-    <w:rsid w:val="00FC693F"/>
     <w:pPr>
       <w:outlineLvl w:val="9"/>
     </w:pPr>
@@ -3686,7 +3885,6 @@
     <w:name w:val="Table Grid"/>
     <w:basedOn w:val="TableNormal"/>
     <w:uiPriority w:val="59"/>
-    <w:rsid w:val="00FC693F"/>
     <w:pPr>
       <w:spacing w:after="0" w:line="240" w:lineRule="auto"/>
     </w:pPr>
@@ -3712,7 +3910,6 @@
     <w:name w:val="Light Shading"/>
     <w:basedOn w:val="TableNormal"/>
     <w:uiPriority w:val="60"/>
-    <w:rsid w:val="00FC693F"/>
     <w:pPr>
       <w:spacing w:after="0" w:line="240" w:lineRule="auto"/>
     </w:pPr>
@@ -3815,7 +4012,6 @@
     <w:name w:val="Light Shading Accent 1"/>
     <w:basedOn w:val="TableNormal"/>
     <w:uiPriority w:val="60"/>
-    <w:rsid w:val="00FC693F"/>
     <w:pPr>
       <w:spacing w:after="0" w:line="240" w:lineRule="auto"/>
     </w:pPr>
@@ -3918,7 +4114,6 @@
     <w:name w:val="Light Shading Accent 2"/>
     <w:basedOn w:val="TableNormal"/>
     <w:uiPriority w:val="60"/>
-    <w:rsid w:val="00FC693F"/>
     <w:pPr>
       <w:spacing w:after="0" w:line="240" w:lineRule="auto"/>
     </w:pPr>
@@ -4021,7 +4216,6 @@
     <w:name w:val="Light Shading Accent 3"/>
     <w:basedOn w:val="TableNormal"/>
     <w:uiPriority w:val="60"/>
-    <w:rsid w:val="00FC693F"/>
     <w:pPr>
       <w:spacing w:after="0" w:line="240" w:lineRule="auto"/>
     </w:pPr>
@@ -4124,7 +4318,6 @@
     <w:name w:val="Light Shading Accent 4"/>
     <w:basedOn w:val="TableNormal"/>
     <w:uiPriority w:val="60"/>
-    <w:rsid w:val="00FC693F"/>
     <w:pPr>
       <w:spacing w:after="0" w:line="240" w:lineRule="auto"/>
     </w:pPr>
@@ -4227,7 +4420,6 @@
     <w:name w:val="Light Shading Accent 5"/>
     <w:basedOn w:val="TableNormal"/>
     <w:uiPriority w:val="60"/>
-    <w:rsid w:val="00FC693F"/>
     <w:pPr>
       <w:spacing w:after="0" w:line="240" w:lineRule="auto"/>
     </w:pPr>
@@ -4330,7 +4522,6 @@
     <w:name w:val="Light Shading Accent 6"/>
     <w:basedOn w:val="TableNormal"/>
     <w:uiPriority w:val="60"/>
-    <w:rsid w:val="00FC693F"/>
     <w:pPr>
       <w:spacing w:after="0" w:line="240" w:lineRule="auto"/>
     </w:pPr>
@@ -4433,7 +4624,6 @@
     <w:name w:val="Light List"/>
     <w:basedOn w:val="TableNormal"/>
     <w:uiPriority w:val="61"/>
-    <w:rsid w:val="00FC693F"/>
     <w:pPr>
       <w:spacing w:after="0" w:line="240" w:lineRule="auto"/>
     </w:pPr>
@@ -4525,7 +4715,6 @@
     <w:name w:val="Light List Accent 1"/>
     <w:basedOn w:val="TableNormal"/>
     <w:uiPriority w:val="61"/>
-    <w:rsid w:val="00FC693F"/>
     <w:pPr>
       <w:spacing w:after="0" w:line="240" w:lineRule="auto"/>
     </w:pPr>
@@ -4617,7 +4806,6 @@
     <w:name w:val="Light List Accent 2"/>
     <w:basedOn w:val="TableNormal"/>
     <w:uiPriority w:val="61"/>
-    <w:rsid w:val="00CB0664"/>
     <w:pPr>
       <w:spacing w:after="0" w:line="240" w:lineRule="auto"/>
     </w:pPr>
@@ -4709,7 +4897,6 @@
     <w:name w:val="Light List Accent 3"/>
     <w:basedOn w:val="TableNormal"/>
     <w:uiPriority w:val="61"/>
-    <w:rsid w:val="00CB0664"/>
     <w:pPr>
       <w:spacing w:after="0" w:line="240" w:lineRule="auto"/>
     </w:pPr>
@@ -4801,7 +4988,6 @@
     <w:name w:val="Light List Accent 4"/>
     <w:basedOn w:val="TableNormal"/>
     <w:uiPriority w:val="61"/>
-    <w:rsid w:val="00CB0664"/>
     <w:pPr>
       <w:spacing w:after="0" w:line="240" w:lineRule="auto"/>
     </w:pPr>
@@ -4893,7 +5079,6 @@
     <w:name w:val="Light List Accent 5"/>
     <w:basedOn w:val="TableNormal"/>
     <w:uiPriority w:val="61"/>
-    <w:rsid w:val="00CB0664"/>
     <w:pPr>
       <w:spacing w:after="0" w:line="240" w:lineRule="auto"/>
     </w:pPr>
@@ -4985,7 +5170,6 @@
     <w:name w:val="Light List Accent 6"/>
     <w:basedOn w:val="TableNormal"/>
     <w:uiPriority w:val="61"/>
-    <w:rsid w:val="00CB0664"/>
     <w:pPr>
       <w:spacing w:after="0" w:line="240" w:lineRule="auto"/>
     </w:pPr>
@@ -5077,7 +5261,6 @@
     <w:name w:val="Light Grid"/>
     <w:basedOn w:val="TableNormal"/>
     <w:uiPriority w:val="62"/>
-    <w:rsid w:val="00CB0664"/>
     <w:pPr>
       <w:spacing w:after="0" w:line="240" w:lineRule="auto"/>
     </w:pPr>
@@ -5207,7 +5390,6 @@
     <w:name w:val="Light Grid Accent 1"/>
     <w:basedOn w:val="TableNormal"/>
     <w:uiPriority w:val="62"/>
-    <w:rsid w:val="00CB0664"/>
     <w:pPr>
       <w:spacing w:after="0" w:line="240" w:lineRule="auto"/>
     </w:pPr>
@@ -5337,7 +5519,6 @@
     <w:name w:val="Light Grid Accent 2"/>
     <w:basedOn w:val="TableNormal"/>
     <w:uiPriority w:val="62"/>
-    <w:rsid w:val="00CB0664"/>
     <w:pPr>
       <w:spacing w:after="0" w:line="240" w:lineRule="auto"/>
     </w:pPr>
@@ -5467,7 +5648,6 @@
     <w:name w:val="Light Grid Accent 3"/>
     <w:basedOn w:val="TableNormal"/>
     <w:uiPriority w:val="62"/>
-    <w:rsid w:val="00CB0664"/>
     <w:pPr>
       <w:spacing w:after="0" w:line="240" w:lineRule="auto"/>
     </w:pPr>
@@ -5597,7 +5777,6 @@
     <w:name w:val="Light Grid Accent 4"/>
     <w:basedOn w:val="TableNormal"/>
     <w:uiPriority w:val="62"/>
-    <w:rsid w:val="00CB0664"/>
     <w:pPr>
       <w:spacing w:after="0" w:line="240" w:lineRule="auto"/>
     </w:pPr>
@@ -5727,7 +5906,6 @@
     <w:name w:val="Light Grid Accent 5"/>
     <w:basedOn w:val="TableNormal"/>
     <w:uiPriority w:val="62"/>
-    <w:rsid w:val="00CB0664"/>
     <w:pPr>
       <w:spacing w:after="0" w:line="240" w:lineRule="auto"/>
     </w:pPr>
@@ -5857,7 +6035,6 @@
     <w:name w:val="Light Grid Accent 6"/>
     <w:basedOn w:val="TableNormal"/>
     <w:uiPriority w:val="62"/>
-    <w:rsid w:val="00CB0664"/>
     <w:pPr>
       <w:spacing w:after="0" w:line="240" w:lineRule="auto"/>
     </w:pPr>
@@ -5987,7 +6164,6 @@
     <w:name w:val="Medium Shading 1"/>
     <w:basedOn w:val="TableNormal"/>
     <w:uiPriority w:val="63"/>
-    <w:rsid w:val="00CB0664"/>
     <w:pPr>
       <w:spacing w:after="0" w:line="240" w:lineRule="auto"/>
     </w:pPr>
@@ -6093,7 +6269,6 @@
     <w:name w:val="Medium Shading 1 Accent 1"/>
     <w:basedOn w:val="TableNormal"/>
     <w:uiPriority w:val="63"/>
-    <w:rsid w:val="00CB0664"/>
     <w:pPr>
       <w:spacing w:after="0" w:line="240" w:lineRule="auto"/>
     </w:pPr>
@@ -6199,7 +6374,6 @@
     <w:name w:val="Medium Shading 1 Accent 2"/>
     <w:basedOn w:val="TableNormal"/>
     <w:uiPriority w:val="63"/>
-    <w:rsid w:val="00CB0664"/>
     <w:pPr>
       <w:spacing w:after="0" w:line="240" w:lineRule="auto"/>
     </w:pPr>
@@ -6305,7 +6479,6 @@
     <w:name w:val="Medium Shading 1 Accent 3"/>
     <w:basedOn w:val="TableNormal"/>
     <w:uiPriority w:val="63"/>
-    <w:rsid w:val="00CB0664"/>
     <w:pPr>
       <w:spacing w:after="0" w:line="240" w:lineRule="auto"/>
     </w:pPr>
@@ -6411,7 +6584,6 @@
     <w:name w:val="Medium Shading 1 Accent 4"/>
     <w:basedOn w:val="TableNormal"/>
     <w:uiPriority w:val="63"/>
-    <w:rsid w:val="00CB0664"/>
     <w:pPr>
       <w:spacing w:after="0" w:line="240" w:lineRule="auto"/>
     </w:pPr>
@@ -6517,7 +6689,6 @@
     <w:name w:val="Medium Shading 1 Accent 5"/>
     <w:basedOn w:val="TableNormal"/>
     <w:uiPriority w:val="63"/>
-    <w:rsid w:val="00CB0664"/>
     <w:pPr>
       <w:spacing w:after="0" w:line="240" w:lineRule="auto"/>
     </w:pPr>
@@ -6623,7 +6794,6 @@
     <w:name w:val="Medium Shading 1 Accent 6"/>
     <w:basedOn w:val="TableNormal"/>
     <w:uiPriority w:val="63"/>
-    <w:rsid w:val="00CB0664"/>
     <w:pPr>
       <w:spacing w:after="0" w:line="240" w:lineRule="auto"/>
     </w:pPr>
@@ -6729,7 +6899,6 @@
     <w:name w:val="Medium Shading 2"/>
     <w:basedOn w:val="TableNormal"/>
     <w:uiPriority w:val="64"/>
-    <w:rsid w:val="00CB0664"/>
     <w:pPr>
       <w:spacing w:after="0" w:line="240" w:lineRule="auto"/>
     </w:pPr>
@@ -6878,7 +7047,6 @@
     <w:name w:val="Medium Shading 2 Accent 1"/>
     <w:basedOn w:val="TableNormal"/>
     <w:uiPriority w:val="64"/>
-    <w:rsid w:val="00CB0664"/>
     <w:pPr>
       <w:spacing w:after="0" w:line="240" w:lineRule="auto"/>
     </w:pPr>
@@ -7027,7 +7195,6 @@
     <w:name w:val="Medium Shading 2 Accent 2"/>
     <w:basedOn w:val="TableNormal"/>
     <w:uiPriority w:val="64"/>
-    <w:rsid w:val="00CB0664"/>
     <w:pPr>
       <w:spacing w:after="0" w:line="240" w:lineRule="auto"/>
     </w:pPr>
@@ -7176,7 +7343,6 @@
     <w:name w:val="Medium Shading 2 Accent 3"/>
     <w:basedOn w:val="TableNormal"/>
     <w:uiPriority w:val="64"/>
-    <w:rsid w:val="00CB0664"/>
     <w:pPr>
       <w:spacing w:after="0" w:line="240" w:lineRule="auto"/>
     </w:pPr>
@@ -7325,7 +7491,6 @@
     <w:name w:val="Medium Shading 2 Accent 4"/>
     <w:basedOn w:val="TableNormal"/>
     <w:uiPriority w:val="64"/>
-    <w:rsid w:val="00CB0664"/>
     <w:pPr>
       <w:spacing w:after="0" w:line="240" w:lineRule="auto"/>
     </w:pPr>
@@ -7474,7 +7639,6 @@
     <w:name w:val="Medium Shading 2 Accent 5"/>
     <w:basedOn w:val="TableNormal"/>
     <w:uiPriority w:val="64"/>
-    <w:rsid w:val="00CB0664"/>
     <w:pPr>
       <w:spacing w:after="0" w:line="240" w:lineRule="auto"/>
     </w:pPr>
@@ -7623,7 +7787,6 @@
     <w:name w:val="Medium Shading 2 Accent 6"/>
     <w:basedOn w:val="TableNormal"/>
     <w:uiPriority w:val="64"/>
-    <w:rsid w:val="00CB0664"/>
     <w:pPr>
       <w:spacing w:after="0" w:line="240" w:lineRule="auto"/>
     </w:pPr>
@@ -7772,7 +7935,6 @@
     <w:name w:val="Medium List 1"/>
     <w:basedOn w:val="TableNormal"/>
     <w:uiPriority w:val="65"/>
-    <w:rsid w:val="00CB0664"/>
     <w:pPr>
       <w:spacing w:after="0" w:line="240" w:lineRule="auto"/>
     </w:pPr>
@@ -7856,7 +8018,6 @@
     <w:name w:val="Medium List 1 Accent 1"/>
     <w:basedOn w:val="TableNormal"/>
     <w:uiPriority w:val="65"/>
-    <w:rsid w:val="00CB0664"/>
     <w:pPr>
       <w:spacing w:after="0" w:line="240" w:lineRule="auto"/>
     </w:pPr>
@@ -7940,7 +8101,6 @@
     <w:name w:val="Medium List 1 Accent 2"/>
     <w:basedOn w:val="TableNormal"/>
     <w:uiPriority w:val="65"/>
-    <w:rsid w:val="00CB0664"/>
     <w:pPr>
       <w:spacing w:after="0" w:line="240" w:lineRule="auto"/>
     </w:pPr>
@@ -8024,7 +8184,6 @@
     <w:name w:val="Medium List 1 Accent 3"/>
     <w:basedOn w:val="TableNormal"/>
     <w:uiPriority w:val="65"/>
-    <w:rsid w:val="00CB0664"/>
     <w:pPr>
       <w:spacing w:after="0" w:line="240" w:lineRule="auto"/>
     </w:pPr>
@@ -8108,7 +8267,6 @@
     <w:name w:val="Medium List 1 Accent 4"/>
     <w:basedOn w:val="TableNormal"/>
     <w:uiPriority w:val="65"/>
-    <w:rsid w:val="00CB0664"/>
     <w:pPr>
       <w:spacing w:after="0" w:line="240" w:lineRule="auto"/>
     </w:pPr>
@@ -8192,7 +8350,6 @@
     <w:name w:val="Medium List 1 Accent 5"/>
     <w:basedOn w:val="TableNormal"/>
     <w:uiPriority w:val="65"/>
-    <w:rsid w:val="00CB0664"/>
     <w:pPr>
       <w:spacing w:after="0" w:line="240" w:lineRule="auto"/>
     </w:pPr>
@@ -8276,7 +8433,6 @@
     <w:name w:val="Medium List 1 Accent 6"/>
     <w:basedOn w:val="TableNormal"/>
     <w:uiPriority w:val="65"/>
-    <w:rsid w:val="00CB0664"/>
     <w:pPr>
       <w:spacing w:after="0" w:line="240" w:lineRule="auto"/>
     </w:pPr>
@@ -8360,7 +8516,6 @@
     <w:name w:val="Medium List 2"/>
     <w:basedOn w:val="TableNormal"/>
     <w:uiPriority w:val="66"/>
-    <w:rsid w:val="00CB0664"/>
     <w:pPr>
       <w:spacing w:after="0" w:line="240" w:lineRule="auto"/>
     </w:pPr>
@@ -8488,7 +8643,6 @@
     <w:name w:val="Medium List 2 Accent 1"/>
     <w:basedOn w:val="TableNormal"/>
     <w:uiPriority w:val="66"/>
-    <w:rsid w:val="00CB0664"/>
     <w:pPr>
       <w:spacing w:after="0" w:line="240" w:lineRule="auto"/>
     </w:pPr>
@@ -8616,7 +8770,6 @@
     <w:name w:val="Medium List 2 Accent 2"/>
     <w:basedOn w:val="TableNormal"/>
     <w:uiPriority w:val="66"/>
-    <w:rsid w:val="00CB0664"/>
     <w:pPr>
       <w:spacing w:after="0" w:line="240" w:lineRule="auto"/>
     </w:pPr>
@@ -8744,7 +8897,6 @@
     <w:name w:val="Medium List 2 Accent 3"/>
     <w:basedOn w:val="TableNormal"/>
     <w:uiPriority w:val="66"/>
-    <w:rsid w:val="00CB0664"/>
     <w:pPr>
       <w:spacing w:after="0" w:line="240" w:lineRule="auto"/>
     </w:pPr>
@@ -8872,7 +9024,6 @@
     <w:name w:val="Medium List 2 Accent 4"/>
     <w:basedOn w:val="TableNormal"/>
     <w:uiPriority w:val="66"/>
-    <w:rsid w:val="00CB0664"/>
     <w:pPr>
       <w:spacing w:after="0" w:line="240" w:lineRule="auto"/>
     </w:pPr>
@@ -9000,7 +9151,6 @@
     <w:name w:val="Medium List 2 Accent 5"/>
     <w:basedOn w:val="TableNormal"/>
     <w:uiPriority w:val="66"/>
-    <w:rsid w:val="00CB0664"/>
     <w:pPr>
       <w:spacing w:after="0" w:line="240" w:lineRule="auto"/>
     </w:pPr>
@@ -9128,7 +9278,6 @@
     <w:name w:val="Medium List 2 Accent 6"/>
     <w:basedOn w:val="TableNormal"/>
     <w:uiPriority w:val="66"/>
-    <w:rsid w:val="00CB0664"/>
     <w:pPr>
       <w:spacing w:after="0" w:line="240" w:lineRule="auto"/>
     </w:pPr>
@@ -9256,7 +9405,6 @@
     <w:name w:val="Medium Grid 1"/>
     <w:basedOn w:val="TableNormal"/>
     <w:uiPriority w:val="67"/>
-    <w:rsid w:val="00CB0664"/>
     <w:pPr>
       <w:spacing w:after="0" w:line="240" w:lineRule="auto"/>
     </w:pPr>
@@ -9329,7 +9477,6 @@
     <w:name w:val="Medium Grid 1 Accent 1"/>
     <w:basedOn w:val="TableNormal"/>
     <w:uiPriority w:val="67"/>
-    <w:rsid w:val="00CB0664"/>
     <w:pPr>
       <w:spacing w:after="0" w:line="240" w:lineRule="auto"/>
     </w:pPr>
@@ -9402,7 +9549,6 @@
     <w:name w:val="Medium Grid 1 Accent 2"/>
     <w:basedOn w:val="TableNormal"/>
     <w:uiPriority w:val="67"/>
-    <w:rsid w:val="00CB0664"/>
     <w:pPr>
       <w:spacing w:after="0" w:line="240" w:lineRule="auto"/>
     </w:pPr>
@@ -9475,7 +9621,6 @@
     <w:name w:val="Medium Grid 1 Accent 3"/>
     <w:basedOn w:val="TableNormal"/>
     <w:uiPriority w:val="67"/>
-    <w:rsid w:val="00CB0664"/>
     <w:pPr>
       <w:spacing w:after="0" w:line="240" w:lineRule="auto"/>
     </w:pPr>
@@ -9548,7 +9693,6 @@
     <w:name w:val="Medium Grid 1 Accent 4"/>
     <w:basedOn w:val="TableNormal"/>
     <w:uiPriority w:val="67"/>
-    <w:rsid w:val="00CB0664"/>
     <w:pPr>
       <w:spacing w:after="0" w:line="240" w:lineRule="auto"/>
     </w:pPr>
@@ -9621,7 +9765,6 @@
     <w:name w:val="Medium Grid 1 Accent 5"/>
     <w:basedOn w:val="TableNormal"/>
     <w:uiPriority w:val="67"/>
-    <w:rsid w:val="00CB0664"/>
     <w:pPr>
       <w:spacing w:after="0" w:line="240" w:lineRule="auto"/>
     </w:pPr>
@@ -9694,7 +9837,6 @@
     <w:name w:val="Medium Grid 1 Accent 6"/>
     <w:basedOn w:val="TableNormal"/>
     <w:uiPriority w:val="67"/>
-    <w:rsid w:val="00CB0664"/>
     <w:pPr>
       <w:spacing w:after="0" w:line="240" w:lineRule="auto"/>
     </w:pPr>
@@ -9767,7 +9909,6 @@
     <w:name w:val="Medium Grid 2"/>
     <w:basedOn w:val="TableNormal"/>
     <w:uiPriority w:val="68"/>
-    <w:rsid w:val="00CB0664"/>
     <w:pPr>
       <w:spacing w:after="0" w:line="240" w:lineRule="auto"/>
     </w:pPr>
@@ -9892,7 +10033,6 @@
     <w:name w:val="Medium Grid 2 Accent 1"/>
     <w:basedOn w:val="TableNormal"/>
     <w:uiPriority w:val="68"/>
-    <w:rsid w:val="00CB0664"/>
     <w:pPr>
       <w:spacing w:after="0" w:line="240" w:lineRule="auto"/>
     </w:pPr>
@@ -10017,7 +10157,6 @@
     <w:name w:val="Medium Grid 2 Accent 2"/>
     <w:basedOn w:val="TableNormal"/>
     <w:uiPriority w:val="68"/>
-    <w:rsid w:val="00CB0664"/>
     <w:pPr>
       <w:spacing w:after="0" w:line="240" w:lineRule="auto"/>
     </w:pPr>
@@ -10142,7 +10281,6 @@
     <w:name w:val="Medium Grid 2 Accent 3"/>
     <w:basedOn w:val="TableNormal"/>
     <w:uiPriority w:val="68"/>
-    <w:rsid w:val="00CB0664"/>
     <w:pPr>
       <w:spacing w:after="0" w:line="240" w:lineRule="auto"/>
     </w:pPr>
@@ -10267,7 +10405,6 @@
     <w:name w:val="Medium Grid 2 Accent 4"/>
     <w:basedOn w:val="TableNormal"/>
     <w:uiPriority w:val="68"/>
-    <w:rsid w:val="00CB0664"/>
     <w:pPr>
       <w:spacing w:after="0" w:line="240" w:lineRule="auto"/>
     </w:pPr>
@@ -10392,7 +10529,6 @@
     <w:name w:val="Medium Grid 2 Accent 5"/>
     <w:basedOn w:val="TableNormal"/>
     <w:uiPriority w:val="68"/>
-    <w:rsid w:val="00CB0664"/>
     <w:pPr>
       <w:spacing w:after="0" w:line="240" w:lineRule="auto"/>
     </w:pPr>
@@ -10517,7 +10653,6 @@
     <w:name w:val="Medium Grid 2 Accent 6"/>
     <w:basedOn w:val="TableNormal"/>
     <w:uiPriority w:val="68"/>
-    <w:rsid w:val="00CB0664"/>
     <w:pPr>
       <w:spacing w:after="0" w:line="240" w:lineRule="auto"/>
     </w:pPr>
@@ -10642,7 +10777,6 @@
     <w:name w:val="Medium Grid 3"/>
     <w:basedOn w:val="TableNormal"/>
     <w:uiPriority w:val="69"/>
-    <w:rsid w:val="00CB0664"/>
     <w:pPr>
       <w:spacing w:after="0" w:line="240" w:lineRule="auto"/>
     </w:pPr>
@@ -10783,7 +10917,6 @@
     <w:name w:val="Medium Grid 3 Accent 1"/>
     <w:basedOn w:val="TableNormal"/>
     <w:uiPriority w:val="69"/>
-    <w:rsid w:val="00CB0664"/>
     <w:pPr>
       <w:spacing w:after="0" w:line="240" w:lineRule="auto"/>
     </w:pPr>
@@ -10924,7 +11057,6 @@
     <w:name w:val="Medium Grid 3 Accent 2"/>
     <w:basedOn w:val="TableNormal"/>
     <w:uiPriority w:val="69"/>
-    <w:rsid w:val="00CB0664"/>
     <w:pPr>
       <w:spacing w:after="0" w:line="240" w:lineRule="auto"/>
     </w:pPr>
@@ -11065,7 +11197,6 @@
     <w:name w:val="Medium Grid 3 Accent 3"/>
     <w:basedOn w:val="TableNormal"/>
     <w:uiPriority w:val="69"/>
-    <w:rsid w:val="00CB0664"/>
     <w:pPr>
       <w:spacing w:after="0" w:line="240" w:lineRule="auto"/>
     </w:pPr>
@@ -11206,7 +11337,6 @@
     <w:name w:val="Medium Grid 3 Accent 4"/>
     <w:basedOn w:val="TableNormal"/>
     <w:uiPriority w:val="69"/>
-    <w:rsid w:val="00CB0664"/>
     <w:pPr>
       <w:spacing w:after="0" w:line="240" w:lineRule="auto"/>
     </w:pPr>
@@ -11347,7 +11477,6 @@
     <w:name w:val="Medium Grid 3 Accent 5"/>
     <w:basedOn w:val="TableNormal"/>
     <w:uiPriority w:val="69"/>
-    <w:rsid w:val="00CB0664"/>
     <w:pPr>
       <w:spacing w:after="0" w:line="240" w:lineRule="auto"/>
     </w:pPr>
@@ -11488,7 +11617,6 @@
     <w:name w:val="Medium Grid 3 Accent 6"/>
     <w:basedOn w:val="TableNormal"/>
     <w:uiPriority w:val="69"/>
-    <w:rsid w:val="00CB0664"/>
     <w:pPr>
       <w:spacing w:after="0" w:line="240" w:lineRule="auto"/>
     </w:pPr>
@@ -11629,7 +11757,6 @@
     <w:name w:val="Dark List"/>
     <w:basedOn w:val="TableNormal"/>
     <w:uiPriority w:val="70"/>
-    <w:rsid w:val="00CB0664"/>
     <w:pPr>
       <w:spacing w:after="0" w:line="240" w:lineRule="auto"/>
     </w:pPr>
@@ -11743,7 +11870,6 @@
     <w:name w:val="Dark List Accent 1"/>
     <w:basedOn w:val="TableNormal"/>
     <w:uiPriority w:val="70"/>
-    <w:rsid w:val="00CB0664"/>
     <w:pPr>
       <w:spacing w:after="0" w:line="240" w:lineRule="auto"/>
     </w:pPr>
@@ -11857,7 +11983,6 @@
     <w:name w:val="Dark List Accent 2"/>
     <w:basedOn w:val="TableNormal"/>
     <w:uiPriority w:val="70"/>
-    <w:rsid w:val="00CB0664"/>
     <w:pPr>
       <w:spacing w:after="0" w:line="240" w:lineRule="auto"/>
     </w:pPr>
@@ -11971,7 +12096,6 @@
     <w:name w:val="Dark List Accent 3"/>
     <w:basedOn w:val="TableNormal"/>
     <w:uiPriority w:val="70"/>
-    <w:rsid w:val="00CB0664"/>
     <w:pPr>
       <w:spacing w:after="0" w:line="240" w:lineRule="auto"/>
     </w:pPr>
@@ -12085,7 +12209,6 @@
     <w:name w:val="Dark List Accent 4"/>
     <w:basedOn w:val="TableNormal"/>
     <w:uiPriority w:val="70"/>
-    <w:rsid w:val="00CB0664"/>
     <w:pPr>
       <w:spacing w:after="0" w:line="240" w:lineRule="auto"/>
     </w:pPr>
@@ -12199,7 +12322,6 @@
     <w:name w:val="Dark List Accent 5"/>
     <w:basedOn w:val="TableNormal"/>
     <w:uiPriority w:val="70"/>
-    <w:rsid w:val="00CB0664"/>
     <w:pPr>
       <w:spacing w:after="0" w:line="240" w:lineRule="auto"/>
     </w:pPr>
@@ -12313,7 +12435,6 @@
     <w:name w:val="Dark List Accent 6"/>
     <w:basedOn w:val="TableNormal"/>
     <w:uiPriority w:val="70"/>
-    <w:rsid w:val="00CB0664"/>
     <w:pPr>
       <w:spacing w:after="0" w:line="240" w:lineRule="auto"/>
     </w:pPr>
@@ -12427,7 +12548,6 @@
     <w:name w:val="Colorful Shading"/>
     <w:basedOn w:val="TableNormal"/>
     <w:uiPriority w:val="71"/>
-    <w:rsid w:val="00CB0664"/>
     <w:pPr>
       <w:spacing w:after="0" w:line="240" w:lineRule="auto"/>
     </w:pPr>
@@ -12549,7 +12669,6 @@
     <w:name w:val="Colorful Shading Accent 1"/>
     <w:basedOn w:val="TableNormal"/>
     <w:uiPriority w:val="71"/>
-    <w:rsid w:val="00CB0664"/>
     <w:pPr>
       <w:spacing w:after="0" w:line="240" w:lineRule="auto"/>
     </w:pPr>
@@ -12671,7 +12790,6 @@
     <w:name w:val="Colorful Shading Accent 2"/>
     <w:basedOn w:val="TableNormal"/>
     <w:uiPriority w:val="71"/>
-    <w:rsid w:val="00CB0664"/>
     <w:pPr>
       <w:spacing w:after="0" w:line="240" w:lineRule="auto"/>
     </w:pPr>
@@ -12793,7 +12911,6 @@
     <w:name w:val="Colorful Shading Accent 3"/>
     <w:basedOn w:val="TableNormal"/>
     <w:uiPriority w:val="71"/>
-    <w:rsid w:val="00CB0664"/>
     <w:pPr>
       <w:spacing w:after="0" w:line="240" w:lineRule="auto"/>
     </w:pPr>
@@ -12905,7 +13022,6 @@
     <w:name w:val="Colorful Shading Accent 4"/>
     <w:basedOn w:val="TableNormal"/>
     <w:uiPriority w:val="71"/>
-    <w:rsid w:val="00CB0664"/>
     <w:pPr>
       <w:spacing w:after="0" w:line="240" w:lineRule="auto"/>
     </w:pPr>
@@ -13027,7 +13143,6 @@
     <w:name w:val="Colorful Shading Accent 5"/>
     <w:basedOn w:val="TableNormal"/>
     <w:uiPriority w:val="71"/>
-    <w:rsid w:val="00CB0664"/>
     <w:pPr>
       <w:spacing w:after="0" w:line="240" w:lineRule="auto"/>
     </w:pPr>
@@ -13149,7 +13264,6 @@
     <w:name w:val="Colorful Shading Accent 6"/>
     <w:basedOn w:val="TableNormal"/>
     <w:uiPriority w:val="71"/>
-    <w:rsid w:val="00CB0664"/>
     <w:pPr>
       <w:spacing w:after="0" w:line="240" w:lineRule="auto"/>
     </w:pPr>
@@ -13271,7 +13385,6 @@
     <w:name w:val="Colorful List"/>
     <w:basedOn w:val="TableNormal"/>
     <w:uiPriority w:val="72"/>
-    <w:rsid w:val="00CB0664"/>
     <w:pPr>
       <w:spacing w:after="0" w:line="240" w:lineRule="auto"/>
     </w:pPr>
@@ -13357,7 +13470,6 @@
     <w:name w:val="Colorful List Accent 1"/>
     <w:basedOn w:val="TableNormal"/>
     <w:uiPriority w:val="72"/>
-    <w:rsid w:val="00CB0664"/>
     <w:pPr>
       <w:spacing w:after="0" w:line="240" w:lineRule="auto"/>
     </w:pPr>
@@ -13443,7 +13555,6 @@
     <w:name w:val="Colorful List Accent 2"/>
     <w:basedOn w:val="TableNormal"/>
     <w:uiPriority w:val="72"/>
-    <w:rsid w:val="00CB0664"/>
     <w:pPr>
       <w:spacing w:after="0" w:line="240" w:lineRule="auto"/>
     </w:pPr>
@@ -13529,7 +13640,6 @@
     <w:name w:val="Colorful List Accent 3"/>
     <w:basedOn w:val="TableNormal"/>
     <w:uiPriority w:val="72"/>
-    <w:rsid w:val="00CB0664"/>
     <w:pPr>
       <w:spacing w:after="0" w:line="240" w:lineRule="auto"/>
     </w:pPr>
@@ -13615,7 +13725,6 @@
     <w:name w:val="Colorful List Accent 4"/>
     <w:basedOn w:val="TableNormal"/>
     <w:uiPriority w:val="72"/>
-    <w:rsid w:val="00CB0664"/>
     <w:pPr>
       <w:spacing w:after="0" w:line="240" w:lineRule="auto"/>
     </w:pPr>
@@ -13701,7 +13810,6 @@
     <w:name w:val="Colorful List Accent 5"/>
     <w:basedOn w:val="TableNormal"/>
     <w:uiPriority w:val="72"/>
-    <w:rsid w:val="00CB0664"/>
     <w:pPr>
       <w:spacing w:after="0" w:line="240" w:lineRule="auto"/>
     </w:pPr>
@@ -13787,7 +13895,6 @@
     <w:name w:val="Colorful List Accent 6"/>
     <w:basedOn w:val="TableNormal"/>
     <w:uiPriority w:val="72"/>
-    <w:rsid w:val="00CB0664"/>
     <w:pPr>
       <w:spacing w:after="0" w:line="240" w:lineRule="auto"/>
     </w:pPr>
@@ -13873,7 +13980,6 @@
     <w:name w:val="Colorful Grid"/>
     <w:basedOn w:val="TableNormal"/>
     <w:uiPriority w:val="73"/>
-    <w:rsid w:val="00CB0664"/>
     <w:pPr>
       <w:spacing w:after="0" w:line="240" w:lineRule="auto"/>
     </w:pPr>
@@ -13953,7 +14059,6 @@
     <w:name w:val="Colorful Grid Accent 1"/>
     <w:basedOn w:val="TableNormal"/>
     <w:uiPriority w:val="73"/>
-    <w:rsid w:val="00CB0664"/>
     <w:pPr>
       <w:spacing w:after="0" w:line="240" w:lineRule="auto"/>
     </w:pPr>
@@ -14033,7 +14138,6 @@
     <w:name w:val="Colorful Grid Accent 2"/>
     <w:basedOn w:val="TableNormal"/>
     <w:uiPriority w:val="73"/>
-    <w:rsid w:val="00CB0664"/>
     <w:pPr>
       <w:spacing w:after="0" w:line="240" w:lineRule="auto"/>
     </w:pPr>
@@ -14113,7 +14217,6 @@
     <w:name w:val="Colorful Grid Accent 3"/>
     <w:basedOn w:val="TableNormal"/>
     <w:uiPriority w:val="73"/>
-    <w:rsid w:val="00CB0664"/>
     <w:pPr>
       <w:spacing w:after="0" w:line="240" w:lineRule="auto"/>
     </w:pPr>
@@ -14193,7 +14296,6 @@
     <w:name w:val="Colorful Grid Accent 4"/>
     <w:basedOn w:val="TableNormal"/>
     <w:uiPriority w:val="73"/>
-    <w:rsid w:val="00CB0664"/>
     <w:pPr>
       <w:spacing w:after="0" w:line="240" w:lineRule="auto"/>
     </w:pPr>
@@ -14273,7 +14375,6 @@
     <w:name w:val="Colorful Grid Accent 5"/>
     <w:basedOn w:val="TableNormal"/>
     <w:uiPriority w:val="73"/>
-    <w:rsid w:val="00CB0664"/>
     <w:pPr>
       <w:spacing w:after="0" w:line="240" w:lineRule="auto"/>
     </w:pPr>
@@ -14353,7 +14454,6 @@
     <w:name w:val="Colorful Grid Accent 6"/>
     <w:basedOn w:val="TableNormal"/>
     <w:uiPriority w:val="73"/>
-    <w:rsid w:val="00CB0664"/>
     <w:pPr>
       <w:spacing w:after="0" w:line="240" w:lineRule="auto"/>
     </w:pPr>
@@ -14646,7 +14746,6 @@
   <w:style w:type="paragraph" w:default="1" w:styleId="Normal">
     <w:name w:val="Normal"/>
     <w:qFormat/>
-    <w:rsid w:val="00FC693F"/>
   </w:style>
   <w:style w:type="paragraph" w:styleId="Heading1">
     <w:name w:val="heading 1"/>
@@ -14655,7 +14754,6 @@
     <w:link w:val="Heading1Char"/>
     <w:uiPriority w:val="9"/>
     <w:qFormat/>
-    <w:rsid w:val="00FC693F"/>
     <w:pPr>
       <w:keepNext/>
       <w:keepLines/>
@@ -14679,7 +14777,6 @@
     <w:uiPriority w:val="9"/>
     <w:unhideWhenUsed/>
     <w:qFormat/>
-    <w:rsid w:val="00FC693F"/>
     <w:pPr>
       <w:keepNext/>
       <w:keepLines/>
@@ -14703,7 +14800,6 @@
     <w:uiPriority w:val="9"/>
     <w:unhideWhenUsed/>
     <w:qFormat/>
-    <w:rsid w:val="00FC693F"/>
     <w:pPr>
       <w:keepNext/>
       <w:keepLines/>
@@ -14726,7 +14822,6 @@
     <w:semiHidden/>
     <w:unhideWhenUsed/>
     <w:qFormat/>
-    <w:rsid w:val="00FC693F"/>
     <w:pPr>
       <w:keepNext/>
       <w:keepLines/>
@@ -14751,7 +14846,6 @@
     <w:semiHidden/>
     <w:unhideWhenUsed/>
     <w:qFormat/>
-    <w:rsid w:val="00FC693F"/>
     <w:pPr>
       <w:keepNext/>
       <w:keepLines/>
@@ -14772,7 +14866,6 @@
     <w:semiHidden/>
     <w:unhideWhenUsed/>
     <w:qFormat/>
-    <w:rsid w:val="00FC693F"/>
     <w:pPr>
       <w:keepNext/>
       <w:keepLines/>
@@ -14795,7 +14888,6 @@
     <w:semiHidden/>
     <w:unhideWhenUsed/>
     <w:qFormat/>
-    <w:rsid w:val="00FC693F"/>
     <w:pPr>
       <w:keepNext/>
       <w:keepLines/>
@@ -14818,7 +14910,6 @@
     <w:semiHidden/>
     <w:unhideWhenUsed/>
     <w:qFormat/>
-    <w:rsid w:val="00FC693F"/>
     <w:pPr>
       <w:keepNext/>
       <w:keepLines/>
@@ -14841,7 +14932,6 @@
     <w:semiHidden/>
     <w:unhideWhenUsed/>
     <w:qFormat/>
-    <w:rsid w:val="00FC693F"/>
     <w:pPr>
       <w:keepNext/>
       <w:keepLines/>
@@ -14888,7 +14978,6 @@
     <w:name w:val="No Spacing"/>
     <w:uiPriority w:val="1"/>
     <w:qFormat/>
-    <w:rsid w:val="00FC693F"/>
     <w:pPr>
       <w:spacing w:after="0" w:line="240" w:lineRule="auto"/>
     </w:pPr>
@@ -14898,7 +14987,6 @@
     <w:basedOn w:val="DefaultParagraphFont"/>
     <w:link w:val="Heading1"/>
     <w:uiPriority w:val="9"/>
-    <w:rsid w:val="00FC693F"/>
     <w:rPr>
       <w:rFonts w:asciiTheme="majorHAnsi" w:eastAsiaTheme="majorEastAsia" w:hAnsiTheme="majorHAnsi" w:cstheme="majorBidi"/>
       <w:b/>
@@ -14913,7 +15001,6 @@
     <w:basedOn w:val="DefaultParagraphFont"/>
     <w:link w:val="Heading2"/>
     <w:uiPriority w:val="9"/>
-    <w:rsid w:val="00FC693F"/>
     <w:rPr>
       <w:rFonts w:asciiTheme="majorHAnsi" w:eastAsiaTheme="majorEastAsia" w:hAnsiTheme="majorHAnsi" w:cstheme="majorBidi"/>
       <w:b/>
@@ -14928,7 +15015,6 @@
     <w:basedOn w:val="DefaultParagraphFont"/>
     <w:link w:val="Heading3"/>
     <w:uiPriority w:val="9"/>
-    <w:rsid w:val="00FC693F"/>
     <w:rPr>
       <w:rFonts w:asciiTheme="majorHAnsi" w:eastAsiaTheme="majorEastAsia" w:hAnsiTheme="majorHAnsi" w:cstheme="majorBidi"/>
       <w:b/>
@@ -14943,7 +15029,6 @@
     <w:link w:val="TitleChar"/>
     <w:uiPriority w:val="10"/>
     <w:qFormat/>
-    <w:rsid w:val="00FC693F"/>
     <w:pPr>
       <w:pBdr>
         <w:bottom w:val="single" w:sz="8" w:space="4" w:color="4F81BD" w:themeColor="accent1"/>
@@ -14965,7 +15050,6 @@
     <w:basedOn w:val="DefaultParagraphFont"/>
     <w:link w:val="Title"/>
     <w:uiPriority w:val="10"/>
-    <w:rsid w:val="00FC693F"/>
     <w:rPr>
       <w:rFonts w:asciiTheme="majorHAnsi" w:eastAsiaTheme="majorEastAsia" w:hAnsiTheme="majorHAnsi" w:cstheme="majorBidi"/>
       <w:color w:val="17365D" w:themeColor="text2" w:themeShade="BF"/>
@@ -14982,7 +15066,6 @@
     <w:link w:val="SubtitleChar"/>
     <w:uiPriority w:val="11"/>
     <w:qFormat/>
-    <w:rsid w:val="00FC693F"/>
     <w:pPr>
       <w:numPr>
         <w:ilvl w:val="1"/>
@@ -15003,7 +15086,6 @@
     <w:basedOn w:val="DefaultParagraphFont"/>
     <w:link w:val="Subtitle"/>
     <w:uiPriority w:val="11"/>
-    <w:rsid w:val="00FC693F"/>
     <w:rPr>
       <w:rFonts w:asciiTheme="majorHAnsi" w:eastAsiaTheme="majorEastAsia" w:hAnsiTheme="majorHAnsi" w:cstheme="majorBidi"/>
       <w:i/>
@@ -15019,7 +15101,6 @@
     <w:basedOn w:val="Normal"/>
     <w:uiPriority w:val="34"/>
     <w:qFormat/>
-    <w:rsid w:val="00FC693F"/>
     <w:pPr>
       <w:ind w:left="720"/>
       <w:contextualSpacing/>
@@ -15031,7 +15112,6 @@
     <w:link w:val="BodyTextChar"/>
     <w:uiPriority w:val="99"/>
     <w:unhideWhenUsed/>
-    <w:rsid w:val="00AA1D8D"/>
     <w:pPr>
       <w:spacing w:after="120"/>
     </w:pPr>
@@ -15041,7 +15121,6 @@
     <w:basedOn w:val="DefaultParagraphFont"/>
     <w:link w:val="BodyText"/>
     <w:uiPriority w:val="99"/>
-    <w:rsid w:val="00AA1D8D"/>
   </w:style>
   <w:style w:type="paragraph" w:styleId="BodyText2">
     <w:name w:val="Body Text 2"/>
@@ -15049,7 +15128,6 @@
     <w:link w:val="BodyText2Char"/>
     <w:uiPriority w:val="99"/>
     <w:unhideWhenUsed/>
-    <w:rsid w:val="00AA1D8D"/>
     <w:pPr>
       <w:spacing w:after="120" w:line="480" w:lineRule="auto"/>
     </w:pPr>
@@ -15059,7 +15137,6 @@
     <w:basedOn w:val="DefaultParagraphFont"/>
     <w:link w:val="BodyText2"/>
     <w:uiPriority w:val="99"/>
-    <w:rsid w:val="00AA1D8D"/>
   </w:style>
   <w:style w:type="paragraph" w:styleId="BodyText3">
     <w:name w:val="Body Text 3"/>
@@ -15067,7 +15144,6 @@
     <w:link w:val="BodyText3Char"/>
     <w:uiPriority w:val="99"/>
     <w:unhideWhenUsed/>
-    <w:rsid w:val="00AA1D8D"/>
     <w:pPr>
       <w:spacing w:after="120"/>
     </w:pPr>
@@ -15081,7 +15157,6 @@
     <w:basedOn w:val="DefaultParagraphFont"/>
     <w:link w:val="BodyText3"/>
     <w:uiPriority w:val="99"/>
-    <w:rsid w:val="00AA1D8D"/>
     <w:rPr>
       <w:sz w:val="16"/>
       <w:szCs w:val="16"/>
@@ -15092,7 +15167,6 @@
     <w:basedOn w:val="Normal"/>
     <w:uiPriority w:val="99"/>
     <w:unhideWhenUsed/>
-    <w:rsid w:val="00AA1D8D"/>
     <w:pPr>
       <w:ind w:left="360" w:hanging="360"/>
       <w:contextualSpacing/>
@@ -15103,7 +15177,6 @@
     <w:basedOn w:val="Normal"/>
     <w:uiPriority w:val="99"/>
     <w:unhideWhenUsed/>
-    <w:rsid w:val="00326F90"/>
     <w:pPr>
       <w:ind w:left="720" w:hanging="360"/>
       <w:contextualSpacing/>
@@ -15114,7 +15187,6 @@
     <w:basedOn w:val="Normal"/>
     <w:uiPriority w:val="99"/>
     <w:unhideWhenUsed/>
-    <w:rsid w:val="00326F90"/>
     <w:pPr>
       <w:ind w:left="1080" w:hanging="360"/>
       <w:contextualSpacing/>
@@ -15125,7 +15197,6 @@
     <w:basedOn w:val="Normal"/>
     <w:uiPriority w:val="99"/>
     <w:unhideWhenUsed/>
-    <w:rsid w:val="00326F90"/>
     <w:pPr>
       <w:numPr>
         <w:numId w:val="1"/>
@@ -15138,7 +15209,6 @@
     <w:basedOn w:val="Normal"/>
     <w:uiPriority w:val="99"/>
     <w:unhideWhenUsed/>
-    <w:rsid w:val="00326F90"/>
     <w:pPr>
       <w:numPr>
         <w:numId w:val="2"/>
@@ -15151,7 +15221,6 @@
     <w:basedOn w:val="Normal"/>
     <w:uiPriority w:val="99"/>
     <w:unhideWhenUsed/>
-    <w:rsid w:val="00326F90"/>
     <w:pPr>
       <w:numPr>
         <w:numId w:val="3"/>
@@ -15164,7 +15233,6 @@
     <w:basedOn w:val="Normal"/>
     <w:uiPriority w:val="99"/>
     <w:unhideWhenUsed/>
-    <w:rsid w:val="00326F90"/>
     <w:pPr>
       <w:numPr>
         <w:numId w:val="5"/>
@@ -15177,7 +15245,6 @@
     <w:basedOn w:val="Normal"/>
     <w:uiPriority w:val="99"/>
     <w:unhideWhenUsed/>
-    <w:rsid w:val="0029639D"/>
     <w:pPr>
       <w:numPr>
         <w:numId w:val="6"/>
@@ -15190,7 +15257,6 @@
     <w:basedOn w:val="Normal"/>
     <w:uiPriority w:val="99"/>
     <w:unhideWhenUsed/>
-    <w:rsid w:val="0029639D"/>
     <w:pPr>
       <w:numPr>
         <w:numId w:val="7"/>
@@ -15203,7 +15269,6 @@
     <w:basedOn w:val="Normal"/>
     <w:uiPriority w:val="99"/>
     <w:unhideWhenUsed/>
-    <w:rsid w:val="0029639D"/>
     <w:pPr>
       <w:spacing w:after="120"/>
       <w:ind w:left="360"/>
@@ -15215,7 +15280,6 @@
     <w:basedOn w:val="Normal"/>
     <w:uiPriority w:val="99"/>
     <w:unhideWhenUsed/>
-    <w:rsid w:val="0029639D"/>
     <w:pPr>
       <w:spacing w:after="120"/>
       <w:ind w:left="720"/>
@@ -15227,7 +15291,6 @@
     <w:basedOn w:val="Normal"/>
     <w:uiPriority w:val="99"/>
     <w:unhideWhenUsed/>
-    <w:rsid w:val="0029639D"/>
     <w:pPr>
       <w:spacing w:after="120"/>
       <w:ind w:left="1080"/>
@@ -15239,7 +15302,6 @@
     <w:link w:val="MacroTextChar"/>
     <w:uiPriority w:val="99"/>
     <w:unhideWhenUsed/>
-    <w:rsid w:val="0029639D"/>
     <w:pPr>
       <w:tabs>
         <w:tab w:val="left" w:pos="576"/>
@@ -15262,7 +15324,6 @@
     <w:basedOn w:val="DefaultParagraphFont"/>
     <w:link w:val="MacroText"/>
     <w:uiPriority w:val="99"/>
-    <w:rsid w:val="0029639D"/>
     <w:rPr>
       <w:rFonts w:ascii="Courier" w:hAnsi="Courier"/>
       <w:sz w:val="20"/>
@@ -15276,7 +15337,6 @@
     <w:link w:val="QuoteChar"/>
     <w:uiPriority w:val="29"/>
     <w:qFormat/>
-    <w:rsid w:val="00FC693F"/>
     <w:rPr>
       <w:i/>
       <w:iCs/>
@@ -15288,7 +15348,6 @@
     <w:basedOn w:val="DefaultParagraphFont"/>
     <w:link w:val="Quote"/>
     <w:uiPriority w:val="29"/>
-    <w:rsid w:val="00FC693F"/>
     <w:rPr>
       <w:i/>
       <w:iCs/>
@@ -15301,7 +15360,6 @@
     <w:link w:val="Heading4"/>
     <w:uiPriority w:val="9"/>
     <w:semiHidden/>
-    <w:rsid w:val="00FC693F"/>
     <w:rPr>
       <w:rFonts w:asciiTheme="majorHAnsi" w:eastAsiaTheme="majorEastAsia" w:hAnsiTheme="majorHAnsi" w:cstheme="majorBidi"/>
       <w:b/>
@@ -15317,7 +15375,6 @@
     <w:link w:val="Heading5"/>
     <w:uiPriority w:val="9"/>
     <w:semiHidden/>
-    <w:rsid w:val="00FC693F"/>
     <w:rPr>
       <w:rFonts w:asciiTheme="majorHAnsi" w:eastAsiaTheme="majorEastAsia" w:hAnsiTheme="majorHAnsi" w:cstheme="majorBidi"/>
       <w:color w:val="243F60" w:themeColor="accent1" w:themeShade="7F"/>
@@ -15329,7 +15386,6 @@
     <w:link w:val="Heading6"/>
     <w:uiPriority w:val="9"/>
     <w:semiHidden/>
-    <w:rsid w:val="00FC693F"/>
     <w:rPr>
       <w:rFonts w:asciiTheme="majorHAnsi" w:eastAsiaTheme="majorEastAsia" w:hAnsiTheme="majorHAnsi" w:cstheme="majorBidi"/>
       <w:i/>
@@ -15343,7 +15399,6 @@
     <w:link w:val="Heading7"/>
     <w:uiPriority w:val="9"/>
     <w:semiHidden/>
-    <w:rsid w:val="00FC693F"/>
     <w:rPr>
       <w:rFonts w:asciiTheme="majorHAnsi" w:eastAsiaTheme="majorEastAsia" w:hAnsiTheme="majorHAnsi" w:cstheme="majorBidi"/>
       <w:i/>
@@ -15357,7 +15412,6 @@
     <w:link w:val="Heading8"/>
     <w:uiPriority w:val="9"/>
     <w:semiHidden/>
-    <w:rsid w:val="00FC693F"/>
     <w:rPr>
       <w:rFonts w:asciiTheme="majorHAnsi" w:eastAsiaTheme="majorEastAsia" w:hAnsiTheme="majorHAnsi" w:cstheme="majorBidi"/>
       <w:color w:val="4F81BD" w:themeColor="accent1"/>
@@ -15371,7 +15425,6 @@
     <w:link w:val="Heading9"/>
     <w:uiPriority w:val="9"/>
     <w:semiHidden/>
-    <w:rsid w:val="00FC693F"/>
     <w:rPr>
       <w:rFonts w:asciiTheme="majorHAnsi" w:eastAsiaTheme="majorEastAsia" w:hAnsiTheme="majorHAnsi" w:cstheme="majorBidi"/>
       <w:i/>
@@ -15389,7 +15442,6 @@
     <w:semiHidden/>
     <w:unhideWhenUsed/>
     <w:qFormat/>
-    <w:rsid w:val="00FC693F"/>
     <w:pPr>
       <w:spacing w:line="240" w:lineRule="auto"/>
     </w:pPr>
@@ -15406,7 +15458,6 @@
     <w:basedOn w:val="DefaultParagraphFont"/>
     <w:uiPriority w:val="22"/>
     <w:qFormat/>
-    <w:rsid w:val="00FC693F"/>
     <w:rPr>
       <w:b/>
       <w:bCs/>
@@ -15417,7 +15468,6 @@
     <w:basedOn w:val="DefaultParagraphFont"/>
     <w:uiPriority w:val="20"/>
     <w:qFormat/>
-    <w:rsid w:val="00FC693F"/>
     <w:rPr>
       <w:i/>
       <w:iCs/>
@@ -15430,7 +15480,6 @@
     <w:link w:val="IntenseQuoteChar"/>
     <w:uiPriority w:val="30"/>
     <w:qFormat/>
-    <w:rsid w:val="00FC693F"/>
     <w:pPr>
       <w:pBdr>
         <w:bottom w:val="single" w:sz="4" w:space="4" w:color="4F81BD" w:themeColor="accent1"/>
@@ -15451,7 +15500,6 @@
     <w:basedOn w:val="DefaultParagraphFont"/>
     <w:link w:val="IntenseQuote"/>
     <w:uiPriority w:val="30"/>
-    <w:rsid w:val="00FC693F"/>
     <w:rPr>
       <w:b/>
       <w:bCs/>
@@ -15465,7 +15513,6 @@
     <w:basedOn w:val="DefaultParagraphFont"/>
     <w:uiPriority w:val="19"/>
     <w:qFormat/>
-    <w:rsid w:val="00FC693F"/>
     <w:rPr>
       <w:i/>
       <w:iCs/>
@@ -15477,7 +15524,6 @@
     <w:basedOn w:val="DefaultParagraphFont"/>
     <w:uiPriority w:val="21"/>
     <w:qFormat/>
-    <w:rsid w:val="00FC693F"/>
     <w:rPr>
       <w:b/>
       <w:bCs/>
@@ -15491,7 +15537,6 @@
     <w:basedOn w:val="DefaultParagraphFont"/>
     <w:uiPriority w:val="31"/>
     <w:qFormat/>
-    <w:rsid w:val="00FC693F"/>
     <w:rPr>
       <w:smallCaps/>
       <w:color w:val="C0504D" w:themeColor="accent2"/>
@@ -15503,7 +15548,6 @@
     <w:basedOn w:val="DefaultParagraphFont"/>
     <w:uiPriority w:val="32"/>
     <w:qFormat/>
-    <w:rsid w:val="00FC693F"/>
     <w:rPr>
       <w:b/>
       <w:bCs/>
@@ -15518,7 +15562,6 @@
     <w:basedOn w:val="DefaultParagraphFont"/>
     <w:uiPriority w:val="33"/>
     <w:qFormat/>
-    <w:rsid w:val="00FC693F"/>
     <w:rPr>
       <w:b/>
       <w:bCs/>
@@ -15534,7 +15577,6 @@
     <w:semiHidden/>
     <w:unhideWhenUsed/>
     <w:qFormat/>
-    <w:rsid w:val="00FC693F"/>
     <w:pPr>
       <w:outlineLvl w:val="9"/>
     </w:pPr>
@@ -15543,7 +15585,6 @@
     <w:name w:val="Table Grid"/>
     <w:basedOn w:val="TableNormal"/>
     <w:uiPriority w:val="59"/>
-    <w:rsid w:val="00FC693F"/>
     <w:pPr>
       <w:spacing w:after="0" w:line="240" w:lineRule="auto"/>
     </w:pPr>
@@ -15569,7 +15610,6 @@
     <w:name w:val="Light Shading"/>
     <w:basedOn w:val="TableNormal"/>
     <w:uiPriority w:val="60"/>
-    <w:rsid w:val="00FC693F"/>
     <w:pPr>
       <w:spacing w:after="0" w:line="240" w:lineRule="auto"/>
     </w:pPr>
@@ -15672,7 +15712,6 @@
     <w:name w:val="Light Shading Accent 1"/>
     <w:basedOn w:val="TableNormal"/>
     <w:uiPriority w:val="60"/>
-    <w:rsid w:val="00FC693F"/>
     <w:pPr>
       <w:spacing w:after="0" w:line="240" w:lineRule="auto"/>
     </w:pPr>
@@ -15775,7 +15814,6 @@
     <w:name w:val="Light Shading Accent 2"/>
     <w:basedOn w:val="TableNormal"/>
     <w:uiPriority w:val="60"/>
-    <w:rsid w:val="00FC693F"/>
     <w:pPr>
       <w:spacing w:after="0" w:line="240" w:lineRule="auto"/>
     </w:pPr>
@@ -15878,7 +15916,6 @@
     <w:name w:val="Light Shading Accent 3"/>
     <w:basedOn w:val="TableNormal"/>
     <w:uiPriority w:val="60"/>
-    <w:rsid w:val="00FC693F"/>
     <w:pPr>
       <w:spacing w:after="0" w:line="240" w:lineRule="auto"/>
     </w:pPr>
@@ -15981,7 +16018,6 @@
     <w:name w:val="Light Shading Accent 4"/>
     <w:basedOn w:val="TableNormal"/>
     <w:uiPriority w:val="60"/>
-    <w:rsid w:val="00FC693F"/>
     <w:pPr>
       <w:spacing w:after="0" w:line="240" w:lineRule="auto"/>
     </w:pPr>
@@ -16084,7 +16120,6 @@
     <w:name w:val="Light Shading Accent 5"/>
     <w:basedOn w:val="TableNormal"/>
     <w:uiPriority w:val="60"/>
-    <w:rsid w:val="00FC693F"/>
     <w:pPr>
       <w:spacing w:after="0" w:line="240" w:lineRule="auto"/>
     </w:pPr>
@@ -16187,7 +16222,6 @@
     <w:name w:val="Light Shading Accent 6"/>
     <w:basedOn w:val="TableNormal"/>
     <w:uiPriority w:val="60"/>
-    <w:rsid w:val="00FC693F"/>
     <w:pPr>
       <w:spacing w:after="0" w:line="240" w:lineRule="auto"/>
     </w:pPr>
@@ -16290,7 +16324,6 @@
     <w:name w:val="Light List"/>
     <w:basedOn w:val="TableNormal"/>
     <w:uiPriority w:val="61"/>
-    <w:rsid w:val="00FC693F"/>
     <w:pPr>
       <w:spacing w:after="0" w:line="240" w:lineRule="auto"/>
     </w:pPr>
@@ -16382,7 +16415,6 @@
     <w:name w:val="Light List Accent 1"/>
     <w:basedOn w:val="TableNormal"/>
     <w:uiPriority w:val="61"/>
-    <w:rsid w:val="00FC693F"/>
     <w:pPr>
       <w:spacing w:after="0" w:line="240" w:lineRule="auto"/>
     </w:pPr>
@@ -16474,7 +16506,6 @@
     <w:name w:val="Light List Accent 2"/>
     <w:basedOn w:val="TableNormal"/>
     <w:uiPriority w:val="61"/>
-    <w:rsid w:val="00CB0664"/>
     <w:pPr>
       <w:spacing w:after="0" w:line="240" w:lineRule="auto"/>
     </w:pPr>
@@ -16566,7 +16597,6 @@
     <w:name w:val="Light List Accent 3"/>
     <w:basedOn w:val="TableNormal"/>
     <w:uiPriority w:val="61"/>
-    <w:rsid w:val="00CB0664"/>
     <w:pPr>
       <w:spacing w:after="0" w:line="240" w:lineRule="auto"/>
     </w:pPr>
@@ -16658,7 +16688,6 @@
     <w:name w:val="Light List Accent 4"/>
     <w:basedOn w:val="TableNormal"/>
     <w:uiPriority w:val="61"/>
-    <w:rsid w:val="00CB0664"/>
     <w:pPr>
       <w:spacing w:after="0" w:line="240" w:lineRule="auto"/>
     </w:pPr>
@@ -16750,7 +16779,6 @@
     <w:name w:val="Light List Accent 5"/>
     <w:basedOn w:val="TableNormal"/>
     <w:uiPriority w:val="61"/>
-    <w:rsid w:val="00CB0664"/>
     <w:pPr>
       <w:spacing w:after="0" w:line="240" w:lineRule="auto"/>
     </w:pPr>
@@ -16842,7 +16870,6 @@
     <w:name w:val="Light List Accent 6"/>
     <w:basedOn w:val="TableNormal"/>
     <w:uiPriority w:val="61"/>
-    <w:rsid w:val="00CB0664"/>
     <w:pPr>
       <w:spacing w:after="0" w:line="240" w:lineRule="auto"/>
     </w:pPr>
@@ -16934,7 +16961,6 @@
     <w:name w:val="Light Grid"/>
     <w:basedOn w:val="TableNormal"/>
     <w:uiPriority w:val="62"/>
-    <w:rsid w:val="00CB0664"/>
     <w:pPr>
       <w:spacing w:after="0" w:line="240" w:lineRule="auto"/>
     </w:pPr>
@@ -17064,7 +17090,6 @@
     <w:name w:val="Light Grid Accent 1"/>
     <w:basedOn w:val="TableNormal"/>
     <w:uiPriority w:val="62"/>
-    <w:rsid w:val="00CB0664"/>
     <w:pPr>
       <w:spacing w:after="0" w:line="240" w:lineRule="auto"/>
     </w:pPr>
@@ -17194,7 +17219,6 @@
     <w:name w:val="Light Grid Accent 2"/>
     <w:basedOn w:val="TableNormal"/>
     <w:uiPriority w:val="62"/>
-    <w:rsid w:val="00CB0664"/>
     <w:pPr>
       <w:spacing w:after="0" w:line="240" w:lineRule="auto"/>
     </w:pPr>
@@ -17324,7 +17348,6 @@
     <w:name w:val="Light Grid Accent 3"/>
     <w:basedOn w:val="TableNormal"/>
     <w:uiPriority w:val="62"/>
-    <w:rsid w:val="00CB0664"/>
     <w:pPr>
       <w:spacing w:after="0" w:line="240" w:lineRule="auto"/>
     </w:pPr>
@@ -17454,7 +17477,6 @@
     <w:name w:val="Light Grid Accent 4"/>
     <w:basedOn w:val="TableNormal"/>
     <w:uiPriority w:val="62"/>
-    <w:rsid w:val="00CB0664"/>
     <w:pPr>
       <w:spacing w:after="0" w:line="240" w:lineRule="auto"/>
     </w:pPr>
@@ -17584,7 +17606,6 @@
     <w:name w:val="Light Grid Accent 5"/>
     <w:basedOn w:val="TableNormal"/>
     <w:uiPriority w:val="62"/>
-    <w:rsid w:val="00CB0664"/>
     <w:pPr>
       <w:spacing w:after="0" w:line="240" w:lineRule="auto"/>
     </w:pPr>
@@ -17714,7 +17735,6 @@
     <w:name w:val="Light Grid Accent 6"/>
     <w:basedOn w:val="TableNormal"/>
     <w:uiPriority w:val="62"/>
-    <w:rsid w:val="00CB0664"/>
     <w:pPr>
       <w:spacing w:after="0" w:line="240" w:lineRule="auto"/>
     </w:pPr>
@@ -17844,7 +17864,6 @@
     <w:name w:val="Medium Shading 1"/>
     <w:basedOn w:val="TableNormal"/>
     <w:uiPriority w:val="63"/>
-    <w:rsid w:val="00CB0664"/>
     <w:pPr>
       <w:spacing w:after="0" w:line="240" w:lineRule="auto"/>
     </w:pPr>
@@ -17950,7 +17969,6 @@
     <w:name w:val="Medium Shading 1 Accent 1"/>
     <w:basedOn w:val="TableNormal"/>
     <w:uiPriority w:val="63"/>
-    <w:rsid w:val="00CB0664"/>
     <w:pPr>
       <w:spacing w:after="0" w:line="240" w:lineRule="auto"/>
     </w:pPr>
@@ -18056,7 +18074,6 @@
     <w:name w:val="Medium Shading 1 Accent 2"/>
     <w:basedOn w:val="TableNormal"/>
     <w:uiPriority w:val="63"/>
-    <w:rsid w:val="00CB0664"/>
     <w:pPr>
       <w:spacing w:after="0" w:line="240" w:lineRule="auto"/>
     </w:pPr>
@@ -18162,7 +18179,6 @@
     <w:name w:val="Medium Shading 1 Accent 3"/>
     <w:basedOn w:val="TableNormal"/>
     <w:uiPriority w:val="63"/>
-    <w:rsid w:val="00CB0664"/>
     <w:pPr>
       <w:spacing w:after="0" w:line="240" w:lineRule="auto"/>
     </w:pPr>
@@ -18268,7 +18284,6 @@
     <w:name w:val="Medium Shading 1 Accent 4"/>
     <w:basedOn w:val="TableNormal"/>
     <w:uiPriority w:val="63"/>
-    <w:rsid w:val="00CB0664"/>
     <w:pPr>
       <w:spacing w:after="0" w:line="240" w:lineRule="auto"/>
     </w:pPr>
@@ -18374,7 +18389,6 @@
     <w:name w:val="Medium Shading 1 Accent 5"/>
     <w:basedOn w:val="TableNormal"/>
     <w:uiPriority w:val="63"/>
-    <w:rsid w:val="00CB0664"/>
     <w:pPr>
       <w:spacing w:after="0" w:line="240" w:lineRule="auto"/>
     </w:pPr>
@@ -18480,7 +18494,6 @@
     <w:name w:val="Medium Shading 1 Accent 6"/>
     <w:basedOn w:val="TableNormal"/>
     <w:uiPriority w:val="63"/>
-    <w:rsid w:val="00CB0664"/>
     <w:pPr>
       <w:spacing w:after="0" w:line="240" w:lineRule="auto"/>
     </w:pPr>
@@ -18586,7 +18599,6 @@
     <w:name w:val="Medium Shading 2"/>
     <w:basedOn w:val="TableNormal"/>
     <w:uiPriority w:val="64"/>
-    <w:rsid w:val="00CB0664"/>
     <w:pPr>
       <w:spacing w:after="0" w:line="240" w:lineRule="auto"/>
     </w:pPr>
@@ -18735,7 +18747,6 @@
     <w:name w:val="Medium Shading 2 Accent 1"/>
     <w:basedOn w:val="TableNormal"/>
     <w:uiPriority w:val="64"/>
-    <w:rsid w:val="00CB0664"/>
     <w:pPr>
       <w:spacing w:after="0" w:line="240" w:lineRule="auto"/>
     </w:pPr>
@@ -18884,7 +18895,6 @@
     <w:name w:val="Medium Shading 2 Accent 2"/>
     <w:basedOn w:val="TableNormal"/>
     <w:uiPriority w:val="64"/>
-    <w:rsid w:val="00CB0664"/>
     <w:pPr>
       <w:spacing w:after="0" w:line="240" w:lineRule="auto"/>
     </w:pPr>
@@ -19033,7 +19043,6 @@
     <w:name w:val="Medium Shading 2 Accent 3"/>
     <w:basedOn w:val="TableNormal"/>
     <w:uiPriority w:val="64"/>
-    <w:rsid w:val="00CB0664"/>
     <w:pPr>
       <w:spacing w:after="0" w:line="240" w:lineRule="auto"/>
     </w:pPr>
@@ -19182,7 +19191,6 @@
     <w:name w:val="Medium Shading 2 Accent 4"/>
     <w:basedOn w:val="TableNormal"/>
     <w:uiPriority w:val="64"/>
-    <w:rsid w:val="00CB0664"/>
     <w:pPr>
       <w:spacing w:after="0" w:line="240" w:lineRule="auto"/>
     </w:pPr>
@@ -19331,7 +19339,6 @@
     <w:name w:val="Medium Shading 2 Accent 5"/>
     <w:basedOn w:val="TableNormal"/>
     <w:uiPriority w:val="64"/>
-    <w:rsid w:val="00CB0664"/>
     <w:pPr>
       <w:spacing w:after="0" w:line="240" w:lineRule="auto"/>
     </w:pPr>
@@ -19480,7 +19487,6 @@
     <w:name w:val="Medium Shading 2 Accent 6"/>
     <w:basedOn w:val="TableNormal"/>
     <w:uiPriority w:val="64"/>
-    <w:rsid w:val="00CB0664"/>
     <w:pPr>
       <w:spacing w:after="0" w:line="240" w:lineRule="auto"/>
     </w:pPr>
@@ -19629,7 +19635,6 @@
     <w:name w:val="Medium List 1"/>
     <w:basedOn w:val="TableNormal"/>
     <w:uiPriority w:val="65"/>
-    <w:rsid w:val="00CB0664"/>
     <w:pPr>
       <w:spacing w:after="0" w:line="240" w:lineRule="auto"/>
     </w:pPr>
@@ -19713,7 +19718,6 @@
     <w:name w:val="Medium List 1 Accent 1"/>
     <w:basedOn w:val="TableNormal"/>
     <w:uiPriority w:val="65"/>
-    <w:rsid w:val="00CB0664"/>
     <w:pPr>
       <w:spacing w:after="0" w:line="240" w:lineRule="auto"/>
     </w:pPr>
@@ -19797,7 +19801,6 @@
     <w:name w:val="Medium List 1 Accent 2"/>
     <w:basedOn w:val="TableNormal"/>
     <w:uiPriority w:val="65"/>
-    <w:rsid w:val="00CB0664"/>
     <w:pPr>
       <w:spacing w:after="0" w:line="240" w:lineRule="auto"/>
     </w:pPr>
@@ -19881,7 +19884,6 @@
     <w:name w:val="Medium List 1 Accent 3"/>
     <w:basedOn w:val="TableNormal"/>
     <w:uiPriority w:val="65"/>
-    <w:rsid w:val="00CB0664"/>
     <w:pPr>
       <w:spacing w:after="0" w:line="240" w:lineRule="auto"/>
     </w:pPr>
@@ -19965,7 +19967,6 @@
     <w:name w:val="Medium List 1 Accent 4"/>
     <w:basedOn w:val="TableNormal"/>
     <w:uiPriority w:val="65"/>
-    <w:rsid w:val="00CB0664"/>
     <w:pPr>
       <w:spacing w:after="0" w:line="240" w:lineRule="auto"/>
     </w:pPr>
@@ -20049,7 +20050,6 @@
     <w:name w:val="Medium List 1 Accent 5"/>
     <w:basedOn w:val="TableNormal"/>
     <w:uiPriority w:val="65"/>
-    <w:rsid w:val="00CB0664"/>
     <w:pPr>
       <w:spacing w:after="0" w:line="240" w:lineRule="auto"/>
     </w:pPr>
@@ -20133,7 +20133,6 @@
     <w:name w:val="Medium List 1 Accent 6"/>
     <w:basedOn w:val="TableNormal"/>
     <w:uiPriority w:val="65"/>
-    <w:rsid w:val="00CB0664"/>
     <w:pPr>
       <w:spacing w:after="0" w:line="240" w:lineRule="auto"/>
     </w:pPr>
@@ -20217,7 +20216,6 @@
     <w:name w:val="Medium List 2"/>
     <w:basedOn w:val="TableNormal"/>
     <w:uiPriority w:val="66"/>
-    <w:rsid w:val="00CB0664"/>
     <w:pPr>
       <w:spacing w:after="0" w:line="240" w:lineRule="auto"/>
     </w:pPr>
@@ -20345,7 +20343,6 @@
     <w:name w:val="Medium List 2 Accent 1"/>
     <w:basedOn w:val="TableNormal"/>
     <w:uiPriority w:val="66"/>
-    <w:rsid w:val="00CB0664"/>
     <w:pPr>
       <w:spacing w:after="0" w:line="240" w:lineRule="auto"/>
     </w:pPr>
@@ -20473,7 +20470,6 @@
     <w:name w:val="Medium List 2 Accent 2"/>
     <w:basedOn w:val="TableNormal"/>
     <w:uiPriority w:val="66"/>
-    <w:rsid w:val="00CB0664"/>
     <w:pPr>
       <w:spacing w:after="0" w:line="240" w:lineRule="auto"/>
     </w:pPr>
@@ -20601,7 +20597,6 @@
     <w:name w:val="Medium List 2 Accent 3"/>
     <w:basedOn w:val="TableNormal"/>
     <w:uiPriority w:val="66"/>
-    <w:rsid w:val="00CB0664"/>
     <w:pPr>
       <w:spacing w:after="0" w:line="240" w:lineRule="auto"/>
     </w:pPr>
@@ -20729,7 +20724,6 @@
     <w:name w:val="Medium List 2 Accent 4"/>
     <w:basedOn w:val="TableNormal"/>
     <w:uiPriority w:val="66"/>
-    <w:rsid w:val="00CB0664"/>
     <w:pPr>
       <w:spacing w:after="0" w:line="240" w:lineRule="auto"/>
     </w:pPr>
@@ -20857,7 +20851,6 @@
     <w:name w:val="Medium List 2 Accent 5"/>
     <w:basedOn w:val="TableNormal"/>
     <w:uiPriority w:val="66"/>
-    <w:rsid w:val="00CB0664"/>
     <w:pPr>
       <w:spacing w:after="0" w:line="240" w:lineRule="auto"/>
     </w:pPr>
@@ -20985,7 +20978,6 @@
     <w:name w:val="Medium List 2 Accent 6"/>
     <w:basedOn w:val="TableNormal"/>
     <w:uiPriority w:val="66"/>
-    <w:rsid w:val="00CB0664"/>
     <w:pPr>
       <w:spacing w:after="0" w:line="240" w:lineRule="auto"/>
     </w:pPr>
@@ -21113,7 +21105,6 @@
     <w:name w:val="Medium Grid 1"/>
     <w:basedOn w:val="TableNormal"/>
     <w:uiPriority w:val="67"/>
-    <w:rsid w:val="00CB0664"/>
     <w:pPr>
       <w:spacing w:after="0" w:line="240" w:lineRule="auto"/>
     </w:pPr>
@@ -21186,7 +21177,6 @@
     <w:name w:val="Medium Grid 1 Accent 1"/>
     <w:basedOn w:val="TableNormal"/>
     <w:uiPriority w:val="67"/>
-    <w:rsid w:val="00CB0664"/>
     <w:pPr>
       <w:spacing w:after="0" w:line="240" w:lineRule="auto"/>
     </w:pPr>
@@ -21259,7 +21249,6 @@
     <w:name w:val="Medium Grid 1 Accent 2"/>
     <w:basedOn w:val="TableNormal"/>
     <w:uiPriority w:val="67"/>
-    <w:rsid w:val="00CB0664"/>
     <w:pPr>
       <w:spacing w:after="0" w:line="240" w:lineRule="auto"/>
     </w:pPr>
@@ -21332,7 +21321,6 @@
     <w:name w:val="Medium Grid 1 Accent 3"/>
     <w:basedOn w:val="TableNormal"/>
     <w:uiPriority w:val="67"/>
-    <w:rsid w:val="00CB0664"/>
     <w:pPr>
       <w:spacing w:after="0" w:line="240" w:lineRule="auto"/>
     </w:pPr>
@@ -21405,7 +21393,6 @@
     <w:name w:val="Medium Grid 1 Accent 4"/>
     <w:basedOn w:val="TableNormal"/>
     <w:uiPriority w:val="67"/>
-    <w:rsid w:val="00CB0664"/>
     <w:pPr>
       <w:spacing w:after="0" w:line="240" w:lineRule="auto"/>
     </w:pPr>
@@ -21478,7 +21465,6 @@
     <w:name w:val="Medium Grid 1 Accent 5"/>
     <w:basedOn w:val="TableNormal"/>
     <w:uiPriority w:val="67"/>
-    <w:rsid w:val="00CB0664"/>
     <w:pPr>
       <w:spacing w:after="0" w:line="240" w:lineRule="auto"/>
     </w:pPr>
@@ -21551,7 +21537,6 @@
     <w:name w:val="Medium Grid 1 Accent 6"/>
     <w:basedOn w:val="TableNormal"/>
     <w:uiPriority w:val="67"/>
-    <w:rsid w:val="00CB0664"/>
     <w:pPr>
       <w:spacing w:after="0" w:line="240" w:lineRule="auto"/>
     </w:pPr>
@@ -21624,7 +21609,6 @@
     <w:name w:val="Medium Grid 2"/>
     <w:basedOn w:val="TableNormal"/>
     <w:uiPriority w:val="68"/>
-    <w:rsid w:val="00CB0664"/>
     <w:pPr>
       <w:spacing w:after="0" w:line="240" w:lineRule="auto"/>
     </w:pPr>
@@ -21749,7 +21733,6 @@
     <w:name w:val="Medium Grid 2 Accent 1"/>
     <w:basedOn w:val="TableNormal"/>
     <w:uiPriority w:val="68"/>
-    <w:rsid w:val="00CB0664"/>
     <w:pPr>
       <w:spacing w:after="0" w:line="240" w:lineRule="auto"/>
     </w:pPr>
@@ -21874,7 +21857,6 @@
     <w:name w:val="Medium Grid 2 Accent 2"/>
     <w:basedOn w:val="TableNormal"/>
     <w:uiPriority w:val="68"/>
-    <w:rsid w:val="00CB0664"/>
     <w:pPr>
       <w:spacing w:after="0" w:line="240" w:lineRule="auto"/>
     </w:pPr>
@@ -21999,7 +21981,6 @@
     <w:name w:val="Medium Grid 2 Accent 3"/>
     <w:basedOn w:val="TableNormal"/>
     <w:uiPriority w:val="68"/>
-    <w:rsid w:val="00CB0664"/>
     <w:pPr>
       <w:spacing w:after="0" w:line="240" w:lineRule="auto"/>
     </w:pPr>
@@ -22124,7 +22105,6 @@
     <w:name w:val="Medium Grid 2 Accent 4"/>
     <w:basedOn w:val="TableNormal"/>
     <w:uiPriority w:val="68"/>
-    <w:rsid w:val="00CB0664"/>
     <w:pPr>
       <w:spacing w:after="0" w:line="240" w:lineRule="auto"/>
     </w:pPr>
@@ -22249,7 +22229,6 @@
     <w:name w:val="Medium Grid 2 Accent 5"/>
     <w:basedOn w:val="TableNormal"/>
     <w:uiPriority w:val="68"/>
-    <w:rsid w:val="00CB0664"/>
     <w:pPr>
       <w:spacing w:after="0" w:line="240" w:lineRule="auto"/>
     </w:pPr>
@@ -22374,7 +22353,6 @@
     <w:name w:val="Medium Grid 2 Accent 6"/>
     <w:basedOn w:val="TableNormal"/>
     <w:uiPriority w:val="68"/>
-    <w:rsid w:val="00CB0664"/>
     <w:pPr>
       <w:spacing w:after="0" w:line="240" w:lineRule="auto"/>
     </w:pPr>
@@ -22499,7 +22477,6 @@
     <w:name w:val="Medium Grid 3"/>
     <w:basedOn w:val="TableNormal"/>
     <w:uiPriority w:val="69"/>
-    <w:rsid w:val="00CB0664"/>
     <w:pPr>
       <w:spacing w:after="0" w:line="240" w:lineRule="auto"/>
     </w:pPr>
@@ -22640,7 +22617,6 @@
     <w:name w:val="Medium Grid 3 Accent 1"/>
     <w:basedOn w:val="TableNormal"/>
     <w:uiPriority w:val="69"/>
-    <w:rsid w:val="00CB0664"/>
     <w:pPr>
       <w:spacing w:after="0" w:line="240" w:lineRule="auto"/>
     </w:pPr>
@@ -22781,7 +22757,6 @@
     <w:name w:val="Medium Grid 3 Accent 2"/>
     <w:basedOn w:val="TableNormal"/>
     <w:uiPriority w:val="69"/>
-    <w:rsid w:val="00CB0664"/>
     <w:pPr>
       <w:spacing w:after="0" w:line="240" w:lineRule="auto"/>
     </w:pPr>
@@ -22922,7 +22897,6 @@
     <w:name w:val="Medium Grid 3 Accent 3"/>
     <w:basedOn w:val="TableNormal"/>
     <w:uiPriority w:val="69"/>
-    <w:rsid w:val="00CB0664"/>
     <w:pPr>
       <w:spacing w:after="0" w:line="240" w:lineRule="auto"/>
     </w:pPr>
@@ -23063,7 +23037,6 @@
     <w:name w:val="Medium Grid 3 Accent 4"/>
     <w:basedOn w:val="TableNormal"/>
     <w:uiPriority w:val="69"/>
-    <w:rsid w:val="00CB0664"/>
     <w:pPr>
       <w:spacing w:after="0" w:line="240" w:lineRule="auto"/>
     </w:pPr>
@@ -23204,7 +23177,6 @@
     <w:name w:val="Medium Grid 3 Accent 5"/>
     <w:basedOn w:val="TableNormal"/>
     <w:uiPriority w:val="69"/>
-    <w:rsid w:val="00CB0664"/>
     <w:pPr>
       <w:spacing w:after="0" w:line="240" w:lineRule="auto"/>
     </w:pPr>
@@ -23345,7 +23317,6 @@
     <w:name w:val="Medium Grid 3 Accent 6"/>
     <w:basedOn w:val="TableNormal"/>
     <w:uiPriority w:val="69"/>
-    <w:rsid w:val="00CB0664"/>
     <w:pPr>
       <w:spacing w:after="0" w:line="240" w:lineRule="auto"/>
     </w:pPr>
@@ -23486,7 +23457,6 @@
     <w:name w:val="Dark List"/>
     <w:basedOn w:val="TableNormal"/>
     <w:uiPriority w:val="70"/>
-    <w:rsid w:val="00CB0664"/>
     <w:pPr>
       <w:spacing w:after="0" w:line="240" w:lineRule="auto"/>
     </w:pPr>
@@ -23600,7 +23570,6 @@
     <w:name w:val="Dark List Accent 1"/>
     <w:basedOn w:val="TableNormal"/>
     <w:uiPriority w:val="70"/>
-    <w:rsid w:val="00CB0664"/>
     <w:pPr>
       <w:spacing w:after="0" w:line="240" w:lineRule="auto"/>
     </w:pPr>
@@ -23714,7 +23683,6 @@
     <w:name w:val="Dark List Accent 2"/>
     <w:basedOn w:val="TableNormal"/>
     <w:uiPriority w:val="70"/>
-    <w:rsid w:val="00CB0664"/>
     <w:pPr>
       <w:spacing w:after="0" w:line="240" w:lineRule="auto"/>
     </w:pPr>
@@ -23828,7 +23796,6 @@
     <w:name w:val="Dark List Accent 3"/>
     <w:basedOn w:val="TableNormal"/>
     <w:uiPriority w:val="70"/>
-    <w:rsid w:val="00CB0664"/>
     <w:pPr>
       <w:spacing w:after="0" w:line="240" w:lineRule="auto"/>
     </w:pPr>
@@ -23942,7 +23909,6 @@
     <w:name w:val="Dark List Accent 4"/>
     <w:basedOn w:val="TableNormal"/>
     <w:uiPriority w:val="70"/>
-    <w:rsid w:val="00CB0664"/>
     <w:pPr>
       <w:spacing w:after="0" w:line="240" w:lineRule="auto"/>
     </w:pPr>
@@ -24056,7 +24022,6 @@
     <w:name w:val="Dark List Accent 5"/>
     <w:basedOn w:val="TableNormal"/>
     <w:uiPriority w:val="70"/>
-    <w:rsid w:val="00CB0664"/>
     <w:pPr>
       <w:spacing w:after="0" w:line="240" w:lineRule="auto"/>
     </w:pPr>
@@ -24170,7 +24135,6 @@
     <w:name w:val="Dark List Accent 6"/>
     <w:basedOn w:val="TableNormal"/>
     <w:uiPriority w:val="70"/>
-    <w:rsid w:val="00CB0664"/>
     <w:pPr>
       <w:spacing w:after="0" w:line="240" w:lineRule="auto"/>
     </w:pPr>
@@ -24284,7 +24248,6 @@
     <w:name w:val="Colorful Shading"/>
     <w:basedOn w:val="TableNormal"/>
     <w:uiPriority w:val="71"/>
-    <w:rsid w:val="00CB0664"/>
     <w:pPr>
       <w:spacing w:after="0" w:line="240" w:lineRule="auto"/>
     </w:pPr>
@@ -24406,7 +24369,6 @@
     <w:name w:val="Colorful Shading Accent 1"/>
     <w:basedOn w:val="TableNormal"/>
     <w:uiPriority w:val="71"/>
-    <w:rsid w:val="00CB0664"/>
     <w:pPr>
       <w:spacing w:after="0" w:line="240" w:lineRule="auto"/>
     </w:pPr>
@@ -24528,7 +24490,6 @@
     <w:name w:val="Colorful Shading Accent 2"/>
     <w:basedOn w:val="TableNormal"/>
     <w:uiPriority w:val="71"/>
-    <w:rsid w:val="00CB0664"/>
     <w:pPr>
       <w:spacing w:after="0" w:line="240" w:lineRule="auto"/>
     </w:pPr>
@@ -24650,7 +24611,6 @@
     <w:name w:val="Colorful Shading Accent 3"/>
     <w:basedOn w:val="TableNormal"/>
     <w:uiPriority w:val="71"/>
-    <w:rsid w:val="00CB0664"/>
     <w:pPr>
       <w:spacing w:after="0" w:line="240" w:lineRule="auto"/>
     </w:pPr>
@@ -24762,7 +24722,6 @@
     <w:name w:val="Colorful Shading Accent 4"/>
     <w:basedOn w:val="TableNormal"/>
     <w:uiPriority w:val="71"/>
-    <w:rsid w:val="00CB0664"/>
     <w:pPr>
       <w:spacing w:after="0" w:line="240" w:lineRule="auto"/>
     </w:pPr>
@@ -24884,7 +24843,6 @@
     <w:name w:val="Colorful Shading Accent 5"/>
     <w:basedOn w:val="TableNormal"/>
     <w:uiPriority w:val="71"/>
-    <w:rsid w:val="00CB0664"/>
     <w:pPr>
       <w:spacing w:after="0" w:line="240" w:lineRule="auto"/>
     </w:pPr>
@@ -25006,7 +24964,6 @@
     <w:name w:val="Colorful Shading Accent 6"/>
     <w:basedOn w:val="TableNormal"/>
     <w:uiPriority w:val="71"/>
-    <w:rsid w:val="00CB0664"/>
     <w:pPr>
       <w:spacing w:after="0" w:line="240" w:lineRule="auto"/>
     </w:pPr>
@@ -25128,7 +25085,6 @@
     <w:name w:val="Colorful List"/>
     <w:basedOn w:val="TableNormal"/>
     <w:uiPriority w:val="72"/>
-    <w:rsid w:val="00CB0664"/>
     <w:pPr>
       <w:spacing w:after="0" w:line="240" w:lineRule="auto"/>
     </w:pPr>
@@ -25214,7 +25170,6 @@
     <w:name w:val="Colorful List Accent 1"/>
     <w:basedOn w:val="TableNormal"/>
     <w:uiPriority w:val="72"/>
-    <w:rsid w:val="00CB0664"/>
     <w:pPr>
       <w:spacing w:after="0" w:line="240" w:lineRule="auto"/>
     </w:pPr>
@@ -25300,7 +25255,6 @@
     <w:name w:val="Colorful List Accent 2"/>
     <w:basedOn w:val="TableNormal"/>
     <w:uiPriority w:val="72"/>
-    <w:rsid w:val="00CB0664"/>
     <w:pPr>
       <w:spacing w:after="0" w:line="240" w:lineRule="auto"/>
     </w:pPr>
@@ -25386,7 +25340,6 @@
     <w:name w:val="Colorful List Accent 3"/>
     <w:basedOn w:val="TableNormal"/>
     <w:uiPriority w:val="72"/>
-    <w:rsid w:val="00CB0664"/>
     <w:pPr>
       <w:spacing w:after="0" w:line="240" w:lineRule="auto"/>
     </w:pPr>
@@ -25472,7 +25425,6 @@
     <w:name w:val="Colorful List Accent 4"/>
     <w:basedOn w:val="TableNormal"/>
     <w:uiPriority w:val="72"/>
-    <w:rsid w:val="00CB0664"/>
     <w:pPr>
       <w:spacing w:after="0" w:line="240" w:lineRule="auto"/>
     </w:pPr>
@@ -25558,7 +25510,6 @@
     <w:name w:val="Colorful List Accent 5"/>
     <w:basedOn w:val="TableNormal"/>
     <w:uiPriority w:val="72"/>
-    <w:rsid w:val="00CB0664"/>
     <w:pPr>
       <w:spacing w:after="0" w:line="240" w:lineRule="auto"/>
     </w:pPr>
@@ -25644,7 +25595,6 @@
     <w:name w:val="Colorful List Accent 6"/>
     <w:basedOn w:val="TableNormal"/>
     <w:uiPriority w:val="72"/>
-    <w:rsid w:val="00CB0664"/>
     <w:pPr>
       <w:spacing w:after="0" w:line="240" w:lineRule="auto"/>
     </w:pPr>
@@ -25730,7 +25680,6 @@
     <w:name w:val="Colorful Grid"/>
     <w:basedOn w:val="TableNormal"/>
     <w:uiPriority w:val="73"/>
-    <w:rsid w:val="00CB0664"/>
     <w:pPr>
       <w:spacing w:after="0" w:line="240" w:lineRule="auto"/>
     </w:pPr>
@@ -25810,7 +25759,6 @@
     <w:name w:val="Colorful Grid Accent 1"/>
     <w:basedOn w:val="TableNormal"/>
     <w:uiPriority w:val="73"/>
-    <w:rsid w:val="00CB0664"/>
     <w:pPr>
       <w:spacing w:after="0" w:line="240" w:lineRule="auto"/>
     </w:pPr>
@@ -25890,7 +25838,6 @@
     <w:name w:val="Colorful Grid Accent 2"/>
     <w:basedOn w:val="TableNormal"/>
     <w:uiPriority w:val="73"/>
-    <w:rsid w:val="00CB0664"/>
     <w:pPr>
       <w:spacing w:after="0" w:line="240" w:lineRule="auto"/>
     </w:pPr>
@@ -25970,7 +25917,6 @@
     <w:name w:val="Colorful Grid Accent 3"/>
     <w:basedOn w:val="TableNormal"/>
     <w:uiPriority w:val="73"/>
-    <w:rsid w:val="00CB0664"/>
     <w:pPr>
       <w:spacing w:after="0" w:line="240" w:lineRule="auto"/>
     </w:pPr>
@@ -26050,7 +25996,6 @@
     <w:name w:val="Colorful Grid Accent 4"/>
     <w:basedOn w:val="TableNormal"/>
     <w:uiPriority w:val="73"/>
-    <w:rsid w:val="00CB0664"/>
     <w:pPr>
       <w:spacing w:after="0" w:line="240" w:lineRule="auto"/>
     </w:pPr>
@@ -26130,7 +26075,6 @@
     <w:name w:val="Colorful Grid Accent 5"/>
     <w:basedOn w:val="TableNormal"/>
     <w:uiPriority w:val="73"/>
-    <w:rsid w:val="00CB0664"/>
     <w:pPr>
       <w:spacing w:after="0" w:line="240" w:lineRule="auto"/>
     </w:pPr>
@@ -26210,7 +26154,6 @@
     <w:name w:val="Colorful Grid Accent 6"/>
     <w:basedOn w:val="TableNormal"/>
     <w:uiPriority w:val="73"/>
-    <w:rsid w:val="00CB0664"/>
     <w:pPr>
       <w:spacing w:after="0" w:line="240" w:lineRule="auto"/>
     </w:pPr>

</xml_diff>